<commit_message>
Add interactive study guide (single offline HTML)
- docs/Project_Study_Guide.html: real-world story, 9-step pipeline, theory
  explorers, sentence lab (real TF-IDF weights and DistilBERT attention),
  model arena (all 872 test sentences x 10 models), results explorer with
  exact McNemar test, model-choice helper, Q&A, quiz, rehearsal timer
- study_guide/: export_data.py collects the real results, build.py builds the page
- README: document the study guide

Co-Authored-By: Claude Sonnet 5.5 <noreply@anthropic.com>
</commit_message>
<xml_diff>
--- a/docs/Transformers_in_NLP_Project_Paper.docx
+++ b/docs/Transformers_in_NLP_Project_Paper.docx
@@ -267,71 +267,6 @@
       </w:pPr>
     </w:p>
     <w:p>
-      <w:r>
-        <w:rPr>
-          <w:b/>
-          <w:sz w:val="28"/>
-        </w:rPr>
-        <w:lastRenderedPageBreak/>
-        <w:t>Annotation</w:t>
-      </w:r>
-    </w:p>
-    <w:p>
-      <w:pPr>
-        <w:pStyle w:val="BDpagrindinistekstas"/>
-      </w:pPr>
-      <w:r>
-        <w:t xml:space="preserve">This project paper studies the Transformer architecture and its application to natural language processing (NLP) tasks. The theoretical part explains how </w:t>
-      </w:r>
-      <w:r>
-        <w:t>self-attention, multi-head attention, positional encoding and large-scale pre-training replaced recurrent neural networks as the dominant approach in NLP, and reviews the main families of Transformer models (encoder-only BERT-type models, decoder-only GPT-type models and encoder–decoder models such as T5 and BART). The literature review covers international research and research carried out in Lithuania, including work on Lithuanian sentiment analysis, the trilingual LitLat BERT model and the first open Lit</w:t>
-      </w:r>
-      <w:r>
-        <w:t>huanian large language models. It concludes that most published comparisons are done on GPU servers with large models, while evidence on what Transformers offer under realistic resource limits (a laptop CPU, a few thousand labelled examples) is scarce.</w:t>
-      </w:r>
-    </w:p>
-    <w:p>
-      <w:pPr>
-        <w:pStyle w:val="BDpagrindinistekstas"/>
-      </w:pPr>
-      <w:r>
-        <w:t>The practical part answers this question experimentally on binary sentiment classification of movie-review sentences (Stanford Sentiment Treebank, SST-2). Ten models from four families were implemented in Python (PyTorch, Hugging Face Transformers, scikit-learn) and compared under one protocol: three classical TF-IDF models, a bidirectional LSTM trained from scratch, three Transformer encoders that we fine-tuned ourselves on a CPU (BERT-tiny, BERT-small and DistilBERT), and three ready-made Transformer mode</w:t>
-      </w:r>
-      <w:r>
-        <w:t>ls used without any training (an in-domain DistilBERT, an out-of-domain Twitter RoBERTa and a zero-shot natural language inference model). Models were evaluated by accuracy, macro F1, training time, inference latency and size, as well as on linguistically difficult subsets with negation and contrast. A learning-curve experiment measured how much labelled data each approach needs. DistilBERT fine-tuned on only 8,000 sentences reached 88.8% accuracy and significantly outperformed the best classical model trai</w:t>
-      </w:r>
-      <w:r>
-        <w:t>ned on all 65,349 sentences (82.9%), while the ready-made in-domain DistilBERT reached 91.1%. Compact Transformers only matched the classical models, and the recurrent network without pre-training gave no advantage. Pre-training made Transformers far more data-efficient (+14.1 percentage points with 500 labelled sentences) and more robust on negation, at the cost of 20–2,000 times slower inference on a CPU. Practical recommendations for choosing a model are given.</w:t>
-      </w:r>
-    </w:p>
-    <w:p>
-      <w:pPr>
-        <w:pStyle w:val="BDpagrindinistekstas"/>
-      </w:pPr>
-      <w:r>
-        <w:rPr>
-          <w:b/>
-        </w:rPr>
-        <w:t>Keywords:</w:t>
-      </w:r>
-      <w:r>
-        <w:t xml:space="preserve"> Transformer, self-attention, BERT, DistilBERT, fine-tuning, transfer learning, sentiment analysis, natural language processing.</w:t>
-      </w:r>
-    </w:p>
-    <w:p>
-      <w:pPr>
-        <w:sectPr>
-          <w:footerReference w:type="default" r:id="rId10"/>
-          <w:footerReference w:type="first" r:id="rId11"/>
-          <w:pgSz w:w="11906" w:h="16838"/>
-          <w:pgMar w:top="1134" w:right="567" w:bottom="1134" w:left="1701" w:header="567" w:footer="567" w:gutter="0"/>
-          <w:cols w:space="1296"/>
-          <w:titlePg/>
-          <w:docGrid w:linePitch="360"/>
-        </w:sectPr>
-      </w:pPr>
-    </w:p>
-    <w:p>
       <w:pPr>
         <w:rPr>
           <w:b/>
@@ -4524,10 +4459,7 @@
         <w:t>Relevance of the research.</w:t>
       </w:r>
       <w:r>
-        <w:t xml:space="preserve"> Natural language processing (NLP) is the branch of artificial intelligence that enables computers to analyse, understand and generate human language. For decades the field relied on hand-crafted features and statistical models such as n-gram language models, naive Bayes classifiers and support vector machines. In the 2010s these were gradually replaced by neural networks: word embeddings such as word2vec (Mikolov et al., 2013) gave words dense vector representations, and recurrent neural networks, in parti</w:t>
-      </w:r>
-      <w:r>
-        <w:t>cular long short-term memory networks (Hochreiter &amp; Schmidhuber, 1997), became the standard way to model sentences. Recurrent networks, however, process text one token at a time, which makes training slow and makes it difficult to capture dependencies between words that are far apart.</w:t>
+        <w:t xml:space="preserve"> Natural language processing (NLP) is the branch of artificial intelligence that enables computers to analyse, understand and generate human language. For decades the field relied on hand-crafted features and statistical models such as n-gram language models, naive Bayes classifiers and support vector machines. In the 2010s these were gradually replaced by neural networks: word embeddings such as word2vec (Mikolov et al., 2013) gave words dense vector representations, and recurrent neural networks, in particular long short-term memory networks (Hochreiter &amp; Schmidhuber, 1997), became the standard way to model sentences. Recurrent networks, however, process text one token at a time, which makes training slow and makes it difficult to capture dependencies between words that are far apart.</w:t>
       </w:r>
     </w:p>
     <w:p>
@@ -4535,10 +4467,7 @@
         <w:pStyle w:val="BDpagrindinistekstas"/>
       </w:pPr>
       <w:r>
-        <w:t xml:space="preserve">In 2017 Vaswani et al. proposed the Transformer, an architecture that discards recurrence and relies only on the attention mechanism: every token can directly “look at” every other token, and all positions are processed in parallel. Within two years the Transformer became the foundation of almost every state-of-the-art NLP system. BERT (Devlin et al., 2019) showed that a Transformer encoder pre-trained on unlabelled text can be fine-tuned to beat previous results on eleven language understanding tasks, and </w:t>
-      </w:r>
-      <w:r>
-        <w:t>the GPT series (Radford et al., 2018; Brown et al., 2020) showed that a Transformer decoder trained to predict the next word becomes a general-purpose text generator. Today Transformers power machine translation, search engines, chat assistants and document analysis systems.</w:t>
+        <w:t>In 2017 Vaswani et al. proposed the Transformer, an architecture that discards recurrence and relies only on the attention mechanism: every token can directly “look at” every other token, and all positions are processed in parallel. Within two years the Transformer became the foundation of almost every state-of-the-art NLP system. BERT (Devlin et al., 2019) showed that a Transformer encoder pre-trained on unlabelled text can be fine-tuned to beat previous results on eleven language understanding tasks, and the GPT series (Radford et al., 2018; Brown et al., 2020) showed that a Transformer decoder trained to predict the next word becomes a general-purpose text generator. Today Transformers power machine translation, search engines, chat assistants and document analysis systems.</w:t>
       </w:r>
     </w:p>
     <w:p>
@@ -4546,10 +4475,7 @@
         <w:pStyle w:val="BDpagrindinistekstas"/>
       </w:pPr>
       <w:r>
-        <w:t xml:space="preserve">The topic is relevant for three reasons. First, Transformers are now the default tool of NLP practitioners, so engineers need to understand both how they work and when they are worth their cost. </w:t>
-      </w:r>
-      <w:r>
-        <w:t>Second, the computational price of these models is high (Strubell et al., 2019), so an informed choice between a small classical model, a compact Transformer and a large pre-trained model has a real economic and environmental impact. Third, for smaller languages such as Lithuanian, the question of how well Transformer methods work with limited labelled data is directly connected to the digital sustainability of the language (Ulčar &amp; Robnik-Šikonja, 2021; Nakvosas et al., 2024).</w:t>
+        <w:t>The topic is relevant for three reasons. First, Transformers are now the default tool of NLP practitioners, so engineers need to understand both how they work and when they are worth their cost. Second, the computational price of these models is high (Strubell et al., 2019), so an informed choice between a small classical model, a compact Transformer and a large pre-trained model has a real economic and environmental impact. Third, for smaller languages such as Lithuanian, the question of how well Transformer methods work with limited labelled data is directly connected to the digital sustainability of the language (Ulčar &amp; Robnik-Šikonja, 2021; Nakvosas et al., 2024).</w:t>
       </w:r>
     </w:p>
     <w:p>
@@ -4563,10 +4489,7 @@
         <w:t>Research problem.</w:t>
       </w:r>
       <w:r>
-        <w:t xml:space="preserve"> Published benchmarks usually report the accuracy of the largest models trained on GPU clusters with the full training set. A student, a small company or a public institution, by contrast, often has only an ordinary computer, a limited number of labelled examples and a need for fast predictions. The research problem is therefore: how large is the practical advantage of Transformer models over classical and recurrent approaches for a typical NLP task (sentiment classification), and at what cost in training t</w:t>
-      </w:r>
-      <w:r>
-        <w:t>ime, inference latency and model size, when all experiments are carried out on a standard CPU-only laptop?</w:t>
+        <w:t xml:space="preserve"> Published benchmarks usually report the accuracy of the largest models trained on GPU clusters with the full training set. A student, a small company or a public institution, by contrast, often has only an ordinary computer, a limited number of labelled examples and a need for fast predictions. The research problem is therefore: how large is the practical advantage of Transformer models over classical and recurrent approaches for a typical NLP task (sentiment classification), and at what cost in training time, inference latency and model size, when all experiments are carried out on a standard CPU-only laptop?</w:t>
       </w:r>
     </w:p>
     <w:p>
@@ -4908,10 +4831,7 @@
               <w:keepNext/>
             </w:pPr>
             <w:r>
-              <w:t xml:space="preserve">Literature search in Google Scholar and Web of </w:t>
-            </w:r>
-            <w:r>
-              <w:t>Science; literature review (Chapter 1); classical and BiLSTM baselines; references</w:t>
+              <w:t>Literature search in Google Scholar and Web of Science; literature review (Chapter 1); classical and BiLSTM baselines; references</w:t>
             </w:r>
           </w:p>
         </w:tc>
@@ -4998,10 +4918,7 @@
         <w:pStyle w:val="BDpagrindinistekstas"/>
       </w:pPr>
       <w:r>
-        <w:t>For the Lithuanian part the query was narrowed with the terms (“Lithuanian” OR “Baltic languages”). Both databases return thousands of records for the core query, so the results were sorted by relevance and citation count and screened by title and abstract. The inclusion criteria were: (1) the publication proposes or evaluates a Transformer-based model or an important predecessor; (2) it reports results on a text classification or language understanding task, or describes a widely used model; (3) it is peer</w:t>
-      </w:r>
-      <w:r>
-        <w:t>-reviewed or a widely cited technical report. Seminal works (the original Transformer, BERT, GPT, RoBERTa, DistilBERT and others) were added through backward citation tracking. About 40 publications were kept for analysis; the most important of them are summarised in Table 2.</w:t>
+        <w:t>For the Lithuanian part the query was narrowed with the terms (“Lithuanian” OR “Baltic languages”). Both databases return thousands of records for the core query, so the results were sorted by relevance and citation count and screened by title and abstract. The inclusion criteria were: (1) the publication proposes or evaluates a Transformer-based model or an important predecessor; (2) it reports results on a text classification or language understanding task, or describes a widely used model; (3) it is peer-reviewed or a widely cited technical report. Seminal works (the original Transformer, BERT, GPT, RoBERTa, DistilBERT and others) were added through backward citation tracking. About 40 publications were kept for analysis; the most important of them are summarised in Table 2.</w:t>
       </w:r>
     </w:p>
     <w:p>
@@ -5019,10 +4936,7 @@
         <w:pStyle w:val="BDpagrindinistekstas"/>
       </w:pPr>
       <w:r>
-        <w:t>Early neural approaches represented each word by a static vector, learned with word2vec (Mikolov et al., 2013) or similar methods, and combined these vectors with convolutional or recurrent networks. Such vectors cannot distinguish the meanings of an ambiguous word in different contexts. Bahdanau et al. (2015) introduced the attention mechanism for machine translation, allowing the decoder of a recurrent model to focus on the relevant parts of the source sentence. Contextual representations followed: ELMo (</w:t>
-      </w:r>
-      <w:r>
-        <w:t>Peters et al., 2018) computed word vectors with a deep bidirectional LSTM language model, and ULMFiT (Howard &amp; Ruder, 2018) showed that a pre-trained language model can be fine-tuned for text classification with very little labelled data. These works established the “pre-train, then fine-tune” paradigm that the Transformer later made dominant.</w:t>
+        <w:t>Early neural approaches represented each word by a static vector, learned with word2vec (Mikolov et al., 2013) or similar methods, and combined these vectors with convolutional or recurrent networks. Such vectors cannot distinguish the meanings of an ambiguous word in different contexts. Bahdanau et al. (2015) introduced the attention mechanism for machine translation, allowing the decoder of a recurrent model to focus on the relevant parts of the source sentence. Contextual representations followed: ELMo (Peters et al., 2018) computed word vectors with a deep bidirectional LSTM language model, and ULMFiT (Howard &amp; Ruder, 2018) showed that a pre-trained language model can be fine-tuned for text classification with very little labelled data. These works established the “pre-train, then fine-tune” paradigm that the Transformer later made dominant.</w:t>
       </w:r>
     </w:p>
     <w:p>
@@ -5056,13 +4970,7 @@
         <w:pStyle w:val="BDpagrindinistekstas"/>
       </w:pPr>
       <w:r>
-        <w:t xml:space="preserve">Encoder-only models. BERT (Devlin et al., 2019) pre-trains a Transformer encoder with masked language modelling, in which 15% of the tokens are hidden and the model has to predict them from the </w:t>
-      </w:r>
-      <w:r>
-        <w:t>context on both sides. BERT-base (110 million parameters) and BERT-large (340 million) set new records on the GLUE benchmark (Wang et al., 2019), including SST-2 sentiment classification. RoBERTa (Liu et al., 2019) showed that BERT was under-trained and obtained better results simply by training longer on more data, with larger batches and without the next-sentence prediction task. ALBERT (Lan et al., 2020) reduced the number of parameters through factorised embeddings and cross-layer parameter sharing; ELE</w:t>
-      </w:r>
-      <w:r>
-        <w:t>CTRA (Clark et al., 2020) replaced masked language modelling with a more sample-efficient “replaced token detection” objective; DeBERTa (He et al., 2021) separated content and position information in attention and was the first model to exceed the human baseline on the SuperGLUE benchmark. XLM-RoBERTa (Conneau et al., 2020) extended the approach to 100 languages, including Lithuanian.</w:t>
+        <w:t>Encoder-only models. BERT (Devlin et al., 2019) pre-trains a Transformer encoder with masked language modelling, in which 15% of the tokens are hidden and the model has to predict them from the context on both sides. BERT-base (110 million parameters) and BERT-large (340 million) set new records on the GLUE benchmark (Wang et al., 2019), including SST-2 sentiment classification. RoBERTa (Liu et al., 2019) showed that BERT was under-trained and obtained better results simply by training longer on more data, with larger batches and without the next-sentence prediction task. ALBERT (Lan et al., 2020) reduced the number of parameters through factorised embeddings and cross-layer parameter sharing; ELECTRA (Clark et al., 2020) replaced masked language modelling with a more sample-efficient “replaced token detection” objective; DeBERTa (He et al., 2021) separated content and position information in attention and was the first model to exceed the human baseline on the SuperGLUE benchmark. XLM-RoBERTa (Conneau et al., 2020) extended the approach to 100 languages, including Lithuanian.</w:t>
       </w:r>
     </w:p>
     <w:p>
@@ -5082,10 +4990,7 @@
         <w:pStyle w:val="BDpagrindinistekstas"/>
       </w:pPr>
       <w:r>
-        <w:t xml:space="preserve">Decoder-only and encoder–decoder models. GPT (Radford et al., 2018) pre-trains a Transformer decoder as a left-to-right language model. GPT-3 (Brown et al., 2020), with 175 billion parameters, showed that a sufficiently large model can perform new tasks from instructions and a few examples placed in the prompt (in-context learning) without any fine-tuning. Instruction tuning with human feedback made such models usable as assistants. Encoder–decoder models such as T5 (Raffel et al., 2020), which casts every </w:t>
-      </w:r>
-      <w:r>
-        <w:t>task as text-to-text, and BART (Lewis et al., 2020) are particularly strong for generation tasks such as summarisation and translation.</w:t>
+        <w:t>Decoder-only and encoder–decoder models. GPT (Radford et al., 2018) pre-trains a Transformer decoder as a left-to-right language model. GPT-3 (Brown et al., 2020), with 175 billion parameters, showed that a sufficiently large model can perform new tasks from instructions and a few examples placed in the prompt (in-context learning) without any fine-tuning. Instruction tuning with human feedback made such models usable as assistants. Encoder–decoder models such as T5 (Raffel et al., 2020), which casts every task as text-to-text, and BART (Lewis et al., 2020) are particularly strong for generation tasks such as summarisation and translation.</w:t>
       </w:r>
     </w:p>
     <w:p>
@@ -5111,10 +5016,7 @@
         <w:pStyle w:val="BDpagrindinistekstas"/>
       </w:pPr>
       <w:r>
-        <w:t>Sun et al. (2019) studied how to fine-tune BERT for text classification and showed that the choice of learning rate, layer-wise learning rates and further in-domain pre-training strongly influence the result. Yin et al. (2019) proposed zero-shot text classification by reformulating classification as natural language inference (NLI): the text is the premise and a sentence such as “This text is about sport” is the hypothesis. This allows a model trained on NLI data to classify text into arbitrary labels witho</w:t>
-      </w:r>
-      <w:r>
-        <w:t>ut any task-specific training examples. Loureiro et al. (2022) trained RoBERTa models on Twitter data and showed that domain-specific pre-training matters for social-media text. Zhang et al. (2024) evaluated large language models such as ChatGPT on sentiment tasks and found that, while zero-shot LLMs are competitive on simple binary sentiment, smaller fine-tuned models still outperform them on tasks that require structured or fine-grained sentiment understanding.</w:t>
+        <w:t>Sun et al. (2019) studied how to fine-tune BERT for text classification and showed that the choice of learning rate, layer-wise learning rates and further in-domain pre-training strongly influence the result. Yin et al. (2019) proposed zero-shot text classification by reformulating classification as natural language inference (NLI): the text is the premise and a sentence such as “This text is about sport” is the hypothesis. This allows a model trained on NLI data to classify text into arbitrary labels without any task-specific training examples. Loureiro et al. (2022) trained RoBERTa models on Twitter data and showed that domain-specific pre-training matters for social-media text. Zhang et al. (2024) evaluated large language models such as ChatGPT on sentiment tasks and found that, while zero-shot LLMs are competitive on simple binary sentiment, smaller fine-tuned models still outperform them on tasks that require structured or fine-grained sentiment understanding.</w:t>
       </w:r>
     </w:p>
     <w:p>
@@ -5140,13 +5042,7 @@
         <w:pStyle w:val="BDpagrindinistekstas"/>
       </w:pPr>
       <w:r>
-        <w:t xml:space="preserve">Lithuanian is a morphologically rich language with free word order and relatively few annotated resources, which makes it a challenging case for NLP. Kapočiūtė-Dzikienė et al. (2013) compared machine learning and </w:t>
-      </w:r>
-      <w:r>
-        <w:t>lexicon-based approaches for sentiment classification of Lithuanian Internet comments and found that the specifics of the language (rich inflection, non-normative spelling in comments) strongly affect the choice of features. In a later study, Kapočiūtė-Dzikienė, Damaševičius and Woźniak (2019) compared traditional classifiers (multinomial naive Bayes, support vector machines) with deep neural networks (LSTM and CNN with word embeddings) on a dataset of Lithuanian comments in a three-class setting (positive,</w:t>
-      </w:r>
-      <w:r>
-        <w:t xml:space="preserve"> negative, neutral). Interestingly, the best traditional method (naive Bayes, about 0.735 accuracy) outperformed the best deep learning model (CNN with FastText embeddings, about 0.706), showing that neural models without pre-training do not automatically win when data are limited.</w:t>
+        <w:t>Lithuanian is a morphologically rich language with free word order and relatively few annotated resources, which makes it a challenging case for NLP. Kapočiūtė-Dzikienė et al. (2013) compared machine learning and lexicon-based approaches for sentiment classification of Lithuanian Internet comments and found that the specifics of the language (rich inflection, non-normative spelling in comments) strongly affect the choice of features. In a later study, Kapočiūtė-Dzikienė, Damaševičius and Woźniak (2019) compared traditional classifiers (multinomial naive Bayes, support vector machines) with deep neural networks (LSTM and CNN with word embeddings) on a dataset of Lithuanian comments in a three-class setting (positive, negative, neutral). Interestingly, the best traditional method (naive Bayes, about 0.735 accuracy) outperformed the best deep learning model (CNN with FastText embeddings, about 0.706), showing that neural models without pre-training do not automatically win when data are limited.</w:t>
       </w:r>
     </w:p>
     <w:p>
@@ -5158,10 +5054,7 @@
       </w:r>
       <w:r>
         <w:lastRenderedPageBreak/>
-        <w:t>languages outperform massively multilingual models on most tasks. Vileikytė, Lukoševičius and Stankevičius (2024) from Kaunas University of Technology fine-tuned multilingual BERT and T5 models for sentiment analysis of Lithuanian online reviews from several domains, reporting high accuracy on clearly polar reviews and lower accuracy on ambiguous middle ratings. Nakvosas, Daniušis and Mulevičius (2024) from the Vilnius company Neurotechnology released the first open Llama2-based large language models for Li</w:t>
-      </w:r>
-      <w:r>
-        <w:t>thuanian (7 and 13 billion parameters), pre-trained on more than 14 billion Lithuanian tokens, together with translated evaluation benchmarks.</w:t>
+        <w:t>languages outperform massively multilingual models on most tasks. Vileikytė, Lukoševičius and Stankevičius (2024) from Kaunas University of Technology fine-tuned multilingual BERT and T5 models for sentiment analysis of Lithuanian online reviews from several domains, reporting high accuracy on clearly polar reviews and lower accuracy on ambiguous middle ratings. Nakvosas, Daniušis and Mulevičius (2024) from the Vilnius company Neurotechnology released the first open Llama2-based large language models for Lithuanian (7 and 13 billion parameters), pre-trained on more than 14 billion Lithuanian tokens, together with translated evaluation benchmarks.</w:t>
       </w:r>
     </w:p>
     <w:p>
@@ -5437,10 +5330,7 @@
               <w:keepNext/>
             </w:pPr>
             <w:r>
-              <w:t xml:space="preserve">Transformer </w:t>
-            </w:r>
-            <w:r>
-              <w:t>(self-attention only)</w:t>
+              <w:t>Transformer (self-attention only)</w:t>
             </w:r>
           </w:p>
         </w:tc>
@@ -5750,10 +5640,7 @@
               <w:keepNext/>
             </w:pPr>
             <w:r>
-              <w:t xml:space="preserve">Zero-shot via NLI </w:t>
-            </w:r>
-            <w:r>
-              <w:t>entailment</w:t>
+              <w:t>Zero-shot via NLI entailment</w:t>
             </w:r>
           </w:p>
         </w:tc>
@@ -6015,10 +5902,7 @@
               <w:keepNext/>
             </w:pPr>
             <w:r>
-              <w:t xml:space="preserve">Lithuanian reviews, </w:t>
-            </w:r>
-            <w:r>
-              <w:t>multi-domain</w:t>
+              <w:t>Lithuanian reviews, multi-domain</w:t>
             </w:r>
           </w:p>
         </w:tc>
@@ -6193,10 +6077,7 @@
         <w:ind w:firstLine="0"/>
       </w:pPr>
       <w:r>
-        <w:t xml:space="preserve">Transformer models are the state of the art for text </w:t>
-      </w:r>
-      <w:r>
-        <w:t>classification; on SST-2 fine-tuned Transformers exceed 90% accuracy, compared with roughly 79–83% for classical models.</w:t>
+        <w:t>Transformer models are the state of the art for text classification; on SST-2 fine-tuned Transformers exceed 90% accuracy, compared with roughly 79–83% for classical models.</w:t>
       </w:r>
     </w:p>
     <w:p>
@@ -6277,19 +6158,7 @@
         <w:pStyle w:val="BDpagrindinistekstas"/>
       </w:pPr>
       <w:r>
-        <w:t>The practical task is binary sentiment classification of English sentences. Given a sentence x = (w₁, w₂, …, wₙ), the goal is to learn a function f(x) → y, where y ∈ {0, 1} denotes negative or positive sentiment. The classifier is learned from a labelled training set D = {(x</w:t>
-      </w:r>
-      <w:r>
-        <w:t>ᵢ</w:t>
-      </w:r>
-      <w:r>
-        <w:t>, y</w:t>
-      </w:r>
-      <w:r>
-        <w:t>ᵢ</w:t>
-      </w:r>
-      <w:r>
-        <w:t>)}, i = 1, …, N, and its quality is measured on a separate test set that is never used for training or model selection.</w:t>
+        <w:t>The practical task is binary sentiment classification of English sentences. Given a sentence x = (w₁, w₂, …, wₙ), the goal is to learn a function f(x) → y, where y ∈ {0, 1} denotes negative or positive sentiment. The classifier is learned from a labelled training set D = {(xᵢ, yᵢ)}, i = 1, …, N, and its quality is measured on a separate test set that is never used for training or model selection.</w:t>
       </w:r>
     </w:p>
     <w:p>
@@ -6297,10 +6166,7 @@
         <w:pStyle w:val="BDpagrindinistekstas"/>
       </w:pPr>
       <w:r>
-        <w:t xml:space="preserve">Sentiment classification was chosen for three reasons. First, it is one of the most common real-world applications of NLP (customer reviews, social media monitoring, product feedback). Second, it is a standard benchmark with published results for all model families, so our results can be compared with the literature (Table 2). Third, the task contains linguistic phenomena that are difficult for simple models, such as negation (“not good”), contrast (“the plot is weak, but the acting is great”) and sarcasm, </w:t>
-      </w:r>
-      <w:r>
-        <w:t>which makes it a good test of the contextual understanding provided by self-attention.</w:t>
+        <w:t>Sentiment classification was chosen for three reasons. First, it is one of the most common real-world applications of NLP (customer reviews, social media monitoring, product feedback). Second, it is a standard benchmark with published results for all model families, so our results can be compared with the literature (Table 2). Third, the task contains linguistic phenomena that are difficult for simple models, such as negation (“not good”), contrast (“the plot is weak, but the acting is great”) and sarcasm, which makes it a good test of the contextual understanding provided by self-attention.</w:t>
       </w:r>
     </w:p>
     <w:p>
@@ -6396,10 +6262,7 @@
         <w:pStyle w:val="BDpagrindinistekstas"/>
       </w:pPr>
       <w:r>
-        <w:t xml:space="preserve">The Stanford Sentiment Treebank (SST) was built by Socher et al. (2013) from 11,855 sentences of movie reviews from the website Rotten Tomatoes. Each sentence was parsed into a tree and every phrase was annotated by three human judges. The binary version SST-2, included in the GLUE benchmark (Wang et al., 2019), removes neutral sentences and contains 67,349 training phrases and sentences and 872 validation sentences. Test labels of GLUE are hidden, therefore, following common practice, we used the official </w:t>
-      </w:r>
-      <w:r>
-        <w:t>validation set as our held-out test set. For model selection (choosing the best epoch) we randomly separated 2,000 examples from the training data as a development set, stratified by class. The resulting splits are shown in Table 3.</w:t>
+        <w:t>The Stanford Sentiment Treebank (SST) was built by Socher et al. (2013) from 11,855 sentences of movie reviews from the website Rotten Tomatoes. Each sentence was parsed into a tree and every phrase was annotated by three human judges. The binary version SST-2, included in the GLUE benchmark (Wang et al., 2019), removes neutral sentences and contains 67,349 training phrases and sentences and 872 validation sentences. Test labels of GLUE are hidden, therefore, following common practice, we used the official validation set as our held-out test set. For model selection (choosing the best epoch) we randomly separated 2,000 examples from the training data as a development set, stratified by class. The resulting splits are shown in Table 3.</w:t>
       </w:r>
     </w:p>
     <w:p>
@@ -6830,10 +6693,7 @@
         <w:pStyle w:val="BDpagrindinistekstas"/>
       </w:pPr>
       <w:r>
-        <w:t xml:space="preserve">The training data are slightly imbalanced </w:t>
-      </w:r>
-      <w:r>
-        <w:t>towards the positive class (about 56%), while the test set is almost balanced. The training set contains many short phrases (the average length is below 10 words), whereas the test set contains complete sentences of about 19 words on average. This difference between training and test distributions is part of the challenge: models must generalise from phrases to whole sentences.</w:t>
+        <w:t>The training data are slightly imbalanced towards the positive class (about 56%), while the test set is almost balanced. The training set contains many short phrases (the average length is below 10 words), whereas the test set contains complete sentences of about 19 words on average. This difference between training and test distributions is part of the challenge: models must generalise from phrases to whole sentences.</w:t>
       </w:r>
     </w:p>
     <w:p>
@@ -6851,10 +6711,7 @@
         <w:pStyle w:val="BDpagrindinistekstas"/>
       </w:pPr>
       <w:r>
-        <w:t xml:space="preserve">Ten models were selected to represent four approaches that a practitioner can </w:t>
-      </w:r>
-      <w:r>
-        <w:t>realistically choose from. They are listed in Table 4.</w:t>
+        <w:t>Ten models were selected to represent four approaches that a practitioner can realistically choose from. They are listed in Table 4.</w:t>
       </w:r>
     </w:p>
     <w:p>
@@ -7150,10 +7007,7 @@
               <w:keepNext/>
             </w:pPr>
             <w:r>
-              <w:t xml:space="preserve">TF-IDF + </w:t>
-            </w:r>
-            <w:r>
-              <w:t>Logistic Regression</w:t>
+              <w:t>TF-IDF + Logistic Regression</w:t>
             </w:r>
           </w:p>
         </w:tc>
@@ -7706,10 +7560,7 @@
               <w:keepNext/>
             </w:pPr>
             <w:r>
-              <w:t xml:space="preserve">Twitter-RoBERTa </w:t>
-            </w:r>
-            <w:r>
-              <w:t>sentiment (public)</w:t>
+              <w:t>Twitter-RoBERTa sentiment (public)</w:t>
             </w:r>
           </w:p>
         </w:tc>
@@ -7853,13 +7704,7 @@
         <w:pStyle w:val="BDpagrindinistekstas"/>
       </w:pPr>
       <w:r>
-        <w:t xml:space="preserve">The classical models </w:t>
-      </w:r>
-      <w:r>
-        <w:t xml:space="preserve">represent the pre-neural approach and serve as strong, cheap baselines. The bidirectional LSTM represents the pre-Transformer neural approach, trained from scratch without pre-training. The three fine-tuned Transformers differ only in size (4.4, 29 and 67 million parameters), which allows us to observe how quality and cost scale with model size. BERT-tiny (2 layers, hidden size 128) and BERT-small (4 layers, hidden size 512) are compact BERT models pre-trained and released by Google together with the study </w:t>
-      </w:r>
-      <w:r>
-        <w:t>of Turc et al. (2019); DistilBERT is the distilled version of BERT-base (Sanh et al., 2019). The three ready-made models represent the “use a public model as a service” scenario: a DistilBERT model that has already been fine-tuned on SST-2 by its authors (the best case of reuse), a RoBERTa model trained for sentiment on tweets (a different domain, Loureiro et al., 2022) and a zero-shot NLI model (Yin et al., 2019) that has never seen sentiment labels.</w:t>
+        <w:t>The classical models represent the pre-neural approach and serve as strong, cheap baselines. The bidirectional LSTM represents the pre-Transformer neural approach, trained from scratch without pre-training. The three fine-tuned Transformers differ only in size (4.4, 29 and 67 million parameters), which allows us to observe how quality and cost scale with model size. BERT-tiny (2 layers, hidden size 128) and BERT-small (4 layers, hidden size 512) are compact BERT models pre-trained and released by Google together with the study of Turc et al. (2019); DistilBERT is the distilled version of BERT-base (Sanh et al., 2019). The three ready-made models represent the “use a public model as a service” scenario: a DistilBERT model that has already been fine-tuned on SST-2 by its authors (the best case of reuse), a RoBERTa model trained for sentiment on tweets (a different domain, Loureiro et al., 2022) and a zero-shot NLI model (Yin et al., 2019) that has never seen sentiment labels.</w:t>
       </w:r>
     </w:p>
     <w:p>
@@ -8021,7 +7866,7 @@
                     <pic:cNvPicPr/>
                   </pic:nvPicPr>
                   <pic:blipFill>
-                    <a:blip r:embed="rId12"/>
+                    <a:blip r:embed="rId10"/>
                     <a:stretch>
                       <a:fillRect/>
                     </a:stretch>
@@ -8169,10 +8014,7 @@
         <w:ind w:firstLine="0"/>
       </w:pPr>
       <w:r>
-        <w:t xml:space="preserve">03_bilstm.py – implements the tokeniser, the vocabulary and the BiLSTM network in PyTorch and </w:t>
-      </w:r>
-      <w:r>
-        <w:t>trains it with early model selection on the dev set;</w:t>
+        <w:t>03_bilstm.py – implements the tokeniser, the vocabulary and the BiLSTM network in PyTorch and trains it with early model selection on the dev set;</w:t>
       </w:r>
     </w:p>
     <w:p>
@@ -8243,10 +8085,7 @@
       </w:pPr>
       <w:r>
         <w:lastRenderedPageBreak/>
-        <w:t xml:space="preserve">08_report.py – collects all JSON results, produces the tables and figures, the subset </w:t>
-      </w:r>
-      <w:r>
-        <w:t>(negation and contrast) analysis and the statistical tests.</w:t>
+        <w:t>08_report.py – collects all JSON results, produces the tables and figures, the subset (negation and contrast) analysis and the statistical tests.</w:t>
       </w:r>
     </w:p>
     <w:p>
@@ -8297,7 +8136,7 @@
                     <pic:cNvPicPr/>
                   </pic:nvPicPr>
                   <pic:blipFill>
-                    <a:blip r:embed="rId13"/>
+                    <a:blip r:embed="rId11"/>
                     <a:stretch>
                       <a:fillRect/>
                     </a:stretch>
@@ -8397,10 +8236,7 @@
         <w:pStyle w:val="BDpagrindinistekstas"/>
       </w:pPr>
       <w:r>
-        <w:t>Text is first split into sub-word units. BERT models use the WordPiece algorithm and RoBERTa uses byte-pair encoding. Frequent words are kept whole, while rare words are split into pieces (for example, “unwatchable” → “un”, “##watch”, “##able”), so the vocabulary is limited (about 30,000 units for BERT) and no word is ever out of vocabulary. A special [CLS] token is added at the beginning of every input and [SEP] at the end. Each token is mapped to a vector of dimension d (d = 128 for BERT-tiny, 512 for BER</w:t>
-      </w:r>
-      <w:r>
-        <w:t>T-small and 768 for DistilBERT) by an embedding matrix E.</w:t>
+        <w:t>Text is first split into sub-word units. BERT models use the WordPiece algorithm and RoBERTa uses byte-pair encoding. Frequent words are kept whole, while rare words are split into pieces (for example, “unwatchable” → “un”, “##watch”, “##able”), so the vocabulary is limited (about 30,000 units for BERT) and no word is ever out of vocabulary. A special [CLS] token is added at the beginning of every input and [SEP] at the end. Each token is mapped to a vector of dimension d (d = 128 for BERT-tiny, 512 for BERT-small and 768 for DistilBERT) by an embedding matrix E.</w:t>
       </w:r>
     </w:p>
     <w:p>
@@ -8457,31 +8293,7 @@
               <w:rPr>
                 <w:rFonts w:ascii="Cambria Math" w:hAnsi="Cambria Math"/>
               </w:rPr>
-              <m:t>(</m:t>
-            </m:r>
-            <m:r>
-              <w:rPr>
-                <w:rFonts w:ascii="Cambria Math" w:hAnsi="Cambria Math"/>
-              </w:rPr>
-              <m:t>pos</m:t>
-            </m:r>
-            <m:r>
-              <w:rPr>
-                <w:rFonts w:ascii="Cambria Math" w:hAnsi="Cambria Math"/>
-              </w:rPr>
-              <m:t>,2</m:t>
-            </m:r>
-            <m:r>
-              <w:rPr>
-                <w:rFonts w:ascii="Cambria Math" w:hAnsi="Cambria Math"/>
-              </w:rPr>
-              <m:t>i</m:t>
-            </m:r>
-            <m:r>
-              <w:rPr>
-                <w:rFonts w:ascii="Cambria Math" w:hAnsi="Cambria Math"/>
-              </w:rPr>
-              <m:t>)</m:t>
+              <m:t>(pos,2i)</m:t>
             </m:r>
           </m:sub>
         </m:sSub>
@@ -8489,19 +8301,7 @@
           <w:rPr>
             <w:rFonts w:ascii="Cambria Math" w:hAnsi="Cambria Math"/>
           </w:rPr>
-          <m:t>=</m:t>
-        </m:r>
-        <m:r>
-          <w:rPr>
-            <w:rFonts w:ascii="Cambria Math" w:hAnsi="Cambria Math"/>
-          </w:rPr>
-          <m:t>sin</m:t>
-        </m:r>
-        <m:r>
-          <w:rPr>
-            <w:rFonts w:ascii="Cambria Math" w:hAnsi="Cambria Math"/>
-          </w:rPr>
-          <m:t>(</m:t>
+          <m:t>=sin(</m:t>
         </m:r>
         <m:f>
           <m:fPr>
@@ -8541,25 +8341,7 @@
                   <w:rPr>
                     <w:rFonts w:ascii="Cambria Math" w:hAnsi="Cambria Math"/>
                   </w:rPr>
-                  <m:t>2</m:t>
-                </m:r>
-                <m:r>
-                  <w:rPr>
-                    <w:rFonts w:ascii="Cambria Math" w:hAnsi="Cambria Math"/>
-                  </w:rPr>
-                  <m:t>i</m:t>
-                </m:r>
-                <m:r>
-                  <w:rPr>
-                    <w:rFonts w:ascii="Cambria Math" w:hAnsi="Cambria Math"/>
-                  </w:rPr>
-                  <m:t>/</m:t>
-                </m:r>
-                <m:r>
-                  <w:rPr>
-                    <w:rFonts w:ascii="Cambria Math" w:hAnsi="Cambria Math"/>
-                  </w:rPr>
-                  <m:t>d</m:t>
+                  <m:t>2i/d</m:t>
                 </m:r>
               </m:sup>
             </m:sSup>
@@ -8569,13 +8351,7 @@
           <w:rPr>
             <w:rFonts w:ascii="Cambria Math" w:hAnsi="Cambria Math"/>
           </w:rPr>
-          <m:t>),</m:t>
-        </m:r>
-        <m:r>
-          <w:rPr>
-            <w:rFonts w:ascii="Cambria Math" w:hAnsi="Cambria Math"/>
-          </w:rPr>
-          <m:t>P</m:t>
+          <m:t>),P</m:t>
         </m:r>
         <m:sSub>
           <m:sSubPr>
@@ -8598,31 +8374,7 @@
               <w:rPr>
                 <w:rFonts w:ascii="Cambria Math" w:hAnsi="Cambria Math"/>
               </w:rPr>
-              <m:t>(</m:t>
-            </m:r>
-            <m:r>
-              <w:rPr>
-                <w:rFonts w:ascii="Cambria Math" w:hAnsi="Cambria Math"/>
-              </w:rPr>
-              <m:t>pos</m:t>
-            </m:r>
-            <m:r>
-              <w:rPr>
-                <w:rFonts w:ascii="Cambria Math" w:hAnsi="Cambria Math"/>
-              </w:rPr>
-              <m:t>,2</m:t>
-            </m:r>
-            <m:r>
-              <w:rPr>
-                <w:rFonts w:ascii="Cambria Math" w:hAnsi="Cambria Math"/>
-              </w:rPr>
-              <m:t>i</m:t>
-            </m:r>
-            <m:r>
-              <w:rPr>
-                <w:rFonts w:ascii="Cambria Math" w:hAnsi="Cambria Math"/>
-              </w:rPr>
-              <m:t>+1)</m:t>
+              <m:t>(pos,2i+1)</m:t>
             </m:r>
           </m:sub>
         </m:sSub>
@@ -8630,19 +8382,7 @@
           <w:rPr>
             <w:rFonts w:ascii="Cambria Math" w:hAnsi="Cambria Math"/>
           </w:rPr>
-          <m:t>=</m:t>
-        </m:r>
-        <m:r>
-          <w:rPr>
-            <w:rFonts w:ascii="Cambria Math" w:hAnsi="Cambria Math"/>
-          </w:rPr>
-          <m:t>cos</m:t>
-        </m:r>
-        <m:r>
-          <w:rPr>
-            <w:rFonts w:ascii="Cambria Math" w:hAnsi="Cambria Math"/>
-          </w:rPr>
-          <m:t>(</m:t>
+          <m:t>=cos(</m:t>
         </m:r>
         <m:f>
           <m:fPr>
@@ -8682,25 +8422,7 @@
                   <w:rPr>
                     <w:rFonts w:ascii="Cambria Math" w:hAnsi="Cambria Math"/>
                   </w:rPr>
-                  <m:t>2</m:t>
-                </m:r>
-                <m:r>
-                  <w:rPr>
-                    <w:rFonts w:ascii="Cambria Math" w:hAnsi="Cambria Math"/>
-                  </w:rPr>
-                  <m:t>i</m:t>
-                </m:r>
-                <m:r>
-                  <w:rPr>
-                    <w:rFonts w:ascii="Cambria Math" w:hAnsi="Cambria Math"/>
-                  </w:rPr>
-                  <m:t>/</m:t>
-                </m:r>
-                <m:r>
-                  <w:rPr>
-                    <w:rFonts w:ascii="Cambria Math" w:hAnsi="Cambria Math"/>
-                  </w:rPr>
-                  <m:t>d</m:t>
+                  <m:t>2i/d</m:t>
                 </m:r>
               </m:sup>
             </m:sSup>
@@ -8744,13 +8466,7 @@
         <w:keepNext/>
       </w:pPr>
       <w:r>
-        <w:t>The central operation of the Transformer is attention. Every token representation is projected into three vectors: a query q, a key k and a value v. For a sequence of n tokens these are stacked into matrices Q, K, V ∈ ℝⁿˣ</w:t>
-      </w:r>
-      <w:r>
-        <w:t>ᵈᵏ</w:t>
-      </w:r>
-      <w:r>
-        <w:t>, obtained from the input H by learned projections:</w:t>
+        <w:t>The central operation of the Transformer is attention. Every token representation is projected into three vectors: a query q, a key k and a value v. For a sequence of n tokens these are stacked into matrices Q, K, V ∈ ℝⁿˣᵈᵏ, obtained from the input H by learned projections:</w:t>
       </w:r>
     </w:p>
     <w:p>
@@ -8766,19 +8482,7 @@
           <w:rPr>
             <w:rFonts w:ascii="Cambria Math" w:hAnsi="Cambria Math"/>
           </w:rPr>
-          <m:t>Q</m:t>
-        </m:r>
-        <m:r>
-          <w:rPr>
-            <w:rFonts w:ascii="Cambria Math" w:hAnsi="Cambria Math"/>
-          </w:rPr>
-          <m:t>=</m:t>
-        </m:r>
-        <m:r>
-          <w:rPr>
-            <w:rFonts w:ascii="Cambria Math" w:hAnsi="Cambria Math"/>
-          </w:rPr>
-          <m:t>H</m:t>
+          <m:t>Q=H</m:t>
         </m:r>
         <m:sSub>
           <m:sSubPr>
@@ -8809,25 +8513,7 @@
           <w:rPr>
             <w:rFonts w:ascii="Cambria Math" w:hAnsi="Cambria Math"/>
           </w:rPr>
-          <m:t>,</m:t>
-        </m:r>
-        <m:r>
-          <w:rPr>
-            <w:rFonts w:ascii="Cambria Math" w:hAnsi="Cambria Math"/>
-          </w:rPr>
-          <m:t>K</m:t>
-        </m:r>
-        <m:r>
-          <w:rPr>
-            <w:rFonts w:ascii="Cambria Math" w:hAnsi="Cambria Math"/>
-          </w:rPr>
-          <m:t>=</m:t>
-        </m:r>
-        <m:r>
-          <w:rPr>
-            <w:rFonts w:ascii="Cambria Math" w:hAnsi="Cambria Math"/>
-          </w:rPr>
-          <m:t>H</m:t>
+          <m:t>,K=H</m:t>
         </m:r>
         <m:sSub>
           <m:sSubPr>
@@ -8858,25 +8544,7 @@
           <w:rPr>
             <w:rFonts w:ascii="Cambria Math" w:hAnsi="Cambria Math"/>
           </w:rPr>
-          <m:t>,</m:t>
-        </m:r>
-        <m:r>
-          <w:rPr>
-            <w:rFonts w:ascii="Cambria Math" w:hAnsi="Cambria Math"/>
-          </w:rPr>
-          <m:t>V</m:t>
-        </m:r>
-        <m:r>
-          <w:rPr>
-            <w:rFonts w:ascii="Cambria Math" w:hAnsi="Cambria Math"/>
-          </w:rPr>
-          <m:t>=</m:t>
-        </m:r>
-        <m:r>
-          <w:rPr>
-            <w:rFonts w:ascii="Cambria Math" w:hAnsi="Cambria Math"/>
-          </w:rPr>
-          <m:t>H</m:t>
+          <m:t>,V=H</m:t>
         </m:r>
         <m:sSub>
           <m:sSubPr>
@@ -8935,61 +8603,7 @@
           <w:rPr>
             <w:rFonts w:ascii="Cambria Math" w:hAnsi="Cambria Math"/>
           </w:rPr>
-          <m:t>Attention</m:t>
-        </m:r>
-        <m:r>
-          <w:rPr>
-            <w:rFonts w:ascii="Cambria Math" w:hAnsi="Cambria Math"/>
-          </w:rPr>
-          <m:t>(</m:t>
-        </m:r>
-        <m:r>
-          <w:rPr>
-            <w:rFonts w:ascii="Cambria Math" w:hAnsi="Cambria Math"/>
-          </w:rPr>
-          <m:t>Q</m:t>
-        </m:r>
-        <m:r>
-          <w:rPr>
-            <w:rFonts w:ascii="Cambria Math" w:hAnsi="Cambria Math"/>
-          </w:rPr>
-          <m:t>,</m:t>
-        </m:r>
-        <m:r>
-          <w:rPr>
-            <w:rFonts w:ascii="Cambria Math" w:hAnsi="Cambria Math"/>
-          </w:rPr>
-          <m:t>K</m:t>
-        </m:r>
-        <m:r>
-          <w:rPr>
-            <w:rFonts w:ascii="Cambria Math" w:hAnsi="Cambria Math"/>
-          </w:rPr>
-          <m:t>,</m:t>
-        </m:r>
-        <m:r>
-          <w:rPr>
-            <w:rFonts w:ascii="Cambria Math" w:hAnsi="Cambria Math"/>
-          </w:rPr>
-          <m:t>V</m:t>
-        </m:r>
-        <m:r>
-          <w:rPr>
-            <w:rFonts w:ascii="Cambria Math" w:hAnsi="Cambria Math"/>
-          </w:rPr>
-          <m:t>)=</m:t>
-        </m:r>
-        <m:r>
-          <w:rPr>
-            <w:rFonts w:ascii="Cambria Math" w:hAnsi="Cambria Math"/>
-          </w:rPr>
-          <m:t>softmax</m:t>
-        </m:r>
-        <m:r>
-          <w:rPr>
-            <w:rFonts w:ascii="Cambria Math" w:hAnsi="Cambria Math"/>
-          </w:rPr>
-          <m:t>(</m:t>
+          <m:t>Attention(Q,K,V)=softmax(</m:t>
         </m:r>
         <m:f>
           <m:fPr>
@@ -9077,13 +8691,7 @@
           <w:rPr>
             <w:rFonts w:ascii="Cambria Math" w:hAnsi="Cambria Math"/>
           </w:rPr>
-          <m:t>)</m:t>
-        </m:r>
-        <m:r>
-          <w:rPr>
-            <w:rFonts w:ascii="Cambria Math" w:hAnsi="Cambria Math"/>
-          </w:rPr>
-          <m:t>V</m:t>
+          <m:t>)V</m:t>
         </m:r>
       </m:oMath>
       <w:r>
@@ -9101,13 +8709,7 @@
         <w:keepNext/>
       </w:pPr>
       <w:r>
-        <w:t>The matrix product Q·K</w:t>
-      </w:r>
-      <w:r>
-        <w:t>ᵀ</w:t>
-      </w:r>
-      <w:r>
-        <w:t xml:space="preserve"> gives an n × n matrix of similarity scores between every pair of tokens. The softmax function, applied to each row, turns the scores into weights that are positive and sum to one:</w:t>
+        <w:t>The matrix product Q·Kᵀ gives an n × n matrix of similarity scores between every pair of tokens. The softmax function, applied to each row, turns the scores into weights that are positive and sum to one:</w:t>
       </w:r>
     </w:p>
     <w:p>
@@ -9123,19 +8725,7 @@
           <w:rPr>
             <w:rFonts w:ascii="Cambria Math" w:hAnsi="Cambria Math"/>
           </w:rPr>
-          <m:t>softmax</m:t>
-        </m:r>
-        <m:r>
-          <w:rPr>
-            <w:rFonts w:ascii="Cambria Math" w:hAnsi="Cambria Math"/>
-          </w:rPr>
-          <m:t>(</m:t>
-        </m:r>
-        <m:r>
-          <w:rPr>
-            <w:rFonts w:ascii="Cambria Math" w:hAnsi="Cambria Math"/>
-          </w:rPr>
-          <m:t>z</m:t>
+          <m:t>softmax(z</m:t>
         </m:r>
         <m:sSub>
           <m:sSubPr>
@@ -9308,10 +8898,7 @@
         <w:pStyle w:val="BDpagrindinistekstas"/>
       </w:pPr>
       <w:r>
-        <w:t>The output for each token is a weighted average of the value vectors of all tokens, so a word can directly gather information from any other word in the sentence regardless of distance. Division by √d_k prevents the dot products from becoming very large for high dimensions, which would push the softmax into regions with extremely small gradients. In our task, for example, the representation of the word “good” in “not good” can attend strongly to “not”, which allows the model to represent the negated meaning</w:t>
-      </w:r>
-      <w:r>
-        <w:t>.</w:t>
+        <w:t>The output for each token is a weighted average of the value vectors of all tokens, so a word can directly gather information from any other word in the sentence regardless of distance. Division by √d_k prevents the dot products from becoming very large for high dimensions, which would push the softmax into regions with extremely small gradients. In our task, for example, the representation of the word “good” in “not good” can attend strongly to “not”, which allows the model to represent the negated meaning.</w:t>
       </w:r>
     </w:p>
     <w:p>
@@ -9369,25 +8956,7 @@
           <w:rPr>
             <w:rFonts w:ascii="Cambria Math" w:hAnsi="Cambria Math"/>
           </w:rPr>
-          <m:t>=</m:t>
-        </m:r>
-        <m:r>
-          <w:rPr>
-            <w:rFonts w:ascii="Cambria Math" w:hAnsi="Cambria Math"/>
-          </w:rPr>
-          <m:t>Attention</m:t>
-        </m:r>
-        <m:r>
-          <w:rPr>
-            <w:rFonts w:ascii="Cambria Math" w:hAnsi="Cambria Math"/>
-          </w:rPr>
-          <m:t>(</m:t>
-        </m:r>
-        <m:r>
-          <w:rPr>
-            <w:rFonts w:ascii="Cambria Math" w:hAnsi="Cambria Math"/>
-          </w:rPr>
-          <m:t>H</m:t>
+          <m:t>=Attention(H</m:t>
         </m:r>
         <m:sSubSup>
           <m:sSubSupPr>
@@ -9426,13 +8995,7 @@
           <w:rPr>
             <w:rFonts w:ascii="Cambria Math" w:hAnsi="Cambria Math"/>
           </w:rPr>
-          <m:t>,</m:t>
-        </m:r>
-        <m:r>
-          <w:rPr>
-            <w:rFonts w:ascii="Cambria Math" w:hAnsi="Cambria Math"/>
-          </w:rPr>
-          <m:t>H</m:t>
+          <m:t>,H</m:t>
         </m:r>
         <m:sSubSup>
           <m:sSubSupPr>
@@ -9471,13 +9034,7 @@
           <w:rPr>
             <w:rFonts w:ascii="Cambria Math" w:hAnsi="Cambria Math"/>
           </w:rPr>
-          <m:t>,</m:t>
-        </m:r>
-        <m:r>
-          <w:rPr>
-            <w:rFonts w:ascii="Cambria Math" w:hAnsi="Cambria Math"/>
-          </w:rPr>
-          <m:t>H</m:t>
+          <m:t>,H</m:t>
         </m:r>
         <m:sSubSup>
           <m:sSubSupPr>
@@ -9516,43 +9073,7 @@
           <w:rPr>
             <w:rFonts w:ascii="Cambria Math" w:hAnsi="Cambria Math"/>
           </w:rPr>
-          <m:t>),</m:t>
-        </m:r>
-        <m:r>
-          <w:rPr>
-            <w:rFonts w:ascii="Cambria Math" w:hAnsi="Cambria Math"/>
-          </w:rPr>
-          <m:t>MultiHead</m:t>
-        </m:r>
-        <m:r>
-          <w:rPr>
-            <w:rFonts w:ascii="Cambria Math" w:hAnsi="Cambria Math"/>
-          </w:rPr>
-          <m:t>(</m:t>
-        </m:r>
-        <m:r>
-          <w:rPr>
-            <w:rFonts w:ascii="Cambria Math" w:hAnsi="Cambria Math"/>
-          </w:rPr>
-          <m:t>H</m:t>
-        </m:r>
-        <m:r>
-          <w:rPr>
-            <w:rFonts w:ascii="Cambria Math" w:hAnsi="Cambria Math"/>
-          </w:rPr>
-          <m:t>)=</m:t>
-        </m:r>
-        <m:r>
-          <w:rPr>
-            <w:rFonts w:ascii="Cambria Math" w:hAnsi="Cambria Math"/>
-          </w:rPr>
-          <m:t>Concat</m:t>
-        </m:r>
-        <m:r>
-          <w:rPr>
-            <w:rFonts w:ascii="Cambria Math" w:hAnsi="Cambria Math"/>
-          </w:rPr>
-          <m:t>(</m:t>
+          <m:t>),MultiHead(H)=Concat(</m:t>
         </m:r>
         <m:sSub>
           <m:sSubPr>
@@ -9656,10 +9177,7 @@
         <w:pStyle w:val="BDpagrindinistekstas"/>
       </w:pPr>
       <w:r>
-        <w:t xml:space="preserve">Different heads can specialise in different relations, for example one head may link adjectives with the nouns they modify while another links negation words with their scope (Clark et al., 2019). </w:t>
-      </w:r>
-      <w:r>
-        <w:t>BERT-tiny uses 2 heads, BERT-small 8 heads and DistilBERT 12 heads per layer.</w:t>
+        <w:t>Different heads can specialise in different relations, for example one head may link adjectives with the nouns they modify while another links negation words with their scope (Clark et al., 2019). BERT-tiny uses 2 heads, BERT-small 8 heads and DistilBERT 12 heads per layer.</w:t>
       </w:r>
     </w:p>
     <w:p>
@@ -9692,43 +9210,7 @@
           <w:rPr>
             <w:rFonts w:ascii="Cambria Math" w:hAnsi="Cambria Math"/>
           </w:rPr>
-          <m:t>FFN</m:t>
-        </m:r>
-        <m:r>
-          <w:rPr>
-            <w:rFonts w:ascii="Cambria Math" w:hAnsi="Cambria Math"/>
-          </w:rPr>
-          <m:t>(</m:t>
-        </m:r>
-        <m:r>
-          <w:rPr>
-            <w:rFonts w:ascii="Cambria Math" w:hAnsi="Cambria Math"/>
-          </w:rPr>
-          <m:t>x</m:t>
-        </m:r>
-        <m:r>
-          <w:rPr>
-            <w:rFonts w:ascii="Cambria Math" w:hAnsi="Cambria Math"/>
-          </w:rPr>
-          <m:t>)=</m:t>
-        </m:r>
-        <m:r>
-          <w:rPr>
-            <w:rFonts w:ascii="Cambria Math" w:hAnsi="Cambria Math"/>
-          </w:rPr>
-          <m:t>GELU</m:t>
-        </m:r>
-        <m:r>
-          <w:rPr>
-            <w:rFonts w:ascii="Cambria Math" w:hAnsi="Cambria Math"/>
-          </w:rPr>
-          <m:t>(</m:t>
-        </m:r>
-        <m:r>
-          <w:rPr>
-            <w:rFonts w:ascii="Cambria Math" w:hAnsi="Cambria Math"/>
-          </w:rPr>
-          <m:t>x</m:t>
+          <m:t>FFN(x)=GELU(x</m:t>
         </m:r>
         <m:sSub>
           <m:sSubPr>
@@ -9906,55 +9388,7 @@
           <w:rPr>
             <w:rFonts w:ascii="Cambria Math" w:hAnsi="Cambria Math"/>
           </w:rPr>
-          <m:t>=</m:t>
-        </m:r>
-        <m:r>
-          <w:rPr>
-            <w:rFonts w:ascii="Cambria Math" w:hAnsi="Cambria Math"/>
-          </w:rPr>
-          <m:t>LayerNorm</m:t>
-        </m:r>
-        <m:r>
-          <w:rPr>
-            <w:rFonts w:ascii="Cambria Math" w:hAnsi="Cambria Math"/>
-          </w:rPr>
-          <m:t>(</m:t>
-        </m:r>
-        <m:r>
-          <w:rPr>
-            <w:rFonts w:ascii="Cambria Math" w:hAnsi="Cambria Math"/>
-          </w:rPr>
-          <m:t>H</m:t>
-        </m:r>
-        <m:r>
-          <w:rPr>
-            <w:rFonts w:ascii="Cambria Math" w:hAnsi="Cambria Math"/>
-          </w:rPr>
-          <m:t>+</m:t>
-        </m:r>
-        <m:r>
-          <w:rPr>
-            <w:rFonts w:ascii="Cambria Math" w:hAnsi="Cambria Math"/>
-          </w:rPr>
-          <m:t>MultiHead</m:t>
-        </m:r>
-        <m:r>
-          <w:rPr>
-            <w:rFonts w:ascii="Cambria Math" w:hAnsi="Cambria Math"/>
-          </w:rPr>
-          <m:t>(</m:t>
-        </m:r>
-        <m:r>
-          <w:rPr>
-            <w:rFonts w:ascii="Cambria Math" w:hAnsi="Cambria Math"/>
-          </w:rPr>
-          <m:t>H</m:t>
-        </m:r>
-        <m:r>
-          <w:rPr>
-            <w:rFonts w:ascii="Cambria Math" w:hAnsi="Cambria Math"/>
-          </w:rPr>
-          <m:t>)),</m:t>
+          <m:t>=LayerNorm(H+MultiHead(H)),</m:t>
         </m:r>
         <m:sSup>
           <m:sSupPr>
@@ -9985,19 +9419,7 @@
           <w:rPr>
             <w:rFonts w:ascii="Cambria Math" w:hAnsi="Cambria Math"/>
           </w:rPr>
-          <m:t>=</m:t>
-        </m:r>
-        <m:r>
-          <w:rPr>
-            <w:rFonts w:ascii="Cambria Math" w:hAnsi="Cambria Math"/>
-          </w:rPr>
-          <m:t>LayerNorm</m:t>
-        </m:r>
-        <m:r>
-          <w:rPr>
-            <w:rFonts w:ascii="Cambria Math" w:hAnsi="Cambria Math"/>
-          </w:rPr>
-          <m:t>(</m:t>
+          <m:t>=LayerNorm(</m:t>
         </m:r>
         <m:sSup>
           <m:sSupPr>
@@ -10028,19 +9450,7 @@
           <w:rPr>
             <w:rFonts w:ascii="Cambria Math" w:hAnsi="Cambria Math"/>
           </w:rPr>
-          <m:t>+</m:t>
-        </m:r>
-        <m:r>
-          <w:rPr>
-            <w:rFonts w:ascii="Cambria Math" w:hAnsi="Cambria Math"/>
-          </w:rPr>
-          <m:t>FFN</m:t>
-        </m:r>
-        <m:r>
-          <w:rPr>
-            <w:rFonts w:ascii="Cambria Math" w:hAnsi="Cambria Math"/>
-          </w:rPr>
-          <m:t>(</m:t>
+          <m:t>+FFN(</m:t>
         </m:r>
         <m:sSup>
           <m:sSupPr>
@@ -10096,37 +9506,7 @@
           <w:rPr>
             <w:rFonts w:ascii="Cambria Math" w:hAnsi="Cambria Math"/>
           </w:rPr>
-          <m:t>LayerNorm</m:t>
-        </m:r>
-        <m:r>
-          <w:rPr>
-            <w:rFonts w:ascii="Cambria Math" w:hAnsi="Cambria Math"/>
-          </w:rPr>
-          <m:t>(</m:t>
-        </m:r>
-        <m:r>
-          <w:rPr>
-            <w:rFonts w:ascii="Cambria Math" w:hAnsi="Cambria Math"/>
-          </w:rPr>
-          <m:t>x</m:t>
-        </m:r>
-        <m:r>
-          <w:rPr>
-            <w:rFonts w:ascii="Cambria Math" w:hAnsi="Cambria Math"/>
-          </w:rPr>
-          <m:t>)=</m:t>
-        </m:r>
-        <m:r>
-          <w:rPr>
-            <w:rFonts w:ascii="Cambria Math" w:hAnsi="Cambria Math"/>
-          </w:rPr>
-          <m:t>γ</m:t>
-        </m:r>
-        <m:r>
-          <w:rPr>
-            <w:rFonts w:ascii="Cambria Math" w:hAnsi="Cambria Math"/>
-          </w:rPr>
-          <m:t>⊙</m:t>
+          <m:t>LayerNorm(x)=γ⊙</m:t>
         </m:r>
         <m:f>
           <m:fPr>
@@ -10141,19 +9521,7 @@
               <w:rPr>
                 <w:rFonts w:ascii="Cambria Math" w:hAnsi="Cambria Math"/>
               </w:rPr>
-              <m:t>x</m:t>
-            </m:r>
-            <m:r>
-              <w:rPr>
-                <w:rFonts w:ascii="Cambria Math" w:hAnsi="Cambria Math"/>
-              </w:rPr>
-              <m:t>-</m:t>
-            </m:r>
-            <m:r>
-              <w:rPr>
-                <w:rFonts w:ascii="Cambria Math" w:hAnsi="Cambria Math"/>
-              </w:rPr>
-              <m:t>μ</m:t>
+              <m:t>x-μ</m:t>
             </m:r>
           </m:num>
           <m:den>
@@ -10197,13 +9565,7 @@
                   <w:rPr>
                     <w:rFonts w:ascii="Cambria Math" w:hAnsi="Cambria Math"/>
                   </w:rPr>
-                  <m:t>+</m:t>
-                </m:r>
-                <m:r>
-                  <w:rPr>
-                    <w:rFonts w:ascii="Cambria Math" w:hAnsi="Cambria Math"/>
-                  </w:rPr>
-                  <m:t>ϵ</m:t>
+                  <m:t>+ϵ</m:t>
                 </m:r>
               </m:e>
             </m:rad>
@@ -10213,13 +9575,7 @@
           <w:rPr>
             <w:rFonts w:ascii="Cambria Math" w:hAnsi="Cambria Math"/>
           </w:rPr>
-          <m:t>+</m:t>
-        </m:r>
-        <m:r>
-          <w:rPr>
-            <w:rFonts w:ascii="Cambria Math" w:hAnsi="Cambria Math"/>
-          </w:rPr>
-          <m:t>β</m:t>
+          <m:t>+β</m:t>
         </m:r>
       </m:oMath>
       <w:r>
@@ -10253,10 +9609,7 @@
         <w:pStyle w:val="BDpagrindinistekstas"/>
       </w:pPr>
       <w:r>
-        <w:t xml:space="preserve">Self-attention compares every token with every other token, so one layer requires O(n²·d) operations for a sequence of length n, compared with O(n·d²) for a recurrent layer. However, all n positions are computed in parallel, whereas a recurrent network needs n sequential steps. For short and medium sequences (n &lt; d), which is the case for sentences, self-attention is both faster and better at modelling long-range dependencies. For very long documents the quadratic cost becomes a limitation, which motivated </w:t>
-      </w:r>
-      <w:r>
-        <w:t>efficient Transformer variants (Tay et al., 2022). In our experiment the maximum length was set to 64 tokens, which covers 99.99% of the training sentences and all test sentences (the longest test sentence has 55 sub-word tokens).</w:t>
+        <w:t>Self-attention compares every token with every other token, so one layer requires O(n²·d) operations for a sequence of length n, compared with O(n·d²) for a recurrent layer. However, all n positions are computed in parallel, whereas a recurrent network needs n sequential steps. For short and medium sequences (n &lt; d), which is the case for sentences, self-attention is both faster and better at modelling long-range dependencies. For very long documents the quadratic cost becomes a limitation, which motivated efficient Transformer variants (Tay et al., 2022). In our experiment the maximum length was set to 64 tokens, which covers 99.99% of the training sentences and all test sentences (the longest test sentence has 55 sub-word tokens).</w:t>
       </w:r>
     </w:p>
     <w:p>
@@ -10343,19 +9696,7 @@
               <w:rPr>
                 <w:rFonts w:ascii="Cambria Math" w:hAnsi="Cambria Math"/>
               </w:rPr>
-              <m:t>t</m:t>
-            </m:r>
-            <m:r>
-              <w:rPr>
-                <w:rFonts w:ascii="Cambria Math" w:hAnsi="Cambria Math"/>
-              </w:rPr>
-              <m:t>∈</m:t>
-            </m:r>
-            <m:r>
-              <w:rPr>
-                <w:rFonts w:ascii="Cambria Math" w:hAnsi="Cambria Math"/>
-              </w:rPr>
-              <m:t>M</m:t>
+              <m:t>t∈M</m:t>
             </m:r>
           </m:sub>
           <m:sup/>
@@ -10364,19 +9705,7 @@
               <w:rPr>
                 <w:rFonts w:ascii="Cambria Math" w:hAnsi="Cambria Math"/>
               </w:rPr>
-              <m:t>log</m:t>
-            </m:r>
-            <m:r>
-              <w:rPr>
-                <w:rFonts w:ascii="Cambria Math" w:hAnsi="Cambria Math"/>
-              </w:rPr>
-              <m:t>P</m:t>
-            </m:r>
-            <m:r>
-              <w:rPr>
-                <w:rFonts w:ascii="Cambria Math" w:hAnsi="Cambria Math"/>
-              </w:rPr>
-              <m:t>(</m:t>
+              <m:t>logP(</m:t>
             </m:r>
             <m:sSub>
               <m:sSubPr>
@@ -10430,13 +9759,7 @@
                   <w:rPr>
                     <w:rFonts w:ascii="Cambria Math" w:hAnsi="Cambria Math"/>
                   </w:rPr>
-                  <m:t>⧵</m:t>
-                </m:r>
-                <m:r>
-                  <w:rPr>
-                    <w:rFonts w:ascii="Cambria Math" w:hAnsi="Cambria Math"/>
-                  </w:rPr>
-                  <m:t>M</m:t>
+                  <m:t>⧵M</m:t>
                 </m:r>
               </m:sub>
             </m:sSub>
@@ -10480,19 +9803,7 @@
         <w:keepNext/>
       </w:pPr>
       <w:r>
-        <w:t>For classification, the final hidden vector of the [CLS] token, h_CLS ∈ ℝ</w:t>
-      </w:r>
-      <w:r>
-        <w:t>ᵈ</w:t>
-      </w:r>
-      <w:r>
-        <w:t>, is used as the representation of the whole sentence. A new classification layer with weights W ∈ ℝ²ˣ</w:t>
-      </w:r>
-      <w:r>
-        <w:t>ᵈ</w:t>
-      </w:r>
-      <w:r>
-        <w:t xml:space="preserve"> and bias b is added on top:</w:t>
+        <w:t>For classification, the final hidden vector of the [CLS] token, h_CLS ∈ ℝᵈ, is used as the representation of the whole sentence. A new classification layer with weights W ∈ ℝ²ˣᵈ and bias b is added on top:</w:t>
       </w:r>
     </w:p>
     <w:p>
@@ -10508,55 +9819,7 @@
           <w:rPr>
             <w:rFonts w:ascii="Cambria Math" w:hAnsi="Cambria Math"/>
           </w:rPr>
-          <m:t>P</m:t>
-        </m:r>
-        <m:r>
-          <w:rPr>
-            <w:rFonts w:ascii="Cambria Math" w:hAnsi="Cambria Math"/>
-          </w:rPr>
-          <m:t>(</m:t>
-        </m:r>
-        <m:r>
-          <w:rPr>
-            <w:rFonts w:ascii="Cambria Math" w:hAnsi="Cambria Math"/>
-          </w:rPr>
-          <m:t>y</m:t>
-        </m:r>
-        <m:r>
-          <w:rPr>
-            <w:rFonts w:ascii="Cambria Math" w:hAnsi="Cambria Math"/>
-          </w:rPr>
-          <m:t>∣</m:t>
-        </m:r>
-        <m:r>
-          <w:rPr>
-            <w:rFonts w:ascii="Cambria Math" w:hAnsi="Cambria Math"/>
-          </w:rPr>
-          <m:t>x</m:t>
-        </m:r>
-        <m:r>
-          <w:rPr>
-            <w:rFonts w:ascii="Cambria Math" w:hAnsi="Cambria Math"/>
-          </w:rPr>
-          <m:t>)=</m:t>
-        </m:r>
-        <m:r>
-          <w:rPr>
-            <w:rFonts w:ascii="Cambria Math" w:hAnsi="Cambria Math"/>
-          </w:rPr>
-          <m:t>softmax</m:t>
-        </m:r>
-        <m:r>
-          <w:rPr>
-            <w:rFonts w:ascii="Cambria Math" w:hAnsi="Cambria Math"/>
-          </w:rPr>
-          <m:t>(</m:t>
-        </m:r>
-        <m:r>
-          <w:rPr>
-            <w:rFonts w:ascii="Cambria Math" w:hAnsi="Cambria Math"/>
-          </w:rPr>
-          <m:t>W</m:t>
+          <m:t>P(y∣x)=softmax(W</m:t>
         </m:r>
         <m:sSub>
           <m:sSubPr>
@@ -10587,19 +9850,7 @@
           <w:rPr>
             <w:rFonts w:ascii="Cambria Math" w:hAnsi="Cambria Math"/>
           </w:rPr>
-          <m:t>+</m:t>
-        </m:r>
-        <m:r>
-          <w:rPr>
-            <w:rFonts w:ascii="Cambria Math" w:hAnsi="Cambria Math"/>
-          </w:rPr>
-          <m:t>b</m:t>
-        </m:r>
-        <m:r>
-          <w:rPr>
-            <w:rFonts w:ascii="Cambria Math" w:hAnsi="Cambria Math"/>
-          </w:rPr>
-          <m:t>)</m:t>
+          <m:t>+b)</m:t>
         </m:r>
       </m:oMath>
       <w:r>
@@ -10701,13 +9952,7 @@
               <w:rPr>
                 <w:rFonts w:ascii="Cambria Math" w:hAnsi="Cambria Math"/>
               </w:rPr>
-              <m:t>i</m:t>
-            </m:r>
-            <m:r>
-              <w:rPr>
-                <w:rFonts w:ascii="Cambria Math" w:hAnsi="Cambria Math"/>
-              </w:rPr>
-              <m:t>=1</m:t>
+              <m:t>i=1</m:t>
             </m:r>
           </m:sub>
           <m:sup>
@@ -10723,19 +9968,7 @@
               <w:rPr>
                 <w:rFonts w:ascii="Cambria Math" w:hAnsi="Cambria Math"/>
               </w:rPr>
-              <m:t>log</m:t>
-            </m:r>
-            <m:r>
-              <w:rPr>
-                <w:rFonts w:ascii="Cambria Math" w:hAnsi="Cambria Math"/>
-              </w:rPr>
-              <m:t>P</m:t>
-            </m:r>
-            <m:r>
-              <w:rPr>
-                <w:rFonts w:ascii="Cambria Math" w:hAnsi="Cambria Math"/>
-              </w:rPr>
-              <m:t>(</m:t>
+              <m:t>logP(</m:t>
             </m:r>
             <m:sSub>
               <m:sSubPr>
@@ -10915,19 +10148,7 @@
               <w:rPr>
                 <w:rFonts w:ascii="Cambria Math" w:hAnsi="Cambria Math"/>
               </w:rPr>
-              <m:t>t</m:t>
-            </m:r>
-            <m:r>
-              <w:rPr>
-                <w:rFonts w:ascii="Cambria Math" w:hAnsi="Cambria Math"/>
-              </w:rPr>
-              <m:t>-</m:t>
-            </m:r>
-            <m:r>
-              <w:rPr>
-                <w:rFonts w:ascii="Cambria Math" w:hAnsi="Cambria Math"/>
-              </w:rPr>
-              <m:t>1</m:t>
+              <m:t>t-1</m:t>
             </m:r>
           </m:sub>
         </m:sSub>
@@ -11076,19 +10297,7 @@
               <w:rPr>
                 <w:rFonts w:ascii="Cambria Math" w:hAnsi="Cambria Math"/>
               </w:rPr>
-              <m:t>t</m:t>
-            </m:r>
-            <m:r>
-              <w:rPr>
-                <w:rFonts w:ascii="Cambria Math" w:hAnsi="Cambria Math"/>
-              </w:rPr>
-              <m:t>-</m:t>
-            </m:r>
-            <m:r>
-              <w:rPr>
-                <w:rFonts w:ascii="Cambria Math" w:hAnsi="Cambria Math"/>
-              </w:rPr>
-              <m:t>1</m:t>
+              <m:t>t-1</m:t>
             </m:r>
           </m:sub>
         </m:sSub>
@@ -11233,19 +10442,7 @@
               <w:rPr>
                 <w:rFonts w:ascii="Cambria Math" w:hAnsi="Cambria Math"/>
               </w:rPr>
-              <m:t>t</m:t>
-            </m:r>
-            <m:r>
-              <w:rPr>
-                <w:rFonts w:ascii="Cambria Math" w:hAnsi="Cambria Math"/>
-              </w:rPr>
-              <m:t>-</m:t>
-            </m:r>
-            <m:r>
-              <w:rPr>
-                <w:rFonts w:ascii="Cambria Math" w:hAnsi="Cambria Math"/>
-              </w:rPr>
-              <m:t>1</m:t>
+              <m:t>t-1</m:t>
             </m:r>
           </m:sub>
         </m:sSub>
@@ -11386,13 +10583,7 @@
               <w:rPr>
                 <w:rFonts w:ascii="Cambria Math" w:hAnsi="Cambria Math"/>
               </w:rPr>
-              <m:t>+</m:t>
-            </m:r>
-            <m:r>
-              <w:rPr>
-                <w:rFonts w:ascii="Cambria Math" w:hAnsi="Cambria Math"/>
-              </w:rPr>
-              <m:t>ϵ</m:t>
+              <m:t>+ϵ</m:t>
             </m:r>
           </m:den>
         </m:f>
@@ -11400,13 +10591,7 @@
           <w:rPr>
             <w:rFonts w:ascii="Cambria Math" w:hAnsi="Cambria Math"/>
           </w:rPr>
-          <m:t>+</m:t>
-        </m:r>
-        <m:r>
-          <w:rPr>
-            <w:rFonts w:ascii="Cambria Math" w:hAnsi="Cambria Math"/>
-          </w:rPr>
-          <m:t>λ</m:t>
+          <m:t>+λ</m:t>
         </m:r>
         <m:sSub>
           <m:sSubPr>
@@ -11429,19 +10614,7 @@
               <w:rPr>
                 <w:rFonts w:ascii="Cambria Math" w:hAnsi="Cambria Math"/>
               </w:rPr>
-              <m:t>t</m:t>
-            </m:r>
-            <m:r>
-              <w:rPr>
-                <w:rFonts w:ascii="Cambria Math" w:hAnsi="Cambria Math"/>
-              </w:rPr>
-              <m:t>-</m:t>
-            </m:r>
-            <m:r>
-              <w:rPr>
-                <w:rFonts w:ascii="Cambria Math" w:hAnsi="Cambria Math"/>
-              </w:rPr>
-              <m:t>1</m:t>
+              <m:t>t-1</m:t>
             </m:r>
           </m:sub>
         </m:sSub>
@@ -11466,10 +10639,7 @@
         <w:pStyle w:val="BDpagrindinistekstas"/>
       </w:pPr>
       <w:r>
-        <w:t xml:space="preserve">where m̂ₜ and v̂ₜ are bias-corrected moment estimates, λ = 0.01 is the weight decay and ηₜ is the learning rate. The learning rate follows a linear schedule: it grows from 0 to its peak value during the first 10% of steps (warm-up) and then decreases linearly to 0. Warm-up prevents large, destructive updates of the pre-trained weights at the beginning of training. Gradients are clipped to a maximum norm of 1.0. The hyper-parameters used are shown in Table 5; they follow the recommendations of Devlin et al. </w:t>
-      </w:r>
-      <w:r>
-        <w:t>(2019) and Sun et al. (2019), with a higher learning rate for the smallest models, which is usual for compact BERT variants.</w:t>
+        <w:t>where m̂ₜ and v̂ₜ are bias-corrected moment estimates, λ = 0.01 is the weight decay and ηₜ is the learning rate. The learning rate follows a linear schedule: it grows from 0 to its peak value during the first 10% of steps (warm-up) and then decreases linearly to 0. Warm-up prevents large, destructive updates of the pre-trained weights at the beginning of training. Gradients are clipped to a maximum norm of 1.0. The hyper-parameters used are shown in Table 5; they follow the recommendations of Devlin et al. (2019) and Sun et al. (2019), with a higher learning rate for the smallest models, which is usual for compact BERT variants.</w:t>
       </w:r>
     </w:p>
     <w:p>
@@ -11942,10 +11112,7 @@
               <w:jc w:val="center"/>
             </w:pPr>
             <w:r>
-              <w:t xml:space="preserve">32 </w:t>
-            </w:r>
-            <w:r>
-              <w:t>/ 64</w:t>
+              <w:t>32 / 64</w:t>
             </w:r>
           </w:p>
         </w:tc>
@@ -12109,10 +11276,7 @@
         <w:keepNext/>
       </w:pPr>
       <w:r>
-        <w:t xml:space="preserve">For the classical models every sentence is represented as a sparse vector of TF-IDF </w:t>
-      </w:r>
-      <w:r>
-        <w:t>weights of unigrams and bigrams:</w:t>
+        <w:t>For the classical models every sentence is represented as a sparse vector of TF-IDF weights of unigrams and bigrams:</w:t>
       </w:r>
     </w:p>
     <w:p>
@@ -12128,91 +11292,7 @@
           <w:rPr>
             <w:rFonts w:ascii="Cambria Math" w:hAnsi="Cambria Math"/>
           </w:rPr>
-          <m:t>tfidf</m:t>
-        </m:r>
-        <m:r>
-          <w:rPr>
-            <w:rFonts w:ascii="Cambria Math" w:hAnsi="Cambria Math"/>
-          </w:rPr>
-          <m:t>(</m:t>
-        </m:r>
-        <m:r>
-          <w:rPr>
-            <w:rFonts w:ascii="Cambria Math" w:hAnsi="Cambria Math"/>
-          </w:rPr>
-          <m:t>t</m:t>
-        </m:r>
-        <m:r>
-          <w:rPr>
-            <w:rFonts w:ascii="Cambria Math" w:hAnsi="Cambria Math"/>
-          </w:rPr>
-          <m:t>,</m:t>
-        </m:r>
-        <m:r>
-          <w:rPr>
-            <w:rFonts w:ascii="Cambria Math" w:hAnsi="Cambria Math"/>
-          </w:rPr>
-          <m:t>d</m:t>
-        </m:r>
-        <m:r>
-          <w:rPr>
-            <w:rFonts w:ascii="Cambria Math" w:hAnsi="Cambria Math"/>
-          </w:rPr>
-          <m:t>)=(1+</m:t>
-        </m:r>
-        <m:r>
-          <w:rPr>
-            <w:rFonts w:ascii="Cambria Math" w:hAnsi="Cambria Math"/>
-          </w:rPr>
-          <m:t>log</m:t>
-        </m:r>
-        <m:r>
-          <w:rPr>
-            <w:rFonts w:ascii="Cambria Math" w:hAnsi="Cambria Math"/>
-          </w:rPr>
-          <m:t>(</m:t>
-        </m:r>
-        <m:r>
-          <w:rPr>
-            <w:rFonts w:ascii="Cambria Math" w:hAnsi="Cambria Math"/>
-          </w:rPr>
-          <m:t>tf</m:t>
-        </m:r>
-        <m:r>
-          <w:rPr>
-            <w:rFonts w:ascii="Cambria Math" w:hAnsi="Cambria Math"/>
-          </w:rPr>
-          <m:t>(</m:t>
-        </m:r>
-        <m:r>
-          <w:rPr>
-            <w:rFonts w:ascii="Cambria Math" w:hAnsi="Cambria Math"/>
-          </w:rPr>
-          <m:t>t</m:t>
-        </m:r>
-        <m:r>
-          <w:rPr>
-            <w:rFonts w:ascii="Cambria Math" w:hAnsi="Cambria Math"/>
-          </w:rPr>
-          <m:t>,</m:t>
-        </m:r>
-        <m:r>
-          <w:rPr>
-            <w:rFonts w:ascii="Cambria Math" w:hAnsi="Cambria Math"/>
-          </w:rPr>
-          <m:t>d</m:t>
-        </m:r>
-        <m:r>
-          <w:rPr>
-            <w:rFonts w:ascii="Cambria Math" w:hAnsi="Cambria Math"/>
-          </w:rPr>
-          <m:t>)))·(</m:t>
-        </m:r>
-        <m:r>
-          <w:rPr>
-            <w:rFonts w:ascii="Cambria Math" w:hAnsi="Cambria Math"/>
-          </w:rPr>
-          <m:t>log</m:t>
+          <m:t>tfidf(t,d)=(1+log(tf(t,d)))·(log</m:t>
         </m:r>
         <m:f>
           <m:fPr>
@@ -12227,13 +11307,7 @@
               <w:rPr>
                 <w:rFonts w:ascii="Cambria Math" w:hAnsi="Cambria Math"/>
               </w:rPr>
-              <m:t>1+</m:t>
-            </m:r>
-            <m:r>
-              <w:rPr>
-                <w:rFonts w:ascii="Cambria Math" w:hAnsi="Cambria Math"/>
-              </w:rPr>
-              <m:t>N</m:t>
+              <m:t>1+N</m:t>
             </m:r>
           </m:num>
           <m:den>
@@ -12241,31 +11315,7 @@
               <w:rPr>
                 <w:rFonts w:ascii="Cambria Math" w:hAnsi="Cambria Math"/>
               </w:rPr>
-              <m:t>1+</m:t>
-            </m:r>
-            <m:r>
-              <w:rPr>
-                <w:rFonts w:ascii="Cambria Math" w:hAnsi="Cambria Math"/>
-              </w:rPr>
-              <m:t>df</m:t>
-            </m:r>
-            <m:r>
-              <w:rPr>
-                <w:rFonts w:ascii="Cambria Math" w:hAnsi="Cambria Math"/>
-              </w:rPr>
-              <m:t>(</m:t>
-            </m:r>
-            <m:r>
-              <w:rPr>
-                <w:rFonts w:ascii="Cambria Math" w:hAnsi="Cambria Math"/>
-              </w:rPr>
-              <m:t>t</m:t>
-            </m:r>
-            <m:r>
-              <w:rPr>
-                <w:rFonts w:ascii="Cambria Math" w:hAnsi="Cambria Math"/>
-              </w:rPr>
-              <m:t>)</m:t>
+              <m:t>1+df(t)</m:t>
             </m:r>
           </m:den>
         </m:f>
@@ -12306,10 +11356,7 @@
         <w:pStyle w:val="BDpagrindinistekstas"/>
       </w:pPr>
       <w:r>
-        <w:t xml:space="preserve">Multinomial naive Bayes applies Bayes’ theorem with the assumption that features are conditionally independent given the class: P(y | x) ∝ P(y) Πⱼ P(tⱼ | y)^(xⱼ), with Laplace (additive) </w:t>
-      </w:r>
-      <w:r>
-        <w:t>smoothing α = 0.5.</w:t>
+        <w:t>Multinomial naive Bayes applies Bayes’ theorem with the assumption that features are conditionally independent given the class: P(y | x) ∝ P(y) Πⱼ P(tⱼ | y)^(xⱼ), with Laplace (additive) smoothing α = 0.5.</w:t>
       </w:r>
     </w:p>
     <w:p>
@@ -12317,19 +11364,7 @@
         <w:pStyle w:val="BDpagrindinistekstas"/>
       </w:pPr>
       <w:r>
-        <w:t>Logistic regression models the probability of the positive class as P(y = 1 | x) = σ(w</w:t>
-      </w:r>
-      <w:r>
-        <w:t>ᵀ</w:t>
-      </w:r>
-      <w:r>
-        <w:t>x + b), where σ(z) = 1 / (1 + e⁻</w:t>
-      </w:r>
-      <w:r>
-        <w:t>ᶻ</w:t>
-      </w:r>
-      <w:r>
-        <w:t>), and minimises the L2-regularised log-loss (inverse regularisation strength C = 4).</w:t>
+        <w:t>Logistic regression models the probability of the positive class as P(y = 1 | x) = σ(wᵀx + b), where σ(z) = 1 / (1 + e⁻ᶻ), and minimises the L2-regularised log-loss (inverse regularisation strength C = 4).</w:t>
       </w:r>
     </w:p>
     <w:p>
@@ -12371,19 +11406,7 @@
               <w:rPr>
                 <w:rFonts w:ascii="Cambria Math" w:hAnsi="Cambria Math"/>
               </w:rPr>
-              <m:t>w</m:t>
-            </m:r>
-            <m:r>
-              <w:rPr>
-                <w:rFonts w:ascii="Cambria Math" w:hAnsi="Cambria Math"/>
-              </w:rPr>
-              <m:t>,</m:t>
-            </m:r>
-            <m:r>
-              <w:rPr>
-                <w:rFonts w:ascii="Cambria Math" w:hAnsi="Cambria Math"/>
-              </w:rPr>
-              <m:t>b</m:t>
+              <m:t>w,b</m:t>
             </m:r>
           </m:sub>
         </m:sSub>
@@ -12422,13 +11445,7 @@
           <w:rPr>
             <w:rFonts w:ascii="Cambria Math" w:hAnsi="Cambria Math"/>
           </w:rPr>
-          <m:t>‖</m:t>
-        </m:r>
-        <m:r>
-          <w:rPr>
-            <w:rFonts w:ascii="Cambria Math" w:hAnsi="Cambria Math"/>
-          </w:rPr>
-          <m:t>w</m:t>
+          <m:t>‖w</m:t>
         </m:r>
         <m:sSup>
           <m:sSupPr>
@@ -12459,13 +11476,7 @@
           <w:rPr>
             <w:rFonts w:ascii="Cambria Math" w:hAnsi="Cambria Math"/>
           </w:rPr>
-          <m:t>+</m:t>
-        </m:r>
-        <m:r>
-          <w:rPr>
-            <w:rFonts w:ascii="Cambria Math" w:hAnsi="Cambria Math"/>
-          </w:rPr>
-          <m:t>C</m:t>
+          <m:t>+C</m:t>
         </m:r>
         <m:nary>
           <m:naryPr>
@@ -12493,13 +11504,7 @@
               <w:rPr>
                 <w:rFonts w:ascii="Cambria Math" w:hAnsi="Cambria Math"/>
               </w:rPr>
-              <m:t>max</m:t>
-            </m:r>
-            <m:r>
-              <w:rPr>
-                <w:rFonts w:ascii="Cambria Math" w:hAnsi="Cambria Math"/>
-              </w:rPr>
-              <m:t>(0,1-</m:t>
+              <m:t>max(0,1-</m:t>
             </m:r>
             <m:sSub>
               <m:sSubPr>
@@ -12586,19 +11591,7 @@
               <w:rPr>
                 <w:rFonts w:ascii="Cambria Math" w:hAnsi="Cambria Math"/>
               </w:rPr>
-              <m:t>+</m:t>
-            </m:r>
-            <m:r>
-              <w:rPr>
-                <w:rFonts w:ascii="Cambria Math" w:hAnsi="Cambria Math"/>
-              </w:rPr>
-              <m:t>b</m:t>
-            </m:r>
-            <m:r>
-              <w:rPr>
-                <w:rFonts w:ascii="Cambria Math" w:hAnsi="Cambria Math"/>
-              </w:rPr>
-              <m:t>))</m:t>
+              <m:t>+b))</m:t>
             </m:r>
           </m:e>
         </m:nary>
@@ -12617,13 +11610,7 @@
         <w:pStyle w:val="BDpagrindinistekstas"/>
       </w:pPr>
       <w:r>
-        <w:t>with labels coded as y</w:t>
-      </w:r>
-      <w:r>
-        <w:t>ᵢ</w:t>
-      </w:r>
-      <w:r>
-        <w:t xml:space="preserve"> ∈ {−1, +1} and C = 0.5.</w:t>
+        <w:t>with labels coded as yᵢ ∈ {−1, +1} and C = 0.5.</w:t>
       </w:r>
     </w:p>
     <w:p>
@@ -12682,19 +11669,7 @@
           <w:rPr>
             <w:rFonts w:ascii="Cambria Math" w:hAnsi="Cambria Math"/>
           </w:rPr>
-          <m:t>=</m:t>
-        </m:r>
-        <m:r>
-          <w:rPr>
-            <w:rFonts w:ascii="Cambria Math" w:hAnsi="Cambria Math"/>
-          </w:rPr>
-          <m:t>σ</m:t>
-        </m:r>
-        <m:r>
-          <w:rPr>
-            <w:rFonts w:ascii="Cambria Math" w:hAnsi="Cambria Math"/>
-          </w:rPr>
-          <m:t>(</m:t>
+          <m:t>=σ(</m:t>
         </m:r>
         <m:sSub>
           <m:sSubPr>
@@ -12748,19 +11723,7 @@
               <w:rPr>
                 <w:rFonts w:ascii="Cambria Math" w:hAnsi="Cambria Math"/>
               </w:rPr>
-              <m:t>t</m:t>
-            </m:r>
-            <m:r>
-              <w:rPr>
-                <w:rFonts w:ascii="Cambria Math" w:hAnsi="Cambria Math"/>
-              </w:rPr>
-              <m:t>-</m:t>
-            </m:r>
-            <m:r>
-              <w:rPr>
-                <w:rFonts w:ascii="Cambria Math" w:hAnsi="Cambria Math"/>
-              </w:rPr>
-              <m:t>1</m:t>
+              <m:t>t-1</m:t>
             </m:r>
           </m:sub>
         </m:sSub>
@@ -12861,19 +11824,7 @@
           <w:rPr>
             <w:rFonts w:ascii="Cambria Math" w:hAnsi="Cambria Math"/>
           </w:rPr>
-          <m:t>=</m:t>
-        </m:r>
-        <m:r>
-          <w:rPr>
-            <w:rFonts w:ascii="Cambria Math" w:hAnsi="Cambria Math"/>
-          </w:rPr>
-          <m:t>σ</m:t>
-        </m:r>
-        <m:r>
-          <w:rPr>
-            <w:rFonts w:ascii="Cambria Math" w:hAnsi="Cambria Math"/>
-          </w:rPr>
-          <m:t>(</m:t>
+          <m:t>=σ(</m:t>
         </m:r>
         <m:sSub>
           <m:sSubPr>
@@ -12927,19 +11878,7 @@
               <w:rPr>
                 <w:rFonts w:ascii="Cambria Math" w:hAnsi="Cambria Math"/>
               </w:rPr>
-              <m:t>t</m:t>
-            </m:r>
-            <m:r>
-              <w:rPr>
-                <w:rFonts w:ascii="Cambria Math" w:hAnsi="Cambria Math"/>
-              </w:rPr>
-              <m:t>-</m:t>
-            </m:r>
-            <m:r>
-              <w:rPr>
-                <w:rFonts w:ascii="Cambria Math" w:hAnsi="Cambria Math"/>
-              </w:rPr>
-              <m:t>1</m:t>
+              <m:t>t-1</m:t>
             </m:r>
           </m:sub>
         </m:sSub>
@@ -13040,19 +11979,7 @@
           <w:rPr>
             <w:rFonts w:ascii="Cambria Math" w:hAnsi="Cambria Math"/>
           </w:rPr>
-          <m:t>=</m:t>
-        </m:r>
-        <m:r>
-          <w:rPr>
-            <w:rFonts w:ascii="Cambria Math" w:hAnsi="Cambria Math"/>
-          </w:rPr>
-          <m:t>σ</m:t>
-        </m:r>
-        <m:r>
-          <w:rPr>
-            <w:rFonts w:ascii="Cambria Math" w:hAnsi="Cambria Math"/>
-          </w:rPr>
-          <m:t>(</m:t>
+          <m:t>=σ(</m:t>
         </m:r>
         <m:sSub>
           <m:sSubPr>
@@ -13106,19 +12033,7 @@
               <w:rPr>
                 <w:rFonts w:ascii="Cambria Math" w:hAnsi="Cambria Math"/>
               </w:rPr>
-              <m:t>t</m:t>
-            </m:r>
-            <m:r>
-              <w:rPr>
-                <w:rFonts w:ascii="Cambria Math" w:hAnsi="Cambria Math"/>
-              </w:rPr>
-              <m:t>-</m:t>
-            </m:r>
-            <m:r>
-              <w:rPr>
-                <w:rFonts w:ascii="Cambria Math" w:hAnsi="Cambria Math"/>
-              </w:rPr>
-              <m:t>1</m:t>
+              <m:t>t-1</m:t>
             </m:r>
           </m:sub>
         </m:sSub>
@@ -13257,19 +12172,7 @@
           <w:rPr>
             <w:rFonts w:ascii="Cambria Math" w:hAnsi="Cambria Math"/>
           </w:rPr>
-          <m:t>=</m:t>
-        </m:r>
-        <m:r>
-          <w:rPr>
-            <w:rFonts w:ascii="Cambria Math" w:hAnsi="Cambria Math"/>
-          </w:rPr>
-          <m:t>tanh</m:t>
-        </m:r>
-        <m:r>
-          <w:rPr>
-            <w:rFonts w:ascii="Cambria Math" w:hAnsi="Cambria Math"/>
-          </w:rPr>
-          <m:t>(</m:t>
+          <m:t>=tanh(</m:t>
         </m:r>
         <m:sSub>
           <m:sSubPr>
@@ -13323,19 +12226,7 @@
               <w:rPr>
                 <w:rFonts w:ascii="Cambria Math" w:hAnsi="Cambria Math"/>
               </w:rPr>
-              <m:t>t</m:t>
-            </m:r>
-            <m:r>
-              <w:rPr>
-                <w:rFonts w:ascii="Cambria Math" w:hAnsi="Cambria Math"/>
-              </w:rPr>
-              <m:t>-</m:t>
-            </m:r>
-            <m:r>
-              <w:rPr>
-                <w:rFonts w:ascii="Cambria Math" w:hAnsi="Cambria Math"/>
-              </w:rPr>
-              <m:t>1</m:t>
+              <m:t>t-1</m:t>
             </m:r>
           </m:sub>
         </m:sSub>
@@ -13490,19 +12381,7 @@
               <w:rPr>
                 <w:rFonts w:ascii="Cambria Math" w:hAnsi="Cambria Math"/>
               </w:rPr>
-              <m:t>t</m:t>
-            </m:r>
-            <m:r>
-              <w:rPr>
-                <w:rFonts w:ascii="Cambria Math" w:hAnsi="Cambria Math"/>
-              </w:rPr>
-              <m:t>-</m:t>
-            </m:r>
-            <m:r>
-              <w:rPr>
-                <w:rFonts w:ascii="Cambria Math" w:hAnsi="Cambria Math"/>
-              </w:rPr>
-              <m:t>1</m:t>
+              <m:t>t-1</m:t>
             </m:r>
           </m:sub>
         </m:sSub>
@@ -13653,19 +12532,7 @@
           <w:rPr>
             <w:rFonts w:ascii="Cambria Math" w:hAnsi="Cambria Math"/>
           </w:rPr>
-          <m:t>⊙</m:t>
-        </m:r>
-        <m:r>
-          <w:rPr>
-            <w:rFonts w:ascii="Cambria Math" w:hAnsi="Cambria Math"/>
-          </w:rPr>
-          <m:t>tanh</m:t>
-        </m:r>
-        <m:r>
-          <w:rPr>
-            <w:rFonts w:ascii="Cambria Math" w:hAnsi="Cambria Math"/>
-          </w:rPr>
-          <m:t>(</m:t>
+          <m:t>⊙tanh(</m:t>
         </m:r>
         <m:sSub>
           <m:sSubPr>
@@ -13713,10 +12580,7 @@
         <w:pStyle w:val="BDpagrindinistekstas"/>
       </w:pPr>
       <w:r>
-        <w:t>The forget, input and output gates (fₜ, iₜ, oₜ) control what information is kept in the memory cell cₜ. A bidirectional LSTM runs one LSTM from left to right and another from right to left and concatenates their hidden states. The sentence representation is obtained by max-pooling over time, followed by dropout (p = 0.3) and a linear output layer. Embeddings (dimension 128) and all weights are initialised randomly, i.e. the model has no pre-trained knowledge. It is trained for 4 epochs with Adam (learning r</w:t>
-      </w:r>
-      <w:r>
-        <w:t>ate 0.001, batch size 64), and the epoch with the best dev accuracy is kept.</w:t>
+        <w:t>The forget, input and output gates (fₜ, iₜ, oₜ) control what information is kept in the memory cell cₜ. A bidirectional LSTM runs one LSTM from left to right and another from right to left and concatenates their hidden states. The sentence representation is obtained by max-pooling over time, followed by dropout (p = 0.3) and a linear output layer. Embeddings (dimension 128) and all weights are initialised randomly, i.e. the model has no pre-trained knowledge. It is trained for 4 epochs with Adam (learning rate 0.001, batch size 64), and the epoch with the best dev accuracy is kept.</w:t>
       </w:r>
     </w:p>
     <w:p>
@@ -13793,37 +12657,7 @@
               <w:rPr>
                 <w:rFonts w:ascii="Cambria Math" w:hAnsi="Cambria Math"/>
               </w:rPr>
-              <m:t>c</m:t>
-            </m:r>
-            <m:r>
-              <w:rPr>
-                <w:rFonts w:ascii="Cambria Math" w:hAnsi="Cambria Math"/>
-              </w:rPr>
-              <m:t>∈{</m:t>
-            </m:r>
-            <m:r>
-              <w:rPr>
-                <w:rFonts w:ascii="Cambria Math" w:hAnsi="Cambria Math"/>
-              </w:rPr>
-              <m:t>pos</m:t>
-            </m:r>
-            <m:r>
-              <w:rPr>
-                <w:rFonts w:ascii="Cambria Math" w:hAnsi="Cambria Math"/>
-              </w:rPr>
-              <m:t>,</m:t>
-            </m:r>
-            <m:r>
-              <w:rPr>
-                <w:rFonts w:ascii="Cambria Math" w:hAnsi="Cambria Math"/>
-              </w:rPr>
-              <m:t>neg</m:t>
-            </m:r>
-            <m:r>
-              <w:rPr>
-                <w:rFonts w:ascii="Cambria Math" w:hAnsi="Cambria Math"/>
-              </w:rPr>
-              <m:t>}</m:t>
+              <m:t>c∈{pos,neg}</m:t>
             </m:r>
           </m:lim>
         </m:limLow>
@@ -13831,49 +12665,7 @@
           <w:rPr>
             <w:rFonts w:ascii="Cambria Math" w:hAnsi="Cambria Math"/>
           </w:rPr>
-          <m:t>P</m:t>
-        </m:r>
-        <m:r>
-          <w:rPr>
-            <w:rFonts w:ascii="Cambria Math" w:hAnsi="Cambria Math"/>
-          </w:rPr>
-          <m:t>(</m:t>
-        </m:r>
-        <m:r>
-          <w:rPr>
-            <w:rFonts w:ascii="Cambria Math" w:hAnsi="Cambria Math"/>
-          </w:rPr>
-          <m:t>entailment</m:t>
-        </m:r>
-        <m:r>
-          <w:rPr>
-            <w:rFonts w:ascii="Cambria Math" w:hAnsi="Cambria Math"/>
-          </w:rPr>
-          <m:t>∣</m:t>
-        </m:r>
-        <m:r>
-          <w:rPr>
-            <w:rFonts w:ascii="Cambria Math" w:hAnsi="Cambria Math"/>
-          </w:rPr>
-          <m:t>x</m:t>
-        </m:r>
-        <m:r>
-          <w:rPr>
-            <w:rFonts w:ascii="Cambria Math" w:hAnsi="Cambria Math"/>
-          </w:rPr>
-          <m:t>,h(</m:t>
-        </m:r>
-        <m:r>
-          <w:rPr>
-            <w:rFonts w:ascii="Cambria Math" w:hAnsi="Cambria Math"/>
-          </w:rPr>
-          <m:t>c</m:t>
-        </m:r>
-        <m:r>
-          <w:rPr>
-            <w:rFonts w:ascii="Cambria Math" w:hAnsi="Cambria Math"/>
-          </w:rPr>
-          <m:t>))</m:t>
+          <m:t>P(entailment∣x,h(c))</m:t>
         </m:r>
       </m:oMath>
       <w:r>
@@ -13924,8 +12716,139 @@
           <w:rPr>
             <w:rFonts w:ascii="Cambria Math" w:hAnsi="Cambria Math"/>
           </w:rPr>
-          <m:t>Accuracy</m:t>
+          <m:t>Accuracy=</m:t>
         </m:r>
+        <m:f>
+          <m:fPr>
+            <m:ctrlPr>
+              <w:rPr>
+                <w:rFonts w:ascii="Cambria Math" w:hAnsi="Cambria Math"/>
+              </w:rPr>
+            </m:ctrlPr>
+          </m:fPr>
+          <m:num>
+            <m:r>
+              <w:rPr>
+                <w:rFonts w:ascii="Cambria Math" w:hAnsi="Cambria Math"/>
+              </w:rPr>
+              <m:t>TP+TN</m:t>
+            </m:r>
+          </m:num>
+          <m:den>
+            <m:r>
+              <w:rPr>
+                <w:rFonts w:ascii="Cambria Math" w:hAnsi="Cambria Math"/>
+              </w:rPr>
+              <m:t>TP+TN+FP+FN</m:t>
+            </m:r>
+          </m:den>
+        </m:f>
+        <m:r>
+          <w:rPr>
+            <w:rFonts w:ascii="Cambria Math" w:hAnsi="Cambria Math"/>
+          </w:rPr>
+          <m:t>,Precision=</m:t>
+        </m:r>
+        <m:f>
+          <m:fPr>
+            <m:ctrlPr>
+              <w:rPr>
+                <w:rFonts w:ascii="Cambria Math" w:hAnsi="Cambria Math"/>
+              </w:rPr>
+            </m:ctrlPr>
+          </m:fPr>
+          <m:num>
+            <m:r>
+              <w:rPr>
+                <w:rFonts w:ascii="Cambria Math" w:hAnsi="Cambria Math"/>
+              </w:rPr>
+              <m:t>TP</m:t>
+            </m:r>
+          </m:num>
+          <m:den>
+            <m:r>
+              <w:rPr>
+                <w:rFonts w:ascii="Cambria Math" w:hAnsi="Cambria Math"/>
+              </w:rPr>
+              <m:t>TP+FP</m:t>
+            </m:r>
+          </m:den>
+        </m:f>
+        <m:r>
+          <w:rPr>
+            <w:rFonts w:ascii="Cambria Math" w:hAnsi="Cambria Math"/>
+          </w:rPr>
+          <m:t>,Recall=</m:t>
+        </m:r>
+        <m:f>
+          <m:fPr>
+            <m:ctrlPr>
+              <w:rPr>
+                <w:rFonts w:ascii="Cambria Math" w:hAnsi="Cambria Math"/>
+              </w:rPr>
+            </m:ctrlPr>
+          </m:fPr>
+          <m:num>
+            <m:r>
+              <w:rPr>
+                <w:rFonts w:ascii="Cambria Math" w:hAnsi="Cambria Math"/>
+              </w:rPr>
+              <m:t>TP</m:t>
+            </m:r>
+          </m:num>
+          <m:den>
+            <m:r>
+              <w:rPr>
+                <w:rFonts w:ascii="Cambria Math" w:hAnsi="Cambria Math"/>
+              </w:rPr>
+              <m:t>TP+FN</m:t>
+            </m:r>
+          </m:den>
+        </m:f>
+      </m:oMath>
+      <w:r>
+        <w:rPr>
+          <w:i w:val="0"/>
+          <w:sz w:val="24"/>
+        </w:rPr>
+        <w:tab/>
+        <w:t>(19)</w:t>
+      </w:r>
+    </w:p>
+    <w:p>
+      <w:pPr>
+        <w:pStyle w:val="BDformule"/>
+        <w:spacing w:before="60"/>
+      </w:pPr>
+      <w:r>
+        <w:tab/>
+      </w:r>
+      <m:oMath>
+        <m:sSub>
+          <m:sSubPr>
+            <m:ctrlPr>
+              <w:rPr>
+                <w:rFonts w:ascii="Cambria Math" w:hAnsi="Cambria Math"/>
+              </w:rPr>
+            </m:ctrlPr>
+          </m:sSubPr>
+          <m:e>
+            <m:r>
+              <w:rPr>
+                <w:rFonts w:ascii="Cambria Math" w:hAnsi="Cambria Math"/>
+              </w:rPr>
+              <m:t>F</m:t>
+            </m:r>
+          </m:e>
+          <m:sub>
+            <m:r>
+              <w:rPr>
+                <w:rFonts w:ascii="Cambria Math" w:hAnsi="Cambria Math"/>
+              </w:rPr>
+              <m:t>1</m:t>
+            </m:r>
+          </m:sub>
+        </m:sSub>
         <m:r>
           <w:rPr>
             <w:rFonts w:ascii="Cambria Math" w:hAnsi="Cambria Math"/>
@@ -13945,19 +12868,7 @@
               <w:rPr>
                 <w:rFonts w:ascii="Cambria Math" w:hAnsi="Cambria Math"/>
               </w:rPr>
-              <m:t>TP</m:t>
-            </m:r>
-            <m:r>
-              <w:rPr>
-                <w:rFonts w:ascii="Cambria Math" w:hAnsi="Cambria Math"/>
-              </w:rPr>
-              <m:t>+</m:t>
-            </m:r>
-            <m:r>
-              <w:rPr>
-                <w:rFonts w:ascii="Cambria Math" w:hAnsi="Cambria Math"/>
-              </w:rPr>
-              <m:t>TN</m:t>
+              <m:t>2·Precision·Recall</m:t>
             </m:r>
           </m:num>
           <m:den>
@@ -13965,153 +12876,7 @@
               <w:rPr>
                 <w:rFonts w:ascii="Cambria Math" w:hAnsi="Cambria Math"/>
               </w:rPr>
-              <m:t>TP</m:t>
-            </m:r>
-            <m:r>
-              <w:rPr>
-                <w:rFonts w:ascii="Cambria Math" w:hAnsi="Cambria Math"/>
-              </w:rPr>
-              <m:t>+</m:t>
-            </m:r>
-            <m:r>
-              <w:rPr>
-                <w:rFonts w:ascii="Cambria Math" w:hAnsi="Cambria Math"/>
-              </w:rPr>
-              <m:t>TN</m:t>
-            </m:r>
-            <m:r>
-              <w:rPr>
-                <w:rFonts w:ascii="Cambria Math" w:hAnsi="Cambria Math"/>
-              </w:rPr>
-              <m:t>+</m:t>
-            </m:r>
-            <m:r>
-              <w:rPr>
-                <w:rFonts w:ascii="Cambria Math" w:hAnsi="Cambria Math"/>
-              </w:rPr>
-              <m:t>FP</m:t>
-            </m:r>
-            <m:r>
-              <w:rPr>
-                <w:rFonts w:ascii="Cambria Math" w:hAnsi="Cambria Math"/>
-              </w:rPr>
-              <m:t>+</m:t>
-            </m:r>
-            <m:r>
-              <w:rPr>
-                <w:rFonts w:ascii="Cambria Math" w:hAnsi="Cambria Math"/>
-              </w:rPr>
-              <m:t>FN</m:t>
-            </m:r>
-          </m:den>
-        </m:f>
-        <m:r>
-          <w:rPr>
-            <w:rFonts w:ascii="Cambria Math" w:hAnsi="Cambria Math"/>
-          </w:rPr>
-          <m:t>,</m:t>
-        </m:r>
-        <m:r>
-          <w:rPr>
-            <w:rFonts w:ascii="Cambria Math" w:hAnsi="Cambria Math"/>
-          </w:rPr>
-          <m:t>Precision</m:t>
-        </m:r>
-        <m:r>
-          <w:rPr>
-            <w:rFonts w:ascii="Cambria Math" w:hAnsi="Cambria Math"/>
-          </w:rPr>
-          <m:t>=</m:t>
-        </m:r>
-        <m:f>
-          <m:fPr>
-            <m:ctrlPr>
-              <w:rPr>
-                <w:rFonts w:ascii="Cambria Math" w:hAnsi="Cambria Math"/>
-              </w:rPr>
-            </m:ctrlPr>
-          </m:fPr>
-          <m:num>
-            <m:r>
-              <w:rPr>
-                <w:rFonts w:ascii="Cambria Math" w:hAnsi="Cambria Math"/>
-              </w:rPr>
-              <m:t>TP</m:t>
-            </m:r>
-          </m:num>
-          <m:den>
-            <m:r>
-              <w:rPr>
-                <w:rFonts w:ascii="Cambria Math" w:hAnsi="Cambria Math"/>
-              </w:rPr>
-              <m:t>TP</m:t>
-            </m:r>
-            <m:r>
-              <w:rPr>
-                <w:rFonts w:ascii="Cambria Math" w:hAnsi="Cambria Math"/>
-              </w:rPr>
-              <m:t>+</m:t>
-            </m:r>
-            <m:r>
-              <w:rPr>
-                <w:rFonts w:ascii="Cambria Math" w:hAnsi="Cambria Math"/>
-              </w:rPr>
-              <m:t>FP</m:t>
-            </m:r>
-          </m:den>
-        </m:f>
-        <m:r>
-          <w:rPr>
-            <w:rFonts w:ascii="Cambria Math" w:hAnsi="Cambria Math"/>
-          </w:rPr>
-          <m:t>,</m:t>
-        </m:r>
-        <m:r>
-          <w:rPr>
-            <w:rFonts w:ascii="Cambria Math" w:hAnsi="Cambria Math"/>
-          </w:rPr>
-          <m:t>Recall</m:t>
-        </m:r>
-        <m:r>
-          <w:rPr>
-            <w:rFonts w:ascii="Cambria Math" w:hAnsi="Cambria Math"/>
-          </w:rPr>
-          <m:t>=</m:t>
-        </m:r>
-        <m:f>
-          <m:fPr>
-            <m:ctrlPr>
-              <w:rPr>
-                <w:rFonts w:ascii="Cambria Math" w:hAnsi="Cambria Math"/>
-              </w:rPr>
-            </m:ctrlPr>
-          </m:fPr>
-          <m:num>
-            <m:r>
-              <w:rPr>
-                <w:rFonts w:ascii="Cambria Math" w:hAnsi="Cambria Math"/>
-              </w:rPr>
-              <m:t>TP</m:t>
-            </m:r>
-          </m:num>
-          <m:den>
-            <m:r>
-              <w:rPr>
-                <w:rFonts w:ascii="Cambria Math" w:hAnsi="Cambria Math"/>
-              </w:rPr>
-              <m:t>TP</m:t>
-            </m:r>
-            <m:r>
-              <w:rPr>
-                <w:rFonts w:ascii="Cambria Math" w:hAnsi="Cambria Math"/>
-              </w:rPr>
-              <m:t>+</m:t>
-            </m:r>
-            <m:r>
-              <w:rPr>
-                <w:rFonts w:ascii="Cambria Math" w:hAnsi="Cambria Math"/>
-              </w:rPr>
-              <m:t>FN</m:t>
+              <m:t>Precision+Recall</m:t>
             </m:r>
           </m:den>
         </m:f>
@@ -14122,111 +12887,6 @@
           <w:sz w:val="24"/>
         </w:rPr>
         <w:tab/>
-        <w:t>(19)</w:t>
-      </w:r>
-    </w:p>
-    <w:p>
-      <w:pPr>
-        <w:pStyle w:val="BDformule"/>
-        <w:spacing w:before="60"/>
-      </w:pPr>
-      <w:r>
-        <w:tab/>
-      </w:r>
-      <m:oMath>
-        <m:sSub>
-          <m:sSubPr>
-            <m:ctrlPr>
-              <w:rPr>
-                <w:rFonts w:ascii="Cambria Math" w:hAnsi="Cambria Math"/>
-              </w:rPr>
-            </m:ctrlPr>
-          </m:sSubPr>
-          <m:e>
-            <m:r>
-              <w:rPr>
-                <w:rFonts w:ascii="Cambria Math" w:hAnsi="Cambria Math"/>
-              </w:rPr>
-              <m:t>F</m:t>
-            </m:r>
-          </m:e>
-          <m:sub>
-            <m:r>
-              <w:rPr>
-                <w:rFonts w:ascii="Cambria Math" w:hAnsi="Cambria Math"/>
-              </w:rPr>
-              <m:t>1</m:t>
-            </m:r>
-          </m:sub>
-        </m:sSub>
-        <m:r>
-          <w:rPr>
-            <w:rFonts w:ascii="Cambria Math" w:hAnsi="Cambria Math"/>
-          </w:rPr>
-          <m:t>=</m:t>
-        </m:r>
-        <m:f>
-          <m:fPr>
-            <m:ctrlPr>
-              <w:rPr>
-                <w:rFonts w:ascii="Cambria Math" w:hAnsi="Cambria Math"/>
-              </w:rPr>
-            </m:ctrlPr>
-          </m:fPr>
-          <m:num>
-            <m:r>
-              <w:rPr>
-                <w:rFonts w:ascii="Cambria Math" w:hAnsi="Cambria Math"/>
-              </w:rPr>
-              <m:t>2·</m:t>
-            </m:r>
-            <m:r>
-              <w:rPr>
-                <w:rFonts w:ascii="Cambria Math" w:hAnsi="Cambria Math"/>
-              </w:rPr>
-              <m:t>Precision</m:t>
-            </m:r>
-            <m:r>
-              <w:rPr>
-                <w:rFonts w:ascii="Cambria Math" w:hAnsi="Cambria Math"/>
-              </w:rPr>
-              <m:t>·</m:t>
-            </m:r>
-            <m:r>
-              <w:rPr>
-                <w:rFonts w:ascii="Cambria Math" w:hAnsi="Cambria Math"/>
-              </w:rPr>
-              <m:t>Recall</m:t>
-            </m:r>
-          </m:num>
-          <m:den>
-            <m:r>
-              <w:rPr>
-                <w:rFonts w:ascii="Cambria Math" w:hAnsi="Cambria Math"/>
-              </w:rPr>
-              <m:t>Precision</m:t>
-            </m:r>
-            <m:r>
-              <w:rPr>
-                <w:rFonts w:ascii="Cambria Math" w:hAnsi="Cambria Math"/>
-              </w:rPr>
-              <m:t>+</m:t>
-            </m:r>
-            <m:r>
-              <w:rPr>
-                <w:rFonts w:ascii="Cambria Math" w:hAnsi="Cambria Math"/>
-              </w:rPr>
-              <m:t>Recall</m:t>
-            </m:r>
-          </m:den>
-        </m:f>
-      </m:oMath>
-      <w:r>
-        <w:rPr>
-          <w:i w:val="0"/>
-          <w:sz w:val="24"/>
-        </w:rPr>
-        <w:tab/>
         <w:t>(20)</w:t>
       </w:r>
     </w:p>
@@ -14243,10 +12903,7 @@
         <w:pStyle w:val="BDpagrindinistekstas"/>
       </w:pPr>
       <w:r>
-        <w:t>The test set contains only 872 sentences, so a difference of one percentage point corresponds to about nine sentences. To quantify uncertainty, 95% confidence intervals of accuracy are estimated with the bootstrap: the test set is resampled with replacement 2,000 times, accuracy is computed for each resample, and the 2.5th and 97.5th percentiles are taken. To test whether two models differ significantly, McNemar’s test is applied to their paired predictions. If b is the number of sentences classified correc</w:t>
-      </w:r>
-      <w:r>
-        <w:t>tly only by model A and c the number classified correctly only by model B, then under the null hypothesis of equal accuracy b ~ Binomial(b + c, 0.5). We use the exact binomial version of the test, with significance level 0.05.</w:t>
+        <w:t>The test set contains only 872 sentences, so a difference of one percentage point corresponds to about nine sentences. To quantify uncertainty, 95% confidence intervals of accuracy are estimated with the bootstrap: the test set is resampled with replacement 2,000 times, accuracy is computed for each resample, and the 2.5th and 97.5th percentiles are taken. To test whether two models differ significantly, McNemar’s test is applied to their paired predictions. If b is the number of sentences classified correctly only by model A and c the number classified correctly only by model B, then under the null hypothesis of equal accuracy b ~ Binomial(b + c, 0.5). We use the exact binomial version of the test, with significance level 0.05.</w:t>
       </w:r>
     </w:p>
     <w:p>
@@ -14264,10 +12921,7 @@
         <w:pStyle w:val="BDpagrindinistekstas"/>
       </w:pPr>
       <w:r>
-        <w:t>The experiment follows a fixed protocol so that all competitors are treated equally. (1) The data splits are created once and stored; every model reads the same CSV files. (2) Model selection uses only the dev set: the epoch with the highest dev accuracy is kept, and the test set is used exactly once per model for the final evaluation. (3) For the learning-curve experiment, the subsets of 500–8,000 training sentences are drawn with the same random seed for the classical and the Transformer model, so both le</w:t>
-      </w:r>
-      <w:r>
-        <w:t>arn from exactly the same examples. (4) Models are executed one after another on an otherwise idle computer, so that the measured training and inference times are not distorted by parallel jobs. (5) All hyper-parameters are fixed in advance from the literature and are not tuned on the test set.</w:t>
+        <w:t>The experiment follows a fixed protocol so that all competitors are treated equally. (1) The data splits are created once and stored; every model reads the same CSV files. (2) Model selection uses only the dev set: the epoch with the highest dev accuracy is kept, and the test set is used exactly once per model for the final evaluation. (3) For the learning-curve experiment, the subsets of 500–8,000 training sentences are drawn with the same random seed for the classical and the Transformer model, so both learn from exactly the same examples. (4) Models are executed one after another on an otherwise idle computer, so that the measured training and inference times are not distorted by parallel jobs. (5) All hyper-parameters are fixed in advance from the literature and are not tuned on the test set.</w:t>
       </w:r>
     </w:p>
     <w:p>
@@ -14275,10 +12929,7 @@
         <w:pStyle w:val="BDpagrindinistekstas"/>
       </w:pPr>
       <w:r>
-        <w:t>Several threats to validity should be kept in mind when interpreting the results. Internal validity: each configuration was trained once with one random seed, therefore small differences (below about one percentage point) may be caused by random variation; the bootstrap intervals and McNemar tests are used to judge which differences are reliable. Construct validity: the negation and contrast subsets are defined by simple keyword rules, which capture most but not all such constructions. External validity: th</w:t>
-      </w:r>
-      <w:r>
-        <w:t>e results are obtained on English movie-review sentences; for other domains or for morphologically rich languages such as Lithuanian the absolute numbers will differ, although the relative behaviour of the model families is expected to be similar, as suggested by the Lithuanian studies reviewed in Chapter 1. Finally, the timing results depend on the hardware: on a GPU the training times of the Transformer models would be one to two orders of magnitude shorter, while the classical models would gain little.</w:t>
+        <w:t>Several threats to validity should be kept in mind when interpreting the results. Internal validity: each configuration was trained once with one random seed, therefore small differences (below about one percentage point) may be caused by random variation; the bootstrap intervals and McNemar tests are used to judge which differences are reliable. Construct validity: the negation and contrast subsets are defined by simple keyword rules, which capture most but not all such constructions. External validity: the results are obtained on English movie-review sentences; for other domains or for morphologically rich languages such as Lithuanian the absolute numbers will differ, although the relative behaviour of the model families is expected to be similar, as suggested by the Lithuanian studies reviewed in Chapter 1. Finally, the timing results depend on the hardware: on a GPU the training times of the Transformer models would be one to two orders of magnitude shorter, while the classical models would gain little.</w:t>
       </w:r>
     </w:p>
     <w:p>
@@ -14308,13 +12959,7 @@
         <w:pStyle w:val="BDpagrindinistekstas"/>
       </w:pPr>
       <w:r>
-        <w:t>The program described in Section 2.5 was implemented in Python 3.11 with PyTorch 2 (CPU build), Hugging Face Transformers and Datasets, scikit-learn and Matplotlib; it consists of about 770 lines of code in nine scripts and is published in the project repository (Appendix A). The data preparation script downloads SST-2 from the Hugging Face Hub and creates the three splits of Table 3. The classical baselines are scikit-learn pipelines (TF-IDF vectoriser followed by the classifier). The BiLSTM is a custom Py</w:t>
-      </w:r>
-      <w:r>
-        <w:t>Torch module with its own tokeniser and vocabulary of the words occurring at least twice in the training data. The core of the work is the generic fine-tuning script: it loads any pre-trained encoder and its tokeniser by name, adds a two-class classification head, pads every batch dynamically to its longest sentence, and runs the training loop with AdamW, linear warm-up and decay, gradient clipping and selection of the best epoch on the dev set. The ready-made models are evaluated through the Transformers p</w:t>
-      </w:r>
-      <w:r>
-        <w:t>ipeline interface, and the zero-shot model through the zero-shot-classification pipeline with the hypothesis template of Section 2.7.7.</w:t>
+        <w:t>The program described in Section 2.5 was implemented in Python 3.11 with PyTorch 2 (CPU build), Hugging Face Transformers and Datasets, scikit-learn and Matplotlib; it consists of about 770 lines of code in nine scripts and is published in the project repository (Appendix A). The data preparation script downloads SST-2 from the Hugging Face Hub and creates the three splits of Table 3. The classical baselines are scikit-learn pipelines (TF-IDF vectoriser followed by the classifier). The BiLSTM is a custom PyTorch module with its own tokeniser and vocabulary of the words occurring at least twice in the training data. The core of the work is the generic fine-tuning script: it loads any pre-trained encoder and its tokeniser by name, adds a two-class classification head, pads every batch dynamically to its longest sentence, and runs the training loop with AdamW, linear warm-up and decay, gradient clipping and selection of the best epoch on the dev set. The ready-made models are evaluated through the Transformers pipeline interface, and the zero-shot model through the zero-shot-classification pipeline with the hypothesis template of Section 2.7.7.</w:t>
       </w:r>
     </w:p>
     <w:p>
@@ -14322,10 +12967,7 @@
         <w:pStyle w:val="BDpagrindinistekstas"/>
       </w:pPr>
       <w:r>
-        <w:t xml:space="preserve">During development two practical problems had to be solved. The newest version of the Datasets library requires full repository names, so SST-2 is loaded as nyu-mll/glue. The compact BERT models of Turc et al. (2019) published by third parties on the Hub lacked tokenizer files compatible with the current library version, therefore the official Google checkpoints (google/bert_uncased_L-2_H-128_A-2 and L-4_H-512_A-8) were used. The whole pipeline is started by one command (run_all.sh) and executes all models </w:t>
-      </w:r>
-      <w:r>
-        <w:t>one after another; every result is saved as a JSON file, from which the report script generates all tables and figures of this chapter.</w:t>
+        <w:t>During development two practical problems had to be solved. The newest version of the Datasets library requires full repository names, so SST-2 is loaded as nyu-mll/glue. The compact BERT models of Turc et al. (2019) published by third parties on the Hub lacked tokenizer files compatible with the current library version, therefore the official Google checkpoints (google/bert_uncased_L-2_H-128_A-2 and L-4_H-512_A-8) were used. The whole pipeline is started by one command (run_all.sh) and executes all models one after another; every result is saved as a JSON file, from which the report script generates all tables and figures of this chapter.</w:t>
       </w:r>
     </w:p>
     <w:p>
@@ -14343,10 +12985,7 @@
         <w:pStyle w:val="BDpagrindinistekstas"/>
       </w:pPr>
       <w:r>
-        <w:t xml:space="preserve">The results of all ten models on the 872 test sentences are given in Table 6 and Fig. 3. Because the classes are almost balanced, accuracy and </w:t>
-      </w:r>
-      <w:r>
-        <w:t>macro F1 differ by less than 0.2 percentage points (p.p.), so accuracy is used in the discussion.</w:t>
+        <w:t>The results of all ten models on the 872 test sentences are given in Table 6 and Fig. 3. Because the classes are almost balanced, accuracy and macro F1 differ by less than 0.2 percentage points (p.p.), so accuracy is used in the discussion.</w:t>
       </w:r>
     </w:p>
     <w:p>
@@ -14569,13 +13208,7 @@
               <w:rPr>
                 <w:b/>
               </w:rPr>
-              <w:t xml:space="preserve">Train </w:t>
-            </w:r>
-            <w:r>
-              <w:rPr>
-                <w:b/>
-              </w:rPr>
-              <w:t>time, s</w:t>
+              <w:t>Train time, s</w:t>
             </w:r>
           </w:p>
         </w:tc>
@@ -15871,7 +14504,7 @@
                     <pic:cNvPicPr/>
                   </pic:nvPicPr>
                   <pic:blipFill>
-                    <a:blip r:embed="rId14"/>
+                    <a:blip r:embed="rId12"/>
                     <a:stretch>
                       <a:fillRect/>
                     </a:stretch>
@@ -15963,13 +14596,7 @@
         <w:pStyle w:val="BDpagrindinistekstas"/>
       </w:pPr>
       <w:r>
-        <w:t xml:space="preserve">Three groups can be </w:t>
-      </w:r>
-      <w:r>
-        <w:t>distinguished. The best results were obtained by the DistilBERT models: the publicly available model that its authors fine-tuned on the full SST-2 training set reached 91.1%, and the DistilBERT that we fine-tuned ourselves on only 8,000 sentences reached 88.8%. The out-of-domain Twitter-RoBERTa (85.8%) and our fine-tuned BERT-small (83.7%) form the middle group. The classical models, the BiLSTM and the zero-shot model are clustered in a narrow band between 81.8% and 82.9%. The smallest Transformer, BERT-tin</w:t>
-      </w:r>
-      <w:r>
-        <w:t>y with only 4.4 million parameters, was the weakest model (76.6%), which shows that a Transformer is not automatically better: its capacity must be sufficient for the task.</w:t>
+        <w:t>Three groups can be distinguished. The best results were obtained by the DistilBERT models: the publicly available model that its authors fine-tuned on the full SST-2 training set reached 91.1%, and the DistilBERT that we fine-tuned ourselves on only 8,000 sentences reached 88.8%. The out-of-domain Twitter-RoBERTa (85.8%) and our fine-tuned BERT-small (83.7%) form the middle group. The classical models, the BiLSTM and the zero-shot model are clustered in a narrow band between 81.8% and 82.9%. The smallest Transformer, BERT-tiny with only 4.4 million parameters, was the weakest model (76.6%), which shows that a Transformer is not automatically better: its capacity must be sufficient for the task.</w:t>
       </w:r>
     </w:p>
     <w:p>
@@ -15977,13 +14604,7 @@
         <w:pStyle w:val="BDpagrindinistekstas"/>
       </w:pPr>
       <w:r>
-        <w:t>Table 7 shows how reliable these differences are. With 872 test sentences the 95% bootstrap confidence intervals are about ±2.5 p.p. wide. All models are significantly worse than the best one (McNemar p &lt; 0.05), including our fine-tuned DistilBERT (p = 0.029), which was trained on eight times less data. Pairwise tests against the best classical model (TF-IDF + linear SVM) show that our fine-tuned DistilBERT is significantly better: it correctly classifies 104 sentences that the SVM misses, while the opposit</w:t>
-      </w:r>
-      <w:r>
-        <w:t>e happens for only 53 sentences (p &lt; 0.001). In contrast, the differences between BERT-small and the SVM (71 vs 64 sentences, p = 0.61), between the BiLSTM and the SVM (p = 1.0) and between the zero-shot model and logistic regression (p = 1.0) are not statistically significant. The answer to RQ1 is therefore: a sufficiently large pre-trained Transformer improves accuracy by about 6 p.p. over the best classical and recurrent models, even when trained on far fewer labelled examples, whereas compact Transforme</w:t>
-      </w:r>
-      <w:r>
-        <w:t>rs only match the classical baselines.</w:t>
+        <w:t>Table 7 shows how reliable these differences are. With 872 test sentences the 95% bootstrap confidence intervals are about ±2.5 p.p. wide. All models are significantly worse than the best one (McNemar p &lt; 0.05), including our fine-tuned DistilBERT (p = 0.029), which was trained on eight times less data. Pairwise tests against the best classical model (TF-IDF + linear SVM) show that our fine-tuned DistilBERT is significantly better: it correctly classifies 104 sentences that the SVM misses, while the opposite happens for only 53 sentences (p &lt; 0.001). In contrast, the differences between BERT-small and the SVM (71 vs 64 sentences, p = 0.61), between the BiLSTM and the SVM (p = 1.0) and between the zero-shot model and logistic regression (p = 1.0) are not statistically significant. The answer to RQ1 is therefore: a sufficiently large pre-trained Transformer improves accuracy by about 6 p.p. over the best classical and recurrent models, even when trained on far fewer labelled examples, whereas compact Transformers only match the classical baselines.</w:t>
       </w:r>
     </w:p>
     <w:p>
@@ -16775,10 +15396,7 @@
               <w:keepNext/>
             </w:pPr>
             <w:r>
-              <w:t xml:space="preserve">TF-IDF + Naive </w:t>
-            </w:r>
-            <w:r>
-              <w:t>Bayes</w:t>
+              <w:t>TF-IDF + Naive Bayes</w:t>
             </w:r>
           </w:p>
         </w:tc>
@@ -17150,10 +15768,7 @@
       </w:pPr>
       <w:r>
         <w:lastRenderedPageBreak/>
-        <w:t xml:space="preserve">The BiLSTM trained from </w:t>
-      </w:r>
-      <w:r>
-        <w:t>scratch reached 82.8%, practically identical to the TF-IDF models, although its training took 100–200 times longer. This agrees with the finding of Kapočiūtė-Dzikienė et al. (2019) for Lithuanian that neural networks without pre-training do not outperform well-tuned classical methods. The BiLSTM also showed clear overfitting to the training distribution: its dev accuracy (91.3%, measured on short phrases from the training distribution) was much higher than its test accuracy on complete sentences.</w:t>
+        <w:t>The BiLSTM trained from scratch reached 82.8%, practically identical to the TF-IDF models, although its training took 100–200 times longer. This agrees with the finding of Kapočiūtė-Dzikienė et al. (2019) for Lithuanian that neural networks without pre-training do not outperform well-tuned classical methods. The BiLSTM also showed clear overfitting to the training distribution: its dev accuracy (91.3%, measured on short phrases from the training distribution) was much higher than its test accuracy on complete sentences.</w:t>
       </w:r>
     </w:p>
     <w:p>
@@ -17171,10 +15786,7 @@
         <w:pStyle w:val="BDpagrindinistekstas"/>
       </w:pPr>
       <w:r>
-        <w:t>Fig. 4 relates accuracy to inference latency (RQ2). The classical models classify a sentence in about 0.05 ms and train in 2–4 seconds on all 65 thousand sentences. The BiLSTM needs 0.45 ms per sentence and 6 minutes of training. The fine-tuned Transformers are slower by two to three orders of magnitude: BERT-tiny needs 1.2 ms, BERT-small 14 ms and DistilBERT 39 ms per sentence, and the larger ready-made models 45–107 ms. The zero-shot model is the slowest because it must process every sentence once for eac</w:t>
-      </w:r>
-      <w:r>
-        <w:t>h candidate label.</w:t>
+        <w:t>Fig. 4 relates accuracy to inference latency (RQ2). The classical models classify a sentence in about 0.05 ms and train in 2–4 seconds on all 65 thousand sentences. The BiLSTM needs 0.45 ms per sentence and 6 minutes of training. The fine-tuned Transformers are slower by two to three orders of magnitude: BERT-tiny needs 1.2 ms, BERT-small 14 ms and DistilBERT 39 ms per sentence, and the larger ready-made models 45–107 ms. The zero-shot model is the slowest because it must process every sentence once for each candidate label.</w:t>
       </w:r>
     </w:p>
     <w:p>
@@ -17199,7 +15811,7 @@
                     <pic:cNvPicPr/>
                   </pic:nvPicPr>
                   <pic:blipFill>
-                    <a:blip r:embed="rId15"/>
+                    <a:blip r:embed="rId13"/>
                     <a:stretch>
                       <a:fillRect/>
                     </a:stretch>
@@ -17291,10 +15903,7 @@
         <w:pStyle w:val="BDpagrindinistekstas"/>
       </w:pPr>
       <w:r>
-        <w:t>Fine-tuning on the laptop CPU took 2 minutes for BERT-tiny, 26 minutes for BERT-small and about 2.6 hours for DistilBERT (8,000 sentences, 2–3 epochs). These times should be read as upper bounds: the laptop was also used for other tasks while the longest runs were executing, which slowed them down. Even so, the conclusion is clear: on a CPU, a compact or distilled Transformer can be fine-tuned within hours, and its inference speed (about 25 sentences per second for DistilBERT) is sufficient for most interac</w:t>
-      </w:r>
-      <w:r>
-        <w:t>tive applications, but not for very high-volume streams, where TF-IDF models remain hundreds of times cheaper. In terms of size, the TF-IDF models have about 74 thousand weights (one per n-gram), the BiLSTM 2 million parameters, and the Transformers 4.4–125 million parameters (17–500 MB of memory in 32-bit precision).</w:t>
+        <w:t>Fine-tuning on the laptop CPU took 2 minutes for BERT-tiny, 26 minutes for BERT-small and about 2.6 hours for DistilBERT (8,000 sentences, 2–3 epochs). These times should be read as upper bounds: the laptop was also used for other tasks while the longest runs were executing, which slowed them down. Even so, the conclusion is clear: on a CPU, a compact or distilled Transformer can be fine-tuned within hours, and its inference speed (about 25 sentences per second for DistilBERT) is sufficient for most interactive applications, but not for very high-volume streams, where TF-IDF models remain hundreds of times cheaper. In terms of size, the TF-IDF models have about 74 thousand weights (one per n-gram), the BiLSTM 2 million parameters, and the Transformers 4.4–125 million parameters (17–500 MB of memory in 32-bit precision).</w:t>
       </w:r>
     </w:p>
     <w:p>
@@ -17830,7 +16439,7 @@
                     <pic:cNvPicPr/>
                   </pic:nvPicPr>
                   <pic:blipFill>
-                    <a:blip r:embed="rId16"/>
+                    <a:blip r:embed="rId14"/>
                     <a:stretch>
                       <a:fillRect/>
                     </a:stretch>
@@ -17922,10 +16531,7 @@
         <w:pStyle w:val="BDpagrindinistekstas"/>
       </w:pPr>
       <w:r>
-        <w:t>The advantage of pre-training is largest when labelled data are scarce. With only 500 labelled sentences BERT-small reaches 75.9%, while the TF-IDF model reaches only 61.8%, a difference of 14.1 p.p.; the TF-IDF model simply has not seen most of the words of the test sentences, whereas the pre-trained model already knows them. The difference decreases as the data grow (6.9 p.p. at 4,000 and 6.2 p.p. at 8,000 sentences). BERT-small trained on 4,000 sentences (82.7%) already matches the best classical model t</w:t>
-      </w:r>
-      <w:r>
-        <w:t>rained on all 65,349 sentences (82.9%), i.e. it achieves the same quality with about 16 times less labelled data, and DistilBERT trained on 8,000 sentences exceeds it by 5.9 p.p. This result is directly relevant for less-resourced languages such as Lithuanian, where large labelled datasets rarely exist.</w:t>
+        <w:t>The advantage of pre-training is largest when labelled data are scarce. With only 500 labelled sentences BERT-small reaches 75.9%, while the TF-IDF model reaches only 61.8%, a difference of 14.1 p.p.; the TF-IDF model simply has not seen most of the words of the test sentences, whereas the pre-trained model already knows them. The difference decreases as the data grow (6.9 p.p. at 4,000 and 6.2 p.p. at 8,000 sentences). BERT-small trained on 4,000 sentences (82.7%) already matches the best classical model trained on all 65,349 sentences (82.9%), i.e. it achieves the same quality with about 16 times less labelled data, and DistilBERT trained on 8,000 sentences exceeds it by 5.9 p.p. This result is directly relevant for less-resourced languages such as Lithuanian, where large labelled datasets rarely exist.</w:t>
       </w:r>
     </w:p>
     <w:p>
@@ -17943,10 +16549,7 @@
         <w:pStyle w:val="BDpagrindinistekstas"/>
       </w:pPr>
       <w:r>
-        <w:t>The ready-made models answer RQ4. When a public model has been fine-tuned on the same domain and task, it is the best option: DistilBERT-SST2 achieved the highest accuracy without any training on our side. A model trained for the same task in a different domain (Twitter-RoBERTa) lost 5.3 p.p. compared with it, although it still beat all classical models; the informal style of tweets differs from the language of film critics. The zero-shot NLI model, which has never seen a sentiment label, reached 81.8% – th</w:t>
-      </w:r>
-      <w:r>
-        <w:t>e same level as TF-IDF logistic regression trained on 65 thousand labelled sentences. This illustrates the general language understanding acquired during pre-training: the task can be specified by a natural-language hypothesis instead of training data, at the price of the highest inference cost.</w:t>
+        <w:t>The ready-made models answer RQ4. When a public model has been fine-tuned on the same domain and task, it is the best option: DistilBERT-SST2 achieved the highest accuracy without any training on our side. A model trained for the same task in a different domain (Twitter-RoBERTa) lost 5.3 p.p. compared with it, although it still beat all classical models; the informal style of tweets differs from the language of film critics. The zero-shot NLI model, which has never seen a sentiment label, reached 81.8% – the same level as TF-IDF logistic regression trained on 65 thousand labelled sentences. This illustrates the general language understanding acquired during pre-training: the task can be specified by a natural-language hypothesis instead of training data, at the price of the highest inference cost.</w:t>
       </w:r>
     </w:p>
     <w:p>
@@ -18487,10 +17090,7 @@
               <w:keepNext/>
             </w:pPr>
             <w:r>
-              <w:t xml:space="preserve">TF-IDF + </w:t>
-            </w:r>
-            <w:r>
-              <w:t>Linear SVM</w:t>
+              <w:t>TF-IDF + Linear SVM</w:t>
             </w:r>
           </w:p>
         </w:tc>
@@ -18979,7 +17579,7 @@
                     <pic:cNvPicPr/>
                   </pic:nvPicPr>
                   <pic:blipFill>
-                    <a:blip r:embed="rId17"/>
+                    <a:blip r:embed="rId15"/>
                     <a:stretch>
                       <a:fillRect/>
                     </a:stretch>
@@ -19071,10 +17671,7 @@
         <w:pStyle w:val="BDpagrindinistekstas"/>
       </w:pPr>
       <w:r>
-        <w:t>The bag-of-words models lose 8–9 p.p. on sentences with negation, because a sentence such as “not good” contains the positive word “good”. The large Transformers are much more robust: DistilBERT-SST2 loses 4.1 p.p., our fine-tuned DistilBERT 3.4 p.p. and Twitter-RoBERTa 2.1 p.p. The zero-shot NLI model is the most robust of all (−0.2 p.p.), which is plausible because NLI training specifically teaches a model to handle negation and contradiction. The compact Transformers, however, behave like the classical m</w:t>
-      </w:r>
-      <w:r>
-        <w:t>odels: BERT-small loses 9.3 p.p. on negation, and BERT-tiny 7.0 p.p. Interestingly, the BiLSTM, which reads the sentence in order, handles negation better (−4.0 p.p.) than TF-IDF. The advantage of Transformers on difficult sentences is therefore not a property of the architecture alone but of the combination of architecture, model capacity and pre-training.</w:t>
+        <w:t>The bag-of-words models lose 8–9 p.p. on sentences with negation, because a sentence such as “not good” contains the positive word “good”. The large Transformers are much more robust: DistilBERT-SST2 loses 4.1 p.p., our fine-tuned DistilBERT 3.4 p.p. and Twitter-RoBERTa 2.1 p.p. The zero-shot NLI model is the most robust of all (−0.2 p.p.), which is plausible because NLI training specifically teaches a model to handle negation and contradiction. The compact Transformers, however, behave like the classical models: BERT-small loses 9.3 p.p. on negation, and BERT-tiny 7.0 p.p. Interestingly, the BiLSTM, which reads the sentence in order, handles negation better (−4.0 p.p.) than TF-IDF. The advantage of Transformers on difficult sentences is therefore not a property of the architecture alone but of the combination of architecture, model capacity and pre-training.</w:t>
       </w:r>
     </w:p>
     <w:p>
@@ -19082,10 +17679,7 @@
         <w:pStyle w:val="BDpagrindinistekstas"/>
       </w:pPr>
       <w:r>
-        <w:t>Fig. 7 shows the self-attention weights of DistilBERT-SST2 for the sentence “the plot was not good, but the acting was brilliant”. The model classifies the sentence as positive with a probability of 1.000, i.e. it gives the clause after “but” the decisive weight, which agrees with how people read such sentences. In the last layer much of the attention of all words goes to the comma that separates the two clauses and to the [SEP] token; such “attention sinks” on punctuation and separator tokens were also obs</w:t>
-      </w:r>
-      <w:r>
-        <w:t xml:space="preserve">erved in BERT by Clark et al. (2019). The words of the second clause (“acting”, “was”, “brilliant”) spread their remaining attention mainly over the other words of the same clause. As noted </w:t>
+        <w:t xml:space="preserve">Fig. 7 shows the self-attention weights of DistilBERT-SST2 for the sentence “the plot was not good, but the acting was brilliant”. The model classifies the sentence as positive with a probability of 1.000, i.e. it gives the clause after “but” the decisive weight, which agrees with how people read such sentences. In the last layer much of the attention of all words goes to the comma that separates the two clauses and to the [SEP] token; such “attention sinks” on punctuation and separator tokens were also observed in BERT by Clark et al. (2019). The words of the second clause (“acting”, “was”, “brilliant”) spread their remaining attention mainly over the other words of the same clause. As noted </w:t>
       </w:r>
       <w:r>
         <w:lastRenderedPageBreak/>
@@ -19114,7 +17708,7 @@
                     <pic:cNvPicPr/>
                   </pic:nvPicPr>
                   <pic:blipFill>
-                    <a:blip r:embed="rId18"/>
+                    <a:blip r:embed="rId16"/>
                     <a:stretch>
                       <a:fillRect/>
                     </a:stretch>
@@ -19206,10 +17800,7 @@
         <w:pStyle w:val="BDpagrindinistekstas"/>
       </w:pPr>
       <w:r>
-        <w:t>Examples from the test set show the typical behaviour. The fine-tuned DistilBERT correctly classified 104 sentences that the SVM misclassified, for example “in its best moments, resembles a bad high school production of grease, without benefit of song” (negative; the SVM is misled by “best”) and “the subtle strength of elling is that it never loses touch with the reality of the grim situation” (positive; “grim” and “never loses” mislead the bag-of-words model). The SVM was right in 53 cases where DistilBERT</w:t>
-      </w:r>
-      <w:r>
-        <w:t xml:space="preserve"> failed, for example in sentences with mixed sentiment such as “we root for (clara and paul), even like them, though perhaps it’s an emotion closer to pity”.</w:t>
+        <w:t>Examples from the test set show the typical behaviour. The fine-tuned DistilBERT correctly classified 104 sentences that the SVM misclassified, for example “in its best moments, resembles a bad high school production of grease, without benefit of song” (negative; the SVM is misled by “best”) and “the subtle strength of elling is that it never loses touch with the reality of the grim situation” (positive; “grim” and “never loses” mislead the bag-of-words model). The SVM was right in 53 cases where DistilBERT failed, for example in sentences with mixed sentiment such as “we root for (clara and paul), even like them, though perhaps it’s an emotion closer to pity”.</w:t>
       </w:r>
     </w:p>
     <w:p>
@@ -19227,13 +17818,7 @@
         <w:pStyle w:val="BDpagrindinistekstas"/>
       </w:pPr>
       <w:r>
-        <w:t xml:space="preserve">Our results are consistent with the literature summarised in Table 2. The classical models (81.9–82.9%) match the 79–83% reported for </w:t>
-      </w:r>
-      <w:r>
-        <w:t>bag-of-words models on SST-2 (Socher et al., 2013), and the off-the-shelf DistilBERT (91.1%) is close to the 91.3% reported by Sanh et al. (2019) on the same validation set, which confirms that our evaluation procedure is correct. Our fine-tuned DistilBERT stays 2.3 p.p. below it because it was trained on 12% of the training data. Compared with the BERT-base result of 93.5% (Devlin et al., 2019), our models are smaller and trained with fewer data, which explains the gap. The new element of this study is the</w:t>
-      </w:r>
-      <w:r>
-        <w:t xml:space="preserve"> joint view of quality, cost and data efficiency on a CPU-only computer, which shows when the advantage of Transformers is worth its price.</w:t>
+        <w:t>Our results are consistent with the literature summarised in Table 2. The classical models (81.9–82.9%) match the 79–83% reported for bag-of-words models on SST-2 (Socher et al., 2013), and the off-the-shelf DistilBERT (91.1%) is close to the 91.3% reported by Sanh et al. (2019) on the same validation set, which confirms that our evaluation procedure is correct. Our fine-tuned DistilBERT stays 2.3 p.p. below it because it was trained on 12% of the training data. Compared with the BERT-base result of 93.5% (Devlin et al., 2019), our models are smaller and trained with fewer data, which explains the gap. The new element of this study is the joint view of quality, cost and data efficiency on a CPU-only computer, which shows when the advantage of Transformers is worth its price.</w:t>
       </w:r>
     </w:p>
     <w:p>
@@ -19259,10 +17844,7 @@
         <w:ind w:firstLine="0"/>
       </w:pPr>
       <w:r>
-        <w:t>The literature review showed that Transformer models are the state of the art for text classification: fine-tuned encoders exceed 90% accuracy on SST-2, compared with 79–83% for classical models. Lithuanian research confirms that neural networks without pre-training do not necessarily outperform classical methods, while pre-trained models (LitLat BERT, multilingual BERT and T5, Lithuanian Llama2) are now becoming available. The gap identified in the literature was the lack of studies that jointly evaluate q</w:t>
-      </w:r>
-      <w:r>
-        <w:t>uality, cost and data efficiency of Transformers under realistic resource limits.</w:t>
+        <w:t>The literature review showed that Transformer models are the state of the art for text classification: fine-tuned encoders exceed 90% accuracy on SST-2, compared with 79–83% for classical models. Lithuanian research confirms that neural networks without pre-training do not necessarily outperform classical methods, while pre-trained models (LitLat BERT, multilingual BERT and T5, Lithuanian Llama2) are now becoming available. The gap identified in the literature was the lack of studies that jointly evaluate quality, cost and data efficiency of Transformers under realistic resource limits.</w:t>
       </w:r>
     </w:p>
     <w:p>
@@ -19304,10 +17886,7 @@
         <w:ind w:firstLine="0"/>
       </w:pPr>
       <w:r>
-        <w:t>The experiment showed that a sufficiently large pre-trained Transformer is clearly the most accurate approach. DistilBERT fine-tuned on only 8,000 sentences reached 88.8% accuracy, significantly more than the best classical model trained on all 65,349 sentences (TF-IDF + linear SVM, 82.9%, p &lt; 0.001), and the ready-made in-domain DistilBERT reached 91.1%. Compact Transformers only matched the classical models (BERT-small 83.7%), and BERT-tiny was the weakest model (76.6%). The BiLSTM trained from scratch (8</w:t>
-      </w:r>
-      <w:r>
-        <w:t>2.8%) gave no advantage over the classical models.</w:t>
+        <w:t>The experiment showed that a sufficiently large pre-trained Transformer is clearly the most accurate approach. DistilBERT fine-tuned on only 8,000 sentences reached 88.8% accuracy, significantly more than the best classical model trained on all 65,349 sentences (TF-IDF + linear SVM, 82.9%, p &lt; 0.001), and the ready-made in-domain DistilBERT reached 91.1%. Compact Transformers only matched the classical models (BERT-small 83.7%), and BERT-tiny was the weakest model (76.6%). The BiLSTM trained from scratch (82.8%) gave no advantage over the classical models.</w:t>
       </w:r>
     </w:p>
     <w:p>
@@ -19321,10 +17900,7 @@
         <w:ind w:firstLine="0"/>
       </w:pPr>
       <w:r>
-        <w:t xml:space="preserve">The improvement has a clear cost: Transformers are 20–2,000 times slower at inference (1.2–107 ms vs 0.05 ms per sentence on a CPU) and 60–1,700 times larger than TF-IDF models, and </w:t>
-      </w:r>
-      <w:r>
-        <w:t>fine-tuning on a CPU takes from minutes to hours. In return, pre-training makes them far more data-efficient – with 500 labelled sentences BERT-small was 14.1 percentage points more accurate than TF-IDF, and with 4,000 sentences it matched the classical model trained on 16 times more data – and the larger Transformers were much more robust on sentences with negation and contrast (accuracy drop of 2–4 p.p. versus 8–9 p.p. for bag-of-words models).</w:t>
+        <w:t>The improvement has a clear cost: Transformers are 20–2,000 times slower at inference (1.2–107 ms vs 0.05 ms per sentence on a CPU) and 60–1,700 times larger than TF-IDF models, and fine-tuning on a CPU takes from minutes to hours. In return, pre-training makes them far more data-efficient – with 500 labelled sentences BERT-small was 14.1 percentage points more accurate than TF-IDF, and with 4,000 sentences it matched the classical model trained on 16 times more data – and the larger Transformers were much more robust on sentences with negation and contrast (accuracy drop of 2–4 p.p. versus 8–9 p.p. for bag-of-words models).</w:t>
       </w:r>
     </w:p>
     <w:p>
@@ -19338,10 +17914,7 @@
         <w:t>Practical recommendations.</w:t>
       </w:r>
       <w:r>
-        <w:t xml:space="preserve"> (1) First check whether a public model already fine-tuned for the same task and domain exists – it gives the best quality without any training. (2) If not, fine-tune a distilled Transformer such as DistilBERT on a few thousand labelled examples; this is feasible even without a GPU. (3) When no labelled data exist at all, a zero-shot NLI model gives a usable baseline comparable to classical models. (4) TF-IDF models remain the right choice only when inference must be extremely cheap or the hardware is very </w:t>
-      </w:r>
-      <w:r>
-        <w:t>limited. For Lithuanian texts, the same procedure can be applied with LitLat BERT or XLM-RoBERTa, which is the most natural continuation of this work, together with repeated runs with several random seeds and GPU-based timing.</w:t>
+        <w:t xml:space="preserve"> (1) First check whether a public model already fine-tuned for the same task and domain exists – it gives the best quality without any training. (2) If not, fine-tune a distilled Transformer such as DistilBERT on a few thousand labelled examples; this is feasible even without a GPU. (3) When no labelled data exist at all, a zero-shot NLI model gives a usable baseline comparable to classical models. (4) TF-IDF models remain the right choice only when inference must be extremely cheap or the hardware is very limited. For Lithuanian texts, the same procedure can be applied with LitLat BERT or XLM-RoBERTa, which is the most natural continuation of this work, together with repeated runs with several random seeds and GPU-based timing.</w:t>
       </w:r>
     </w:p>
     <w:p>
@@ -19762,13 +18335,7 @@
         <w:rPr>
           <w:sz w:val="22"/>
         </w:rPr>
-        <w:t xml:space="preserve">Rogers, A., </w:t>
-      </w:r>
-      <w:r>
-        <w:rPr>
-          <w:sz w:val="22"/>
-        </w:rPr>
-        <w:t>Kovaleva, O., &amp; Rumshisky, A. (2020). A primer in BERTology: What we know about how BERT works. Transactions of the Association for Computational Linguistics, 8, 842–866.</w:t>
+        <w:t>Rogers, A., Kovaleva, O., &amp; Rumshisky, A. (2020). A primer in BERTology: What we know about how BERT works. Transactions of the Association for Computational Linguistics, 8, 842–866.</w:t>
       </w:r>
     </w:p>
     <w:p>
@@ -20031,10 +18598,7 @@
       </w:pPr>
       <w:bookmarkStart w:id="47" w:name="_Toc243416183"/>
       <w:r>
-        <w:t xml:space="preserve">Appendix A. Source code and </w:t>
-      </w:r>
-      <w:r>
-        <w:t>reproduction of the results</w:t>
+        <w:t>Appendix A. Source code and reproduction of the results</w:t>
       </w:r>
       <w:bookmarkEnd w:id="47"/>
     </w:p>
@@ -20139,8 +18703,8 @@
       </w:r>
     </w:p>
     <w:sectPr>
-      <w:headerReference w:type="default" r:id="rId19"/>
-      <w:footerReference w:type="default" r:id="rId20"/>
+      <w:headerReference w:type="default" r:id="rId17"/>
+      <w:footerReference w:type="default" r:id="rId18"/>
       <w:pgSz w:w="11906" w:h="16838"/>
       <w:pgMar w:top="1134" w:right="567" w:bottom="1134" w:left="1701" w:header="567" w:footer="567" w:gutter="0"/>
       <w:pgNumType w:start="1"/>
@@ -20215,26 +18779,6 @@
 
 <file path=word/footer2.xml><?xml version="1.0" encoding="utf-8"?>
 <w:ftr xmlns:wpc="http://schemas.microsoft.com/office/word/2010/wordprocessingCanvas" xmlns:cx="http://schemas.microsoft.com/office/drawing/2014/chartex" xmlns:cx1="http://schemas.microsoft.com/office/drawing/2015/9/8/chartex" xmlns:cx2="http://schemas.microsoft.com/office/drawing/2015/10/21/chartex" xmlns:cx3="http://schemas.microsoft.com/office/drawing/2016/5/9/chartex" xmlns:cx4="http://schemas.microsoft.com/office/drawing/2016/5/10/chartex" xmlns:cx5="http://schemas.microsoft.com/office/drawing/2016/5/11/chartex" xmlns:cx6="http://schemas.microsoft.com/office/drawing/2016/5/12/chartex" xmlns:cx7="http://schemas.microsoft.com/office/drawing/2016/5/13/chartex" xmlns:cx8="http://schemas.microsoft.com/office/drawing/2016/5/14/chartex" xmlns:mc="http://schemas.openxmlformats.org/markup-compatibility/2006" xmlns:aink="http://schemas.microsoft.com/office/drawing/2016/ink" xmlns:am3d="http://schemas.microsoft.com/office/drawing/2017/model3d" xmlns:o="urn:schemas-microsoft-com:office:office" xmlns:oel="http://schemas.microsoft.com/office/2019/extlst" xmlns:r="http://schemas.openxmlformats.org/officeDocument/2006/relationships" xmlns:m="http://schemas.openxmlformats.org/officeDocument/2006/math" xmlns:v="urn:schemas-microsoft-com:vml" xmlns:wp14="http://schemas.microsoft.com/office/word/2010/wordprocessingDrawing" xmlns:wp="http://schemas.openxmlformats.org/drawingml/2006/wordprocessingDrawing" xmlns:w10="urn:schemas-microsoft-com:office:word" xmlns:w="http://schemas.openxmlformats.org/wordprocessingml/2006/main" xmlns:w14="http://schemas.microsoft.com/office/word/2010/wordml" xmlns:w15="http://schemas.microsoft.com/office/word/2012/wordml" xmlns:w16cex="http://schemas.microsoft.com/office/word/2018/wordml/cex" xmlns:w16cid="http://schemas.microsoft.com/office/word/2016/wordml/cid" xmlns:w16="http://schemas.microsoft.com/office/word/2018/wordml" xmlns:w16sdtdh="http://schemas.microsoft.com/office/word/2020/wordml/sdtdatahash" xmlns:w16se="http://schemas.microsoft.com/office/word/2015/wordml/symex" xmlns:wpg="http://schemas.microsoft.com/office/word/2010/wordprocessingGroup" xmlns:wpi="http://schemas.microsoft.com/office/word/2010/wordprocessingInk" xmlns:wne="http://schemas.microsoft.com/office/word/2006/wordml" xmlns:wps="http://schemas.microsoft.com/office/word/2010/wordprocessingShape" mc:Ignorable="w14 w15 w16se w16cid w16 w16cex w16sdtdh wp14">
-  <w:p>
-    <w:pPr>
-      <w:pStyle w:val="Footer"/>
-    </w:pPr>
-  </w:p>
-</w:ftr>
-</file>
-
-<file path=word/footer3.xml><?xml version="1.0" encoding="utf-8"?>
-<w:ftr xmlns:wpc="http://schemas.microsoft.com/office/word/2010/wordprocessingCanvas" xmlns:cx="http://schemas.microsoft.com/office/drawing/2014/chartex" xmlns:cx1="http://schemas.microsoft.com/office/drawing/2015/9/8/chartex" xmlns:cx2="http://schemas.microsoft.com/office/drawing/2015/10/21/chartex" xmlns:cx3="http://schemas.microsoft.com/office/drawing/2016/5/9/chartex" xmlns:cx4="http://schemas.microsoft.com/office/drawing/2016/5/10/chartex" xmlns:cx5="http://schemas.microsoft.com/office/drawing/2016/5/11/chartex" xmlns:cx6="http://schemas.microsoft.com/office/drawing/2016/5/12/chartex" xmlns:cx7="http://schemas.microsoft.com/office/drawing/2016/5/13/chartex" xmlns:cx8="http://schemas.microsoft.com/office/drawing/2016/5/14/chartex" xmlns:mc="http://schemas.openxmlformats.org/markup-compatibility/2006" xmlns:aink="http://schemas.microsoft.com/office/drawing/2016/ink" xmlns:am3d="http://schemas.microsoft.com/office/drawing/2017/model3d" xmlns:o="urn:schemas-microsoft-com:office:office" xmlns:oel="http://schemas.microsoft.com/office/2019/extlst" xmlns:r="http://schemas.openxmlformats.org/officeDocument/2006/relationships" xmlns:m="http://schemas.openxmlformats.org/officeDocument/2006/math" xmlns:v="urn:schemas-microsoft-com:vml" xmlns:wp14="http://schemas.microsoft.com/office/word/2010/wordprocessingDrawing" xmlns:wp="http://schemas.openxmlformats.org/drawingml/2006/wordprocessingDrawing" xmlns:w10="urn:schemas-microsoft-com:office:word" xmlns:w="http://schemas.openxmlformats.org/wordprocessingml/2006/main" xmlns:w14="http://schemas.microsoft.com/office/word/2010/wordml" xmlns:w15="http://schemas.microsoft.com/office/word/2012/wordml" xmlns:w16cex="http://schemas.microsoft.com/office/word/2018/wordml/cex" xmlns:w16cid="http://schemas.microsoft.com/office/word/2016/wordml/cid" xmlns:w16="http://schemas.microsoft.com/office/word/2018/wordml" xmlns:w16sdtdh="http://schemas.microsoft.com/office/word/2020/wordml/sdtdatahash" xmlns:w16se="http://schemas.microsoft.com/office/word/2015/wordml/symex" xmlns:wpg="http://schemas.microsoft.com/office/word/2010/wordprocessingGroup" xmlns:wpi="http://schemas.microsoft.com/office/word/2010/wordprocessingInk" xmlns:wne="http://schemas.microsoft.com/office/word/2006/wordml" xmlns:wps="http://schemas.microsoft.com/office/word/2010/wordprocessingShape" mc:Ignorable="w14 w15 w16se w16cid w16 w16cex w16sdtdh wp14">
-  <w:p>
-    <w:pPr>
-      <w:pStyle w:val="Footer"/>
-    </w:pPr>
-  </w:p>
-</w:ftr>
-</file>
-
-<file path=word/footer4.xml><?xml version="1.0" encoding="utf-8"?>
-<w:ftr xmlns:wpc="http://schemas.microsoft.com/office/word/2010/wordprocessingCanvas" xmlns:cx="http://schemas.microsoft.com/office/drawing/2014/chartex" xmlns:cx1="http://schemas.microsoft.com/office/drawing/2015/9/8/chartex" xmlns:cx2="http://schemas.microsoft.com/office/drawing/2015/10/21/chartex" xmlns:cx3="http://schemas.microsoft.com/office/drawing/2016/5/9/chartex" xmlns:cx4="http://schemas.microsoft.com/office/drawing/2016/5/10/chartex" xmlns:cx5="http://schemas.microsoft.com/office/drawing/2016/5/11/chartex" xmlns:cx6="http://schemas.microsoft.com/office/drawing/2016/5/12/chartex" xmlns:cx7="http://schemas.microsoft.com/office/drawing/2016/5/13/chartex" xmlns:cx8="http://schemas.microsoft.com/office/drawing/2016/5/14/chartex" xmlns:mc="http://schemas.openxmlformats.org/markup-compatibility/2006" xmlns:aink="http://schemas.microsoft.com/office/drawing/2016/ink" xmlns:am3d="http://schemas.microsoft.com/office/drawing/2017/model3d" xmlns:o="urn:schemas-microsoft-com:office:office" xmlns:oel="http://schemas.microsoft.com/office/2019/extlst" xmlns:r="http://schemas.openxmlformats.org/officeDocument/2006/relationships" xmlns:m="http://schemas.openxmlformats.org/officeDocument/2006/math" xmlns:v="urn:schemas-microsoft-com:vml" xmlns:wp14="http://schemas.microsoft.com/office/word/2010/wordprocessingDrawing" xmlns:wp="http://schemas.openxmlformats.org/drawingml/2006/wordprocessingDrawing" xmlns:w10="urn:schemas-microsoft-com:office:word" xmlns:w="http://schemas.openxmlformats.org/wordprocessingml/2006/main" xmlns:w14="http://schemas.microsoft.com/office/word/2010/wordml" xmlns:w15="http://schemas.microsoft.com/office/word/2012/wordml" xmlns:w16cex="http://schemas.microsoft.com/office/word/2018/wordml/cex" xmlns:w16cid="http://schemas.microsoft.com/office/word/2016/wordml/cid" xmlns:w16="http://schemas.microsoft.com/office/word/2018/wordml" xmlns:w16sdtdh="http://schemas.microsoft.com/office/word/2020/wordml/sdtdatahash" xmlns:w16se="http://schemas.microsoft.com/office/word/2015/wordml/symex" xmlns:wpg="http://schemas.microsoft.com/office/word/2010/wordprocessingGroup" xmlns:wpi="http://schemas.microsoft.com/office/word/2010/wordprocessingInk" xmlns:wne="http://schemas.microsoft.com/office/word/2006/wordml" xmlns:wps="http://schemas.microsoft.com/office/word/2010/wordprocessingShape" mc:Ignorable="w14 w15 w16se w16cid w16 w16cex w16sdtdh wp14">
   <w:sdt>
     <w:sdtPr>
       <w:id w:val="1811918766"/>
@@ -20243,7 +18787,6 @@
         <w:docPartUnique/>
       </w:docPartObj>
     </w:sdtPr>
-    <w:sdtEndPr/>
     <w:sdtContent>
       <w:p>
         <w:pPr>

</xml_diff>

<commit_message>
Paper: no annotation page (matches manual edit); regenerate DOCX and PDF
The annotation page was deleted by hand in Word; the generator now produces the
same result (INCLUDE_ANNOTATION = False), so a rebuild cannot bring it back.
Contents follows the title page directly; paper is 27 pages. QA script updated.

Co-Authored-By: Claude Sonnet 5.5 <noreply@anthropic.com>
</commit_message>
<xml_diff>
--- a/docs/Transformers_in_NLP_Project_Paper.docx
+++ b/docs/Transformers_in_NLP_Project_Paper.docx
@@ -15,7 +15,7 @@
           <w:lang w:eastAsia="lt-LT"/>
         </w:rPr>
         <w:drawing>
-          <wp:inline distT="0" distB="0" distL="0" distR="0" wp14:anchorId="41E43776" wp14:editId="6B3087E6">
+          <wp:inline distT="0" distB="0" distL="0" distR="0" wp14:anchorId="0AF718AB" wp14:editId="447A0501">
             <wp:extent cx="1772285" cy="504825"/>
             <wp:effectExtent l="0" t="0" r="0" b="9525"/>
             <wp:docPr id="2" name="Picture 2"/>
@@ -308,7 +308,7 @@
       <w:r>
         <w:fldChar w:fldCharType="separate"/>
       </w:r>
-      <w:hyperlink w:anchor="_Toc243416154" w:history="1">
+      <w:hyperlink w:anchor="_Toc243418782" w:history="1">
         <w:r>
           <w:rPr>
             <w:rStyle w:val="Hyperlink"/>
@@ -335,7 +335,7 @@
             <w:noProof/>
             <w:webHidden/>
           </w:rPr>
-          <w:instrText xml:space="preserve"> PAGEREF _Toc243416154 \h </w:instrText>
+          <w:instrText xml:space="preserve"> PAGEREF _Toc243418782 \h </w:instrText>
         </w:r>
         <w:r>
           <w:rPr>
@@ -381,7 +381,7 @@
           <w14:ligatures w14:val="standardContextual"/>
         </w:rPr>
       </w:pPr>
-      <w:hyperlink w:anchor="_Toc243416155" w:history="1">
+      <w:hyperlink w:anchor="_Toc243418783" w:history="1">
         <w:r>
           <w:rPr>
             <w:rStyle w:val="Hyperlink"/>
@@ -408,7 +408,7 @@
             <w:noProof/>
             <w:webHidden/>
           </w:rPr>
-          <w:instrText xml:space="preserve"> PAGEREF _Toc243416155 \h </w:instrText>
+          <w:instrText xml:space="preserve"> PAGEREF _Toc243418783 \h </w:instrText>
         </w:r>
         <w:r>
           <w:rPr>
@@ -454,7 +454,7 @@
           <w14:ligatures w14:val="standardContextual"/>
         </w:rPr>
       </w:pPr>
-      <w:hyperlink w:anchor="_Toc243416156" w:history="1">
+      <w:hyperlink w:anchor="_Toc243418784" w:history="1">
         <w:r>
           <w:rPr>
             <w:rStyle w:val="Hyperlink"/>
@@ -481,7 +481,7 @@
             <w:noProof/>
             <w:webHidden/>
           </w:rPr>
-          <w:instrText xml:space="preserve"> PAGEREF _Toc243416156 \h </w:instrText>
+          <w:instrText xml:space="preserve"> PAGEREF _Toc243418784 \h </w:instrText>
         </w:r>
         <w:r>
           <w:rPr>
@@ -527,7 +527,7 @@
           <w14:ligatures w14:val="standardContextual"/>
         </w:rPr>
       </w:pPr>
-      <w:hyperlink w:anchor="_Toc243416157" w:history="1">
+      <w:hyperlink w:anchor="_Toc243418785" w:history="1">
         <w:r>
           <w:rPr>
             <w:rStyle w:val="Hyperlink"/>
@@ -554,7 +554,7 @@
             <w:noProof/>
             <w:webHidden/>
           </w:rPr>
-          <w:instrText xml:space="preserve"> PAGEREF _Toc243416157 \h </w:instrText>
+          <w:instrText xml:space="preserve"> PAGEREF _Toc243418785 \h </w:instrText>
         </w:r>
         <w:r>
           <w:rPr>
@@ -600,7 +600,7 @@
           <w14:ligatures w14:val="standardContextual"/>
         </w:rPr>
       </w:pPr>
-      <w:hyperlink w:anchor="_Toc243416158" w:history="1">
+      <w:hyperlink w:anchor="_Toc243418786" w:history="1">
         <w:r>
           <w:rPr>
             <w:rStyle w:val="Hyperlink"/>
@@ -627,7 +627,7 @@
             <w:noProof/>
             <w:webHidden/>
           </w:rPr>
-          <w:instrText xml:space="preserve"> PAGEREF _Toc243416158 \h </w:instrText>
+          <w:instrText xml:space="preserve"> PAGEREF _Toc243418786 \h </w:instrText>
         </w:r>
         <w:r>
           <w:rPr>
@@ -673,7 +673,7 @@
           <w14:ligatures w14:val="standardContextual"/>
         </w:rPr>
       </w:pPr>
-      <w:hyperlink w:anchor="_Toc243416159" w:history="1">
+      <w:hyperlink w:anchor="_Toc243418787" w:history="1">
         <w:r>
           <w:rPr>
             <w:rStyle w:val="Hyperlink"/>
@@ -700,7 +700,7 @@
             <w:noProof/>
             <w:webHidden/>
           </w:rPr>
-          <w:instrText xml:space="preserve"> PAGEREF _Toc243416159 \h </w:instrText>
+          <w:instrText xml:space="preserve"> PAGEREF _Toc243418787 \h </w:instrText>
         </w:r>
         <w:r>
           <w:rPr>
@@ -746,7 +746,7 @@
           <w14:ligatures w14:val="standardContextual"/>
         </w:rPr>
       </w:pPr>
-      <w:hyperlink w:anchor="_Toc243416160" w:history="1">
+      <w:hyperlink w:anchor="_Toc243418788" w:history="1">
         <w:r>
           <w:rPr>
             <w:rStyle w:val="Hyperlink"/>
@@ -773,7 +773,7 @@
             <w:noProof/>
             <w:webHidden/>
           </w:rPr>
-          <w:instrText xml:space="preserve"> PAGEREF _Toc243416160 \h </w:instrText>
+          <w:instrText xml:space="preserve"> PAGEREF _Toc243418788 \h </w:instrText>
         </w:r>
         <w:r>
           <w:rPr>
@@ -819,7 +819,7 @@
           <w14:ligatures w14:val="standardContextual"/>
         </w:rPr>
       </w:pPr>
-      <w:hyperlink w:anchor="_Toc243416161" w:history="1">
+      <w:hyperlink w:anchor="_Toc243418789" w:history="1">
         <w:r>
           <w:rPr>
             <w:rStyle w:val="Hyperlink"/>
@@ -846,7 +846,7 @@
             <w:noProof/>
             <w:webHidden/>
           </w:rPr>
-          <w:instrText xml:space="preserve"> PAGEREF _Toc243416161 \h </w:instrText>
+          <w:instrText xml:space="preserve"> PAGEREF _Toc243418789 \h </w:instrText>
         </w:r>
         <w:r>
           <w:rPr>
@@ -892,7 +892,7 @@
           <w14:ligatures w14:val="standardContextual"/>
         </w:rPr>
       </w:pPr>
-      <w:hyperlink w:anchor="_Toc243416162" w:history="1">
+      <w:hyperlink w:anchor="_Toc243418790" w:history="1">
         <w:r>
           <w:rPr>
             <w:rStyle w:val="Hyperlink"/>
@@ -919,7 +919,7 @@
             <w:noProof/>
             <w:webHidden/>
           </w:rPr>
-          <w:instrText xml:space="preserve"> PAGEREF _Toc243416162 \h </w:instrText>
+          <w:instrText xml:space="preserve"> PAGEREF _Toc243418790 \h </w:instrText>
         </w:r>
         <w:r>
           <w:rPr>
@@ -965,7 +965,7 @@
           <w14:ligatures w14:val="standardContextual"/>
         </w:rPr>
       </w:pPr>
-      <w:hyperlink w:anchor="_Toc243416163" w:history="1">
+      <w:hyperlink w:anchor="_Toc243418791" w:history="1">
         <w:r>
           <w:rPr>
             <w:rStyle w:val="Hyperlink"/>
@@ -992,7 +992,7 @@
             <w:noProof/>
             <w:webHidden/>
           </w:rPr>
-          <w:instrText xml:space="preserve"> PAGEREF _Toc243416163 \h </w:instrText>
+          <w:instrText xml:space="preserve"> PAGEREF _Toc243418791 \h </w:instrText>
         </w:r>
         <w:r>
           <w:rPr>
@@ -1038,7 +1038,7 @@
           <w14:ligatures w14:val="standardContextual"/>
         </w:rPr>
       </w:pPr>
-      <w:hyperlink w:anchor="_Toc243416164" w:history="1">
+      <w:hyperlink w:anchor="_Toc243418792" w:history="1">
         <w:r>
           <w:rPr>
             <w:rStyle w:val="Hyperlink"/>
@@ -1065,7 +1065,7 @@
             <w:noProof/>
             <w:webHidden/>
           </w:rPr>
-          <w:instrText xml:space="preserve"> PAGEREF _Toc243416164 \h </w:instrText>
+          <w:instrText xml:space="preserve"> PAGEREF _Toc243418792 \h </w:instrText>
         </w:r>
         <w:r>
           <w:rPr>
@@ -1111,7 +1111,7 @@
           <w14:ligatures w14:val="standardContextual"/>
         </w:rPr>
       </w:pPr>
-      <w:hyperlink w:anchor="_Toc243416165" w:history="1">
+      <w:hyperlink w:anchor="_Toc243418793" w:history="1">
         <w:r>
           <w:rPr>
             <w:rStyle w:val="Hyperlink"/>
@@ -1138,7 +1138,7 @@
             <w:noProof/>
             <w:webHidden/>
           </w:rPr>
-          <w:instrText xml:space="preserve"> PAGEREF _Toc243416165 \h </w:instrText>
+          <w:instrText xml:space="preserve"> PAGEREF _Toc243418793 \h </w:instrText>
         </w:r>
         <w:r>
           <w:rPr>
@@ -1184,7 +1184,7 @@
           <w14:ligatures w14:val="standardContextual"/>
         </w:rPr>
       </w:pPr>
-      <w:hyperlink w:anchor="_Toc243416166" w:history="1">
+      <w:hyperlink w:anchor="_Toc243418794" w:history="1">
         <w:r>
           <w:rPr>
             <w:rStyle w:val="Hyperlink"/>
@@ -1211,7 +1211,7 @@
             <w:noProof/>
             <w:webHidden/>
           </w:rPr>
-          <w:instrText xml:space="preserve"> PAGEREF _Toc243416166 \h </w:instrText>
+          <w:instrText xml:space="preserve"> PAGEREF _Toc243418794 \h </w:instrText>
         </w:r>
         <w:r>
           <w:rPr>
@@ -1257,7 +1257,7 @@
           <w14:ligatures w14:val="standardContextual"/>
         </w:rPr>
       </w:pPr>
-      <w:hyperlink w:anchor="_Toc243416167" w:history="1">
+      <w:hyperlink w:anchor="_Toc243418795" w:history="1">
         <w:r>
           <w:rPr>
             <w:rStyle w:val="Hyperlink"/>
@@ -1284,7 +1284,7 @@
             <w:noProof/>
             <w:webHidden/>
           </w:rPr>
-          <w:instrText xml:space="preserve"> PAGEREF _Toc243416167 \h </w:instrText>
+          <w:instrText xml:space="preserve"> PAGEREF _Toc243418795 \h </w:instrText>
         </w:r>
         <w:r>
           <w:rPr>
@@ -1330,7 +1330,7 @@
           <w14:ligatures w14:val="standardContextual"/>
         </w:rPr>
       </w:pPr>
-      <w:hyperlink w:anchor="_Toc243416168" w:history="1">
+      <w:hyperlink w:anchor="_Toc243418796" w:history="1">
         <w:r>
           <w:rPr>
             <w:rStyle w:val="Hyperlink"/>
@@ -1357,7 +1357,7 @@
             <w:noProof/>
             <w:webHidden/>
           </w:rPr>
-          <w:instrText xml:space="preserve"> PAGEREF _Toc243416168 \h </w:instrText>
+          <w:instrText xml:space="preserve"> PAGEREF _Toc243418796 \h </w:instrText>
         </w:r>
         <w:r>
           <w:rPr>
@@ -1403,7 +1403,7 @@
           <w14:ligatures w14:val="standardContextual"/>
         </w:rPr>
       </w:pPr>
-      <w:hyperlink w:anchor="_Toc243416169" w:history="1">
+      <w:hyperlink w:anchor="_Toc243418797" w:history="1">
         <w:r>
           <w:rPr>
             <w:rStyle w:val="Hyperlink"/>
@@ -1430,7 +1430,7 @@
             <w:noProof/>
             <w:webHidden/>
           </w:rPr>
-          <w:instrText xml:space="preserve"> PAGEREF _Toc243416169 \h </w:instrText>
+          <w:instrText xml:space="preserve"> PAGEREF _Toc243418797 \h </w:instrText>
         </w:r>
         <w:r>
           <w:rPr>
@@ -1476,7 +1476,7 @@
           <w14:ligatures w14:val="standardContextual"/>
         </w:rPr>
       </w:pPr>
-      <w:hyperlink w:anchor="_Toc243416170" w:history="1">
+      <w:hyperlink w:anchor="_Toc243418798" w:history="1">
         <w:r>
           <w:rPr>
             <w:rStyle w:val="Hyperlink"/>
@@ -1503,7 +1503,7 @@
             <w:noProof/>
             <w:webHidden/>
           </w:rPr>
-          <w:instrText xml:space="preserve"> PAGEREF _Toc243416170 \h </w:instrText>
+          <w:instrText xml:space="preserve"> PAGEREF _Toc243418798 \h </w:instrText>
         </w:r>
         <w:r>
           <w:rPr>
@@ -1549,7 +1549,7 @@
           <w14:ligatures w14:val="standardContextual"/>
         </w:rPr>
       </w:pPr>
-      <w:hyperlink w:anchor="_Toc243416171" w:history="1">
+      <w:hyperlink w:anchor="_Toc243418799" w:history="1">
         <w:r>
           <w:rPr>
             <w:rStyle w:val="Hyperlink"/>
@@ -1576,7 +1576,7 @@
             <w:noProof/>
             <w:webHidden/>
           </w:rPr>
-          <w:instrText xml:space="preserve"> PAGEREF _Toc243416171 \h </w:instrText>
+          <w:instrText xml:space="preserve"> PAGEREF _Toc243418799 \h </w:instrText>
         </w:r>
         <w:r>
           <w:rPr>
@@ -1622,7 +1622,7 @@
           <w14:ligatures w14:val="standardContextual"/>
         </w:rPr>
       </w:pPr>
-      <w:hyperlink w:anchor="_Toc243416172" w:history="1">
+      <w:hyperlink w:anchor="_Toc243418800" w:history="1">
         <w:r>
           <w:rPr>
             <w:rStyle w:val="Hyperlink"/>
@@ -1649,7 +1649,7 @@
             <w:noProof/>
             <w:webHidden/>
           </w:rPr>
-          <w:instrText xml:space="preserve"> PAGEREF _Toc243416172 \h </w:instrText>
+          <w:instrText xml:space="preserve"> PAGEREF _Toc243418800 \h </w:instrText>
         </w:r>
         <w:r>
           <w:rPr>
@@ -1695,7 +1695,7 @@
           <w14:ligatures w14:val="standardContextual"/>
         </w:rPr>
       </w:pPr>
-      <w:hyperlink w:anchor="_Toc243416173" w:history="1">
+      <w:hyperlink w:anchor="_Toc243418801" w:history="1">
         <w:r>
           <w:rPr>
             <w:rStyle w:val="Hyperlink"/>
@@ -1722,7 +1722,7 @@
             <w:noProof/>
             <w:webHidden/>
           </w:rPr>
-          <w:instrText xml:space="preserve"> PAGEREF _Toc243416173 \h </w:instrText>
+          <w:instrText xml:space="preserve"> PAGEREF _Toc243418801 \h </w:instrText>
         </w:r>
         <w:r>
           <w:rPr>
@@ -1768,7 +1768,7 @@
           <w14:ligatures w14:val="standardContextual"/>
         </w:rPr>
       </w:pPr>
-      <w:hyperlink w:anchor="_Toc243416174" w:history="1">
+      <w:hyperlink w:anchor="_Toc243418802" w:history="1">
         <w:r>
           <w:rPr>
             <w:rStyle w:val="Hyperlink"/>
@@ -1795,7 +1795,7 @@
             <w:noProof/>
             <w:webHidden/>
           </w:rPr>
-          <w:instrText xml:space="preserve"> PAGEREF _Toc243416174 \h </w:instrText>
+          <w:instrText xml:space="preserve"> PAGEREF _Toc243418802 \h </w:instrText>
         </w:r>
         <w:r>
           <w:rPr>
@@ -1841,7 +1841,7 @@
           <w14:ligatures w14:val="standardContextual"/>
         </w:rPr>
       </w:pPr>
-      <w:hyperlink w:anchor="_Toc243416175" w:history="1">
+      <w:hyperlink w:anchor="_Toc243418803" w:history="1">
         <w:r>
           <w:rPr>
             <w:rStyle w:val="Hyperlink"/>
@@ -1868,7 +1868,7 @@
             <w:noProof/>
             <w:webHidden/>
           </w:rPr>
-          <w:instrText xml:space="preserve"> PAGEREF _Toc243416175 \h </w:instrText>
+          <w:instrText xml:space="preserve"> PAGEREF _Toc243418803 \h </w:instrText>
         </w:r>
         <w:r>
           <w:rPr>
@@ -1914,7 +1914,7 @@
           <w14:ligatures w14:val="standardContextual"/>
         </w:rPr>
       </w:pPr>
-      <w:hyperlink w:anchor="_Toc243416176" w:history="1">
+      <w:hyperlink w:anchor="_Toc243418804" w:history="1">
         <w:r>
           <w:rPr>
             <w:rStyle w:val="Hyperlink"/>
@@ -1941,7 +1941,7 @@
             <w:noProof/>
             <w:webHidden/>
           </w:rPr>
-          <w:instrText xml:space="preserve"> PAGEREF _Toc243416176 \h </w:instrText>
+          <w:instrText xml:space="preserve"> PAGEREF _Toc243418804 \h </w:instrText>
         </w:r>
         <w:r>
           <w:rPr>
@@ -1987,7 +1987,7 @@
           <w14:ligatures w14:val="standardContextual"/>
         </w:rPr>
       </w:pPr>
-      <w:hyperlink w:anchor="_Toc243416177" w:history="1">
+      <w:hyperlink w:anchor="_Toc243418805" w:history="1">
         <w:r>
           <w:rPr>
             <w:rStyle w:val="Hyperlink"/>
@@ -2014,7 +2014,7 @@
             <w:noProof/>
             <w:webHidden/>
           </w:rPr>
-          <w:instrText xml:space="preserve"> PAGEREF _Toc243416177 \h </w:instrText>
+          <w:instrText xml:space="preserve"> PAGEREF _Toc243418805 \h </w:instrText>
         </w:r>
         <w:r>
           <w:rPr>
@@ -2060,7 +2060,7 @@
           <w14:ligatures w14:val="standardContextual"/>
         </w:rPr>
       </w:pPr>
-      <w:hyperlink w:anchor="_Toc243416178" w:history="1">
+      <w:hyperlink w:anchor="_Toc243418806" w:history="1">
         <w:r>
           <w:rPr>
             <w:rStyle w:val="Hyperlink"/>
@@ -2087,7 +2087,7 @@
             <w:noProof/>
             <w:webHidden/>
           </w:rPr>
-          <w:instrText xml:space="preserve"> PAGEREF _Toc243416178 \h </w:instrText>
+          <w:instrText xml:space="preserve"> PAGEREF _Toc243418806 \h </w:instrText>
         </w:r>
         <w:r>
           <w:rPr>
@@ -2133,7 +2133,7 @@
           <w14:ligatures w14:val="standardContextual"/>
         </w:rPr>
       </w:pPr>
-      <w:hyperlink w:anchor="_Toc243416179" w:history="1">
+      <w:hyperlink w:anchor="_Toc243418807" w:history="1">
         <w:r>
           <w:rPr>
             <w:rStyle w:val="Hyperlink"/>
@@ -2160,7 +2160,7 @@
             <w:noProof/>
             <w:webHidden/>
           </w:rPr>
-          <w:instrText xml:space="preserve"> PAGEREF _Toc243416179 \h </w:instrText>
+          <w:instrText xml:space="preserve"> PAGEREF _Toc243418807 \h </w:instrText>
         </w:r>
         <w:r>
           <w:rPr>
@@ -2206,7 +2206,7 @@
           <w14:ligatures w14:val="standardContextual"/>
         </w:rPr>
       </w:pPr>
-      <w:hyperlink w:anchor="_Toc243416180" w:history="1">
+      <w:hyperlink w:anchor="_Toc243418808" w:history="1">
         <w:r>
           <w:rPr>
             <w:rStyle w:val="Hyperlink"/>
@@ -2233,7 +2233,7 @@
             <w:noProof/>
             <w:webHidden/>
           </w:rPr>
-          <w:instrText xml:space="preserve"> PAGEREF _Toc243416180 \h </w:instrText>
+          <w:instrText xml:space="preserve"> PAGEREF _Toc243418808 \h </w:instrText>
         </w:r>
         <w:r>
           <w:rPr>
@@ -2279,7 +2279,7 @@
           <w14:ligatures w14:val="standardContextual"/>
         </w:rPr>
       </w:pPr>
-      <w:hyperlink w:anchor="_Toc243416181" w:history="1">
+      <w:hyperlink w:anchor="_Toc243418809" w:history="1">
         <w:r>
           <w:rPr>
             <w:rStyle w:val="Hyperlink"/>
@@ -2306,7 +2306,7 @@
             <w:noProof/>
             <w:webHidden/>
           </w:rPr>
-          <w:instrText xml:space="preserve"> PAGEREF _Toc243416181 \h </w:instrText>
+          <w:instrText xml:space="preserve"> PAGEREF _Toc243418809 \h </w:instrText>
         </w:r>
         <w:r>
           <w:rPr>
@@ -2352,7 +2352,7 @@
           <w14:ligatures w14:val="standardContextual"/>
         </w:rPr>
       </w:pPr>
-      <w:hyperlink w:anchor="_Toc243416182" w:history="1">
+      <w:hyperlink w:anchor="_Toc243418810" w:history="1">
         <w:r>
           <w:rPr>
             <w:rStyle w:val="Hyperlink"/>
@@ -2379,7 +2379,7 @@
             <w:noProof/>
             <w:webHidden/>
           </w:rPr>
-          <w:instrText xml:space="preserve"> PAGEREF _Toc243416182 \h </w:instrText>
+          <w:instrText xml:space="preserve"> PAGEREF _Toc243418810 \h </w:instrText>
         </w:r>
         <w:r>
           <w:rPr>
@@ -2425,7 +2425,7 @@
           <w14:ligatures w14:val="standardContextual"/>
         </w:rPr>
       </w:pPr>
-      <w:hyperlink w:anchor="_Toc243416183" w:history="1">
+      <w:hyperlink w:anchor="_Toc243418811" w:history="1">
         <w:r>
           <w:rPr>
             <w:rStyle w:val="Hyperlink"/>
@@ -2452,7 +2452,7 @@
             <w:noProof/>
             <w:webHidden/>
           </w:rPr>
-          <w:instrText xml:space="preserve"> PAGEREF _Toc243416183 \h </w:instrText>
+          <w:instrText xml:space="preserve"> PAGEREF _Toc243418811 \h </w:instrText>
         </w:r>
         <w:r>
           <w:rPr>
@@ -2531,7 +2531,7 @@
       <w:r>
         <w:fldChar w:fldCharType="separate"/>
       </w:r>
-      <w:hyperlink w:anchor="_Toc243416138" w:history="1">
+      <w:hyperlink w:anchor="_Toc243418766" w:history="1">
         <w:r>
           <w:rPr>
             <w:rStyle w:val="Hyperlink"/>
@@ -2566,7 +2566,7 @@
             <w:noProof/>
             <w:webHidden/>
           </w:rPr>
-          <w:instrText xml:space="preserve"> PAGEREF _Toc243416138 \h </w:instrText>
+          <w:instrText xml:space="preserve"> PAGEREF _Toc243418766 \h </w:instrText>
         </w:r>
         <w:r>
           <w:rPr>
@@ -2612,7 +2612,7 @@
           <w14:ligatures w14:val="standardContextual"/>
         </w:rPr>
       </w:pPr>
-      <w:hyperlink w:anchor="_Toc243416139" w:history="1">
+      <w:hyperlink w:anchor="_Toc243418767" w:history="1">
         <w:r>
           <w:rPr>
             <w:rStyle w:val="Hyperlink"/>
@@ -2647,7 +2647,7 @@
             <w:noProof/>
             <w:webHidden/>
           </w:rPr>
-          <w:instrText xml:space="preserve"> PAGEREF _Toc243416139 \h </w:instrText>
+          <w:instrText xml:space="preserve"> PAGEREF _Toc243418767 \h </w:instrText>
         </w:r>
         <w:r>
           <w:rPr>
@@ -2693,7 +2693,7 @@
           <w14:ligatures w14:val="standardContextual"/>
         </w:rPr>
       </w:pPr>
-      <w:hyperlink w:anchor="_Toc243416140" w:history="1">
+      <w:hyperlink w:anchor="_Toc243418768" w:history="1">
         <w:r>
           <w:rPr>
             <w:rStyle w:val="Hyperlink"/>
@@ -2728,7 +2728,7 @@
             <w:noProof/>
             <w:webHidden/>
           </w:rPr>
-          <w:instrText xml:space="preserve"> PAGEREF _Toc243416140 \h </w:instrText>
+          <w:instrText xml:space="preserve"> PAGEREF _Toc243418768 \h </w:instrText>
         </w:r>
         <w:r>
           <w:rPr>
@@ -2774,7 +2774,7 @@
           <w14:ligatures w14:val="standardContextual"/>
         </w:rPr>
       </w:pPr>
-      <w:hyperlink w:anchor="_Toc243416141" w:history="1">
+      <w:hyperlink w:anchor="_Toc243418769" w:history="1">
         <w:r>
           <w:rPr>
             <w:rStyle w:val="Hyperlink"/>
@@ -2809,7 +2809,7 @@
             <w:noProof/>
             <w:webHidden/>
           </w:rPr>
-          <w:instrText xml:space="preserve"> PAGEREF _Toc243416141 \h </w:instrText>
+          <w:instrText xml:space="preserve"> PAGEREF _Toc243418769 \h </w:instrText>
         </w:r>
         <w:r>
           <w:rPr>
@@ -2855,7 +2855,7 @@
           <w14:ligatures w14:val="standardContextual"/>
         </w:rPr>
       </w:pPr>
-      <w:hyperlink w:anchor="_Toc243416142" w:history="1">
+      <w:hyperlink w:anchor="_Toc243418770" w:history="1">
         <w:r>
           <w:rPr>
             <w:rStyle w:val="Hyperlink"/>
@@ -2890,7 +2890,7 @@
             <w:noProof/>
             <w:webHidden/>
           </w:rPr>
-          <w:instrText xml:space="preserve"> PAGEREF _Toc243416142 \h </w:instrText>
+          <w:instrText xml:space="preserve"> PAGEREF _Toc243418770 \h </w:instrText>
         </w:r>
         <w:r>
           <w:rPr>
@@ -2936,7 +2936,7 @@
           <w14:ligatures w14:val="standardContextual"/>
         </w:rPr>
       </w:pPr>
-      <w:hyperlink w:anchor="_Toc243416143" w:history="1">
+      <w:hyperlink w:anchor="_Toc243418771" w:history="1">
         <w:r>
           <w:rPr>
             <w:rStyle w:val="Hyperlink"/>
@@ -2971,7 +2971,7 @@
             <w:noProof/>
             <w:webHidden/>
           </w:rPr>
-          <w:instrText xml:space="preserve"> PAGEREF _Toc243416143 \h </w:instrText>
+          <w:instrText xml:space="preserve"> PAGEREF _Toc243418771 \h </w:instrText>
         </w:r>
         <w:r>
           <w:rPr>
@@ -3017,7 +3017,7 @@
           <w14:ligatures w14:val="standardContextual"/>
         </w:rPr>
       </w:pPr>
-      <w:hyperlink w:anchor="_Toc243416144" w:history="1">
+      <w:hyperlink w:anchor="_Toc243418772" w:history="1">
         <w:r>
           <w:rPr>
             <w:rStyle w:val="Hyperlink"/>
@@ -3052,7 +3052,7 @@
             <w:noProof/>
             <w:webHidden/>
           </w:rPr>
-          <w:instrText xml:space="preserve"> PAGEREF _Toc243416144 \h </w:instrText>
+          <w:instrText xml:space="preserve"> PAGEREF _Toc243418772 \h </w:instrText>
         </w:r>
         <w:r>
           <w:rPr>
@@ -3127,7 +3127,7 @@
       <w:r>
         <w:fldChar w:fldCharType="separate"/>
       </w:r>
-      <w:hyperlink w:anchor="_Toc243416145" w:history="1">
+      <w:hyperlink w:anchor="_Toc243418773" w:history="1">
         <w:r>
           <w:rPr>
             <w:rStyle w:val="Hyperlink"/>
@@ -3162,7 +3162,7 @@
             <w:noProof/>
             <w:webHidden/>
           </w:rPr>
-          <w:instrText xml:space="preserve"> PAGEREF _Toc243416145 \h </w:instrText>
+          <w:instrText xml:space="preserve"> PAGEREF _Toc243418773 \h </w:instrText>
         </w:r>
         <w:r>
           <w:rPr>
@@ -3208,7 +3208,7 @@
           <w14:ligatures w14:val="standardContextual"/>
         </w:rPr>
       </w:pPr>
-      <w:hyperlink w:anchor="_Toc243416146" w:history="1">
+      <w:hyperlink w:anchor="_Toc243418774" w:history="1">
         <w:r>
           <w:rPr>
             <w:rStyle w:val="Hyperlink"/>
@@ -3243,7 +3243,7 @@
             <w:noProof/>
             <w:webHidden/>
           </w:rPr>
-          <w:instrText xml:space="preserve"> PAGEREF _Toc243416146 \h </w:instrText>
+          <w:instrText xml:space="preserve"> PAGEREF _Toc243418774 \h </w:instrText>
         </w:r>
         <w:r>
           <w:rPr>
@@ -3289,7 +3289,7 @@
           <w14:ligatures w14:val="standardContextual"/>
         </w:rPr>
       </w:pPr>
-      <w:hyperlink w:anchor="_Toc243416147" w:history="1">
+      <w:hyperlink w:anchor="_Toc243418775" w:history="1">
         <w:r>
           <w:rPr>
             <w:rStyle w:val="Hyperlink"/>
@@ -3324,7 +3324,7 @@
             <w:noProof/>
             <w:webHidden/>
           </w:rPr>
-          <w:instrText xml:space="preserve"> PAGEREF _Toc243416147 \h </w:instrText>
+          <w:instrText xml:space="preserve"> PAGEREF _Toc243418775 \h </w:instrText>
         </w:r>
         <w:r>
           <w:rPr>
@@ -3370,7 +3370,7 @@
           <w14:ligatures w14:val="standardContextual"/>
         </w:rPr>
       </w:pPr>
-      <w:hyperlink w:anchor="_Toc243416148" w:history="1">
+      <w:hyperlink w:anchor="_Toc243418776" w:history="1">
         <w:r>
           <w:rPr>
             <w:rStyle w:val="Hyperlink"/>
@@ -3405,7 +3405,7 @@
             <w:noProof/>
             <w:webHidden/>
           </w:rPr>
-          <w:instrText xml:space="preserve"> PAGEREF _Toc243416148 \h </w:instrText>
+          <w:instrText xml:space="preserve"> PAGEREF _Toc243418776 \h </w:instrText>
         </w:r>
         <w:r>
           <w:rPr>
@@ -3451,7 +3451,7 @@
           <w14:ligatures w14:val="standardContextual"/>
         </w:rPr>
       </w:pPr>
-      <w:hyperlink w:anchor="_Toc243416149" w:history="1">
+      <w:hyperlink w:anchor="_Toc243418777" w:history="1">
         <w:r>
           <w:rPr>
             <w:rStyle w:val="Hyperlink"/>
@@ -3486,7 +3486,7 @@
             <w:noProof/>
             <w:webHidden/>
           </w:rPr>
-          <w:instrText xml:space="preserve"> PAGEREF _Toc243416149 \h </w:instrText>
+          <w:instrText xml:space="preserve"> PAGEREF _Toc243418777 \h </w:instrText>
         </w:r>
         <w:r>
           <w:rPr>
@@ -3532,7 +3532,7 @@
           <w14:ligatures w14:val="standardContextual"/>
         </w:rPr>
       </w:pPr>
-      <w:hyperlink w:anchor="_Toc243416150" w:history="1">
+      <w:hyperlink w:anchor="_Toc243418778" w:history="1">
         <w:r>
           <w:rPr>
             <w:rStyle w:val="Hyperlink"/>
@@ -3567,7 +3567,7 @@
             <w:noProof/>
             <w:webHidden/>
           </w:rPr>
-          <w:instrText xml:space="preserve"> PAGEREF _Toc243416150 \h </w:instrText>
+          <w:instrText xml:space="preserve"> PAGEREF _Toc243418778 \h </w:instrText>
         </w:r>
         <w:r>
           <w:rPr>
@@ -3613,7 +3613,7 @@
           <w14:ligatures w14:val="standardContextual"/>
         </w:rPr>
       </w:pPr>
-      <w:hyperlink w:anchor="_Toc243416151" w:history="1">
+      <w:hyperlink w:anchor="_Toc243418779" w:history="1">
         <w:r>
           <w:rPr>
             <w:rStyle w:val="Hyperlink"/>
@@ -3648,7 +3648,7 @@
             <w:noProof/>
             <w:webHidden/>
           </w:rPr>
-          <w:instrText xml:space="preserve"> PAGEREF _Toc243416151 \h </w:instrText>
+          <w:instrText xml:space="preserve"> PAGEREF _Toc243418779 \h </w:instrText>
         </w:r>
         <w:r>
           <w:rPr>
@@ -3694,7 +3694,7 @@
           <w14:ligatures w14:val="standardContextual"/>
         </w:rPr>
       </w:pPr>
-      <w:hyperlink w:anchor="_Toc243416152" w:history="1">
+      <w:hyperlink w:anchor="_Toc243418780" w:history="1">
         <w:r>
           <w:rPr>
             <w:rStyle w:val="Hyperlink"/>
@@ -3729,7 +3729,7 @@
             <w:noProof/>
             <w:webHidden/>
           </w:rPr>
-          <w:instrText xml:space="preserve"> PAGEREF _Toc243416152 \h </w:instrText>
+          <w:instrText xml:space="preserve"> PAGEREF _Toc243418780 \h </w:instrText>
         </w:r>
         <w:r>
           <w:rPr>
@@ -3775,7 +3775,7 @@
           <w14:ligatures w14:val="standardContextual"/>
         </w:rPr>
       </w:pPr>
-      <w:hyperlink w:anchor="_Toc243416153" w:history="1">
+      <w:hyperlink w:anchor="_Toc243418781" w:history="1">
         <w:r>
           <w:rPr>
             <w:rStyle w:val="Hyperlink"/>
@@ -3810,7 +3810,7 @@
             <w:noProof/>
             <w:webHidden/>
           </w:rPr>
-          <w:instrText xml:space="preserve"> PAGEREF _Toc243416153 \h </w:instrText>
+          <w:instrText xml:space="preserve"> PAGEREF _Toc243418781 \h </w:instrText>
         </w:r>
         <w:r>
           <w:rPr>
@@ -4441,7 +4441,7 @@
         <w:pStyle w:val="BDSkyriusnenumeruojamas"/>
         <w:pageBreakBefore/>
       </w:pPr>
-      <w:bookmarkStart w:id="2" w:name="_Toc243416154"/>
+      <w:bookmarkStart w:id="2" w:name="_Toc243418782"/>
       <w:r>
         <w:lastRenderedPageBreak/>
         <w:t>Introduction</w:t>
@@ -4459,7 +4459,10 @@
         <w:t>Relevance of the research.</w:t>
       </w:r>
       <w:r>
-        <w:t xml:space="preserve"> Natural language processing (NLP) is the branch of artificial intelligence that enables computers to analyse, understand and generate human language. For decades the field relied on hand-crafted features and statistical models such as n-gram language models, naive Bayes classifiers and support vector machines. In the 2010s these were gradually replaced by neural networks: word embeddings such as word2vec (Mikolov et al., 2013) gave words dense vector representations, and recurrent neural networks, in particular long short-term memory networks (Hochreiter &amp; Schmidhuber, 1997), became the standard way to model sentences. Recurrent networks, however, process text one token at a time, which makes training slow and makes it difficult to capture dependencies between words that are far apart.</w:t>
+        <w:t xml:space="preserve"> Natural language processing (NLP) is the branch of artificial intelligence that enables computers to analyse, understand and generate human language. For decades the field relied on hand-crafted features and statistical models such as n-gram language models, naive Bayes classifiers and support vector machines. In the 2010s these were gradually replaced by neural networks: word embeddings such as word2vec (Mikolov et al., 2013) gave words dense vector representations, and recurrent neural networks, in parti</w:t>
+      </w:r>
+      <w:r>
+        <w:t>cular long short-term memory networks (Hochreiter &amp; Schmidhuber, 1997), became the standard way to model sentences. Recurrent networks, however, process text one token at a time, which makes training slow and makes it difficult to capture dependencies between words that are far apart.</w:t>
       </w:r>
     </w:p>
     <w:p>
@@ -4467,7 +4470,10 @@
         <w:pStyle w:val="BDpagrindinistekstas"/>
       </w:pPr>
       <w:r>
-        <w:t>In 2017 Vaswani et al. proposed the Transformer, an architecture that discards recurrence and relies only on the attention mechanism: every token can directly “look at” every other token, and all positions are processed in parallel. Within two years the Transformer became the foundation of almost every state-of-the-art NLP system. BERT (Devlin et al., 2019) showed that a Transformer encoder pre-trained on unlabelled text can be fine-tuned to beat previous results on eleven language understanding tasks, and the GPT series (Radford et al., 2018; Brown et al., 2020) showed that a Transformer decoder trained to predict the next word becomes a general-purpose text generator. Today Transformers power machine translation, search engines, chat assistants and document analysis systems.</w:t>
+        <w:t xml:space="preserve">In 2017 Vaswani et al. proposed the Transformer, an architecture that discards recurrence and relies only on the attention mechanism: every token can directly “look at” every other token, and all positions are processed in parallel. Within two years the Transformer became the foundation of almost every state-of-the-art NLP system. BERT (Devlin et al., 2019) showed that a Transformer encoder pre-trained on unlabelled text can be fine-tuned to beat previous results on eleven language understanding tasks, and </w:t>
+      </w:r>
+      <w:r>
+        <w:t>the GPT series (Radford et al., 2018; Brown et al., 2020) showed that a Transformer decoder trained to predict the next word becomes a general-purpose text generator. Today Transformers power machine translation, search engines, chat assistants and document analysis systems.</w:t>
       </w:r>
     </w:p>
     <w:p>
@@ -4475,7 +4481,10 @@
         <w:pStyle w:val="BDpagrindinistekstas"/>
       </w:pPr>
       <w:r>
-        <w:t>The topic is relevant for three reasons. First, Transformers are now the default tool of NLP practitioners, so engineers need to understand both how they work and when they are worth their cost. Second, the computational price of these models is high (Strubell et al., 2019), so an informed choice between a small classical model, a compact Transformer and a large pre-trained model has a real economic and environmental impact. Third, for smaller languages such as Lithuanian, the question of how well Transformer methods work with limited labelled data is directly connected to the digital sustainability of the language (Ulčar &amp; Robnik-Šikonja, 2021; Nakvosas et al., 2024).</w:t>
+        <w:t>The topic is relevant for three reasons. First, Transformers are now the default tool of NLP practitioners, so engineers need to understand both how they work and when they are worth their cost. Second, the computational price of these models is high (Strubell et al., 2019), so an informed choice between a small classical model, a compact Transformer and a large pre-trained model has a real economic and environmental impact. Third, for smaller languages such as Lithuanian, the question of how well Transform</w:t>
+      </w:r>
+      <w:r>
+        <w:t>er methods work with limited labelled data is directly connected to the digital sustainability of the language (Ulčar &amp; Robnik-Šikonja, 2021; Nakvosas et al., 2024).</w:t>
       </w:r>
     </w:p>
     <w:p>
@@ -4489,7 +4498,10 @@
         <w:t>Research problem.</w:t>
       </w:r>
       <w:r>
-        <w:t xml:space="preserve"> Published benchmarks usually report the accuracy of the largest models trained on GPU clusters with the full training set. A student, a small company or a public institution, by contrast, often has only an ordinary computer, a limited number of labelled examples and a need for fast predictions. The research problem is therefore: how large is the practical advantage of Transformer models over classical and recurrent approaches for a typical NLP task (sentiment classification), and at what cost in training time, inference latency and model size, when all experiments are carried out on a standard CPU-only laptop?</w:t>
+        <w:t xml:space="preserve"> Published benchmarks usually report the accuracy of the largest models trained on GPU clusters with the full training set. A student, a small company or a public institution, by contrast, often has only an ordinary computer, a limited number of labelled examples and a need for fast predictions. The research problem is therefore: how large is the practical advantage of Transformer models over classical and recurrent approaches for a typical NLP task (sentiment classification), and at what cost in training t</w:t>
+      </w:r>
+      <w:r>
+        <w:t>ime, inference latency and model size, when all experiments are carried out on a standard CPU-only laptop?</w:t>
       </w:r>
     </w:p>
     <w:p>
@@ -4653,7 +4665,7 @@
         </w:numPr>
         <w:spacing w:before="120"/>
       </w:pPr>
-      <w:bookmarkStart w:id="3" w:name="_Toc243416145"/>
+      <w:bookmarkStart w:id="3" w:name="_Toc243418773"/>
       <w:r>
         <w:rPr>
           <w:b/>
@@ -4880,7 +4892,7 @@
         <w:pStyle w:val="BDSkyrius1lygio"/>
         <w:pageBreakBefore/>
       </w:pPr>
-      <w:bookmarkStart w:id="4" w:name="_Toc243416155"/>
+      <w:bookmarkStart w:id="4" w:name="_Toc243418783"/>
       <w:r>
         <w:lastRenderedPageBreak/>
         <w:t>Literature Review</w:t>
@@ -4891,7 +4903,7 @@
       <w:pPr>
         <w:pStyle w:val="BDSkyrius2lygio"/>
       </w:pPr>
-      <w:bookmarkStart w:id="5" w:name="_Toc243416156"/>
+      <w:bookmarkStart w:id="5" w:name="_Toc243418784"/>
       <w:r>
         <w:t>Search strategy</w:t>
       </w:r>
@@ -4918,14 +4930,17 @@
         <w:pStyle w:val="BDpagrindinistekstas"/>
       </w:pPr>
       <w:r>
-        <w:t>For the Lithuanian part the query was narrowed with the terms (“Lithuanian” OR “Baltic languages”). Both databases return thousands of records for the core query, so the results were sorted by relevance and citation count and screened by title and abstract. The inclusion criteria were: (1) the publication proposes or evaluates a Transformer-based model or an important predecessor; (2) it reports results on a text classification or language understanding task, or describes a widely used model; (3) it is peer-reviewed or a widely cited technical report. Seminal works (the original Transformer, BERT, GPT, RoBERTa, DistilBERT and others) were added through backward citation tracking. About 40 publications were kept for analysis; the most important of them are summarised in Table 2.</w:t>
+        <w:t>For the Lithuanian part the query was narrowed with the terms (“Lithuanian” OR “Baltic languages”). Both databases return thousands of records for the core query, so the results were sorted by relevance and citation count and screened by title and abstract. The inclusion criteria were: (1) the publication proposes or evaluates a Transformer-based model or an important predecessor; (2) it reports results on a text classification or language understanding task, or describes a widely used model; (3) it is peer</w:t>
+      </w:r>
+      <w:r>
+        <w:t>-reviewed or a widely cited technical report. Seminal works (the original Transformer, BERT, GPT, RoBERTa, DistilBERT and others) were added through backward citation tracking. About 40 publications were kept for analysis; the most important of them are summarised in Table 2.</w:t>
       </w:r>
     </w:p>
     <w:p>
       <w:pPr>
         <w:pStyle w:val="BDSkyrius2lygio"/>
       </w:pPr>
-      <w:bookmarkStart w:id="6" w:name="_Toc243416157"/>
+      <w:bookmarkStart w:id="6" w:name="_Toc243418785"/>
       <w:r>
         <w:t>From word vectors to the Transformer</w:t>
       </w:r>
@@ -4936,7 +4951,10 @@
         <w:pStyle w:val="BDpagrindinistekstas"/>
       </w:pPr>
       <w:r>
-        <w:t>Early neural approaches represented each word by a static vector, learned with word2vec (Mikolov et al., 2013) or similar methods, and combined these vectors with convolutional or recurrent networks. Such vectors cannot distinguish the meanings of an ambiguous word in different contexts. Bahdanau et al. (2015) introduced the attention mechanism for machine translation, allowing the decoder of a recurrent model to focus on the relevant parts of the source sentence. Contextual representations followed: ELMo (Peters et al., 2018) computed word vectors with a deep bidirectional LSTM language model, and ULMFiT (Howard &amp; Ruder, 2018) showed that a pre-trained language model can be fine-tuned for text classification with very little labelled data. These works established the “pre-train, then fine-tune” paradigm that the Transformer later made dominant.</w:t>
+        <w:t>Early neural approaches represented each word by a static vector, learned with word2vec (Mikolov et al., 2013) or similar methods, and combined these vectors with convolutional or recurrent networks. Such vectors cannot distinguish the meanings of an ambiguous word in different contexts. Bahdanau et al. (2015) introduced the attention mechanism for machine translation, allowing the decoder of a recurrent model to focus on the relevant parts of the source sentence. Contextual representations followed: ELMo (</w:t>
+      </w:r>
+      <w:r>
+        <w:t>Peters et al., 2018) computed word vectors with a deep bidirectional LSTM language model, and ULMFiT (Howard &amp; Ruder, 2018) showed that a pre-trained language model can be fine-tuned for text classification with very little labelled data. These works established the “pre-train, then fine-tune” paradigm that the Transformer later made dominant.</w:t>
       </w:r>
     </w:p>
     <w:p>
@@ -4951,7 +4969,7 @@
       <w:pPr>
         <w:pStyle w:val="BDSkyrius2lygio"/>
       </w:pPr>
-      <w:bookmarkStart w:id="7" w:name="_Toc243416158"/>
+      <w:bookmarkStart w:id="7" w:name="_Toc243418786"/>
       <w:r>
         <w:t>Families of pre-trained Transformer models</w:t>
       </w:r>
@@ -4970,7 +4988,13 @@
         <w:pStyle w:val="BDpagrindinistekstas"/>
       </w:pPr>
       <w:r>
-        <w:t>Encoder-only models. BERT (Devlin et al., 2019) pre-trains a Transformer encoder with masked language modelling, in which 15% of the tokens are hidden and the model has to predict them from the context on both sides. BERT-base (110 million parameters) and BERT-large (340 million) set new records on the GLUE benchmark (Wang et al., 2019), including SST-2 sentiment classification. RoBERTa (Liu et al., 2019) showed that BERT was under-trained and obtained better results simply by training longer on more data, with larger batches and without the next-sentence prediction task. ALBERT (Lan et al., 2020) reduced the number of parameters through factorised embeddings and cross-layer parameter sharing; ELECTRA (Clark et al., 2020) replaced masked language modelling with a more sample-efficient “replaced token detection” objective; DeBERTa (He et al., 2021) separated content and position information in attention and was the first model to exceed the human baseline on the SuperGLUE benchmark. XLM-RoBERTa (Conneau et al., 2020) extended the approach to 100 languages, including Lithuanian.</w:t>
+        <w:t xml:space="preserve">Encoder-only models. BERT (Devlin et al., 2019) pre-trains a Transformer encoder with masked language modelling, in which 15% of the tokens are hidden and the model has to predict them from the context on both sides. BERT-base (110 million parameters) and BERT-large (340 million) set new records on the GLUE benchmark (Wang et al., 2019), including SST-2 sentiment classification. RoBERTa (Liu et al., 2019) showed that BERT was under-trained and obtained better results simply by training longer on more data, </w:t>
+      </w:r>
+      <w:r>
+        <w:t>with larger batches and without the next-sentence prediction task. ALBERT (Lan et al., 2020) reduced the number of parameters through factorised embeddings and cross-layer parameter sharing; ELECTRA (Clark et al., 2020) replaced masked language modelling with a more sample-efficient “replaced token detection” objective; DeBERTa (He et al., 2021) separated content and position information in attention and was the first model to exceed the human baseline on the SuperGLUE benchmark. XLM-RoBERTa (Conneau et al.</w:t>
+      </w:r>
+      <w:r>
+        <w:t>, 2020) extended the approach to 100 languages, including Lithuanian.</w:t>
       </w:r>
     </w:p>
     <w:p>
@@ -4990,14 +5014,17 @@
         <w:pStyle w:val="BDpagrindinistekstas"/>
       </w:pPr>
       <w:r>
-        <w:t>Decoder-only and encoder–decoder models. GPT (Radford et al., 2018) pre-trains a Transformer decoder as a left-to-right language model. GPT-3 (Brown et al., 2020), with 175 billion parameters, showed that a sufficiently large model can perform new tasks from instructions and a few examples placed in the prompt (in-context learning) without any fine-tuning. Instruction tuning with human feedback made such models usable as assistants. Encoder–decoder models such as T5 (Raffel et al., 2020), which casts every task as text-to-text, and BART (Lewis et al., 2020) are particularly strong for generation tasks such as summarisation and translation.</w:t>
+        <w:t xml:space="preserve">Decoder-only and encoder–decoder models. GPT (Radford et al., 2018) pre-trains a Transformer decoder as a left-to-right language model. GPT-3 (Brown et al., 2020), with 175 billion </w:t>
+      </w:r>
+      <w:r>
+        <w:t>parameters, showed that a sufficiently large model can perform new tasks from instructions and a few examples placed in the prompt (in-context learning) without any fine-tuning. Instruction tuning with human feedback made such models usable as assistants. Encoder–decoder models such as T5 (Raffel et al., 2020), which casts every task as text-to-text, and BART (Lewis et al., 2020) are particularly strong for generation tasks such as summarisation and translation.</w:t>
       </w:r>
     </w:p>
     <w:p>
       <w:pPr>
         <w:pStyle w:val="BDSkyrius2lygio"/>
       </w:pPr>
-      <w:bookmarkStart w:id="8" w:name="_Toc243416159"/>
+      <w:bookmarkStart w:id="8" w:name="_Toc243418787"/>
       <w:r>
         <w:t>Transformers for sentiment analysis and text classification</w:t>
       </w:r>
@@ -5016,7 +5043,10 @@
         <w:pStyle w:val="BDpagrindinistekstas"/>
       </w:pPr>
       <w:r>
-        <w:t>Sun et al. (2019) studied how to fine-tune BERT for text classification and showed that the choice of learning rate, layer-wise learning rates and further in-domain pre-training strongly influence the result. Yin et al. (2019) proposed zero-shot text classification by reformulating classification as natural language inference (NLI): the text is the premise and a sentence such as “This text is about sport” is the hypothesis. This allows a model trained on NLI data to classify text into arbitrary labels without any task-specific training examples. Loureiro et al. (2022) trained RoBERTa models on Twitter data and showed that domain-specific pre-training matters for social-media text. Zhang et al. (2024) evaluated large language models such as ChatGPT on sentiment tasks and found that, while zero-shot LLMs are competitive on simple binary sentiment, smaller fine-tuned models still outperform them on tasks that require structured or fine-grained sentiment understanding.</w:t>
+        <w:t>Sun et al. (2019) studied how to fine-tune BERT for text classification and showed that the choice of learning rate, layer-wise learning rates and further in-domain pre-training strongly influence the result. Yin et al. (2019) proposed zero-shot text classification by reformulating classification as natural language inference (NLI): the text is the premise and a sentence such as “This text is about sport” is the hypothesis. This allows a model trained on NLI data to classify text into arbitrary labels witho</w:t>
+      </w:r>
+      <w:r>
+        <w:t>ut any task-specific training examples. Loureiro et al. (2022) trained RoBERTa models on Twitter data and showed that domain-specific pre-training matters for social-media text. Zhang et al. (2024) evaluated large language models such as ChatGPT on sentiment tasks and found that, while zero-shot LLMs are competitive on simple binary sentiment, smaller fine-tuned models still outperform them on tasks that require structured or fine-grained sentiment understanding.</w:t>
       </w:r>
     </w:p>
     <w:p>
@@ -5031,7 +5061,7 @@
       <w:pPr>
         <w:pStyle w:val="BDSkyrius2lygio"/>
       </w:pPr>
-      <w:bookmarkStart w:id="9" w:name="_Toc243416160"/>
+      <w:bookmarkStart w:id="9" w:name="_Toc243418788"/>
       <w:r>
         <w:t>Research in Lithuania</w:t>
       </w:r>
@@ -5042,7 +5072,10 @@
         <w:pStyle w:val="BDpagrindinistekstas"/>
       </w:pPr>
       <w:r>
-        <w:t>Lithuanian is a morphologically rich language with free word order and relatively few annotated resources, which makes it a challenging case for NLP. Kapočiūtė-Dzikienė et al. (2013) compared machine learning and lexicon-based approaches for sentiment classification of Lithuanian Internet comments and found that the specifics of the language (rich inflection, non-normative spelling in comments) strongly affect the choice of features. In a later study, Kapočiūtė-Dzikienė, Damaševičius and Woźniak (2019) compared traditional classifiers (multinomial naive Bayes, support vector machines) with deep neural networks (LSTM and CNN with word embeddings) on a dataset of Lithuanian comments in a three-class setting (positive, negative, neutral). Interestingly, the best traditional method (naive Bayes, about 0.735 accuracy) outperformed the best deep learning model (CNN with FastText embeddings, about 0.706), showing that neural models without pre-training do not automatically win when data are limited.</w:t>
+        <w:t>Lithuanian is a morphologically rich language with free word order and relatively few annotated resources, which makes it a challenging case for NLP. Kapočiūtė-Dzikienė et al. (2013) compared machine learning and lexicon-based approaches for sentiment classification of Lithuanian Internet comments and found that the specifics of the language (rich inflection, non-normative spelling in comments) strongly affect the choice of features. In a later study, Kapočiūtė-Dzikienė, Damaševičius and Woźniak (2019) comp</w:t>
+      </w:r>
+      <w:r>
+        <w:t>ared traditional classifiers (multinomial naive Bayes, support vector machines) with deep neural networks (LSTM and CNN with word embeddings) on a dataset of Lithuanian comments in a three-class setting (positive, negative, neutral). Interestingly, the best traditional method (naive Bayes, about 0.735 accuracy) outperformed the best deep learning model (CNN with FastText embeddings, about 0.706), showing that neural models without pre-training do not automatically win when data are limited.</w:t>
       </w:r>
     </w:p>
     <w:p>
@@ -5054,14 +5087,17 @@
       </w:r>
       <w:r>
         <w:lastRenderedPageBreak/>
-        <w:t>languages outperform massively multilingual models on most tasks. Vileikytė, Lukoševičius and Stankevičius (2024) from Kaunas University of Technology fine-tuned multilingual BERT and T5 models for sentiment analysis of Lithuanian online reviews from several domains, reporting high accuracy on clearly polar reviews and lower accuracy on ambiguous middle ratings. Nakvosas, Daniušis and Mulevičius (2024) from the Vilnius company Neurotechnology released the first open Llama2-based large language models for Lithuanian (7 and 13 billion parameters), pre-trained on more than 14 billion Lithuanian tokens, together with translated evaluation benchmarks.</w:t>
+        <w:t>languages outperform massively multilingual models on most tasks. Vileikytė, Lukoševičius and Stankevičius (2024) from Kaunas University of Technology fine-tuned multilingual BERT and T5 models for sentiment analysis of Lithuanian online reviews from several domains, reporting high accuracy on clearly polar reviews and lower accuracy on ambiguous middle ratings. Nakvosas, Daniušis and Mulevičius (2024) from the Vilnius company Neurotechnology released the first open Llama2-based large language models for Li</w:t>
+      </w:r>
+      <w:r>
+        <w:t>thuanian (7 and 13 billion parameters), pre-trained on more than 14 billion Lithuanian tokens, together with translated evaluation benchmarks.</w:t>
       </w:r>
     </w:p>
     <w:p>
       <w:pPr>
         <w:pStyle w:val="BDSkyrius2lygio"/>
       </w:pPr>
-      <w:bookmarkStart w:id="10" w:name="_Toc243416161"/>
+      <w:bookmarkStart w:id="10" w:name="_Toc243418789"/>
       <w:r>
         <w:t>Comparative summary</w:t>
       </w:r>
@@ -5084,7 +5120,7 @@
         </w:numPr>
         <w:spacing w:before="120"/>
       </w:pPr>
-      <w:bookmarkStart w:id="11" w:name="_Toc243416146"/>
+      <w:bookmarkStart w:id="11" w:name="_Toc243418774"/>
       <w:r>
         <w:rPr>
           <w:b/>
@@ -5296,7 +5332,10 @@
               <w:keepNext/>
             </w:pPr>
             <w:r>
-              <w:t>Created SST; NB ≈ 82%, SVM ≈ 79%, RNTN 85.4% (binary)</w:t>
+              <w:t xml:space="preserve">Created SST; NB ≈ 82%, SVM ≈ 79%, RNTN 85.4% </w:t>
+            </w:r>
+            <w:r>
+              <w:t>(binary)</w:t>
             </w:r>
           </w:p>
         </w:tc>
@@ -5606,7 +5645,10 @@
               <w:keepNext/>
             </w:pPr>
             <w:r>
-              <w:t>Pre-training compact models matters</w:t>
+              <w:t xml:space="preserve">Pre-training compact models </w:t>
+            </w:r>
+            <w:r>
+              <w:t>matters</w:t>
             </w:r>
           </w:p>
         </w:tc>
@@ -6052,7 +6094,7 @@
       <w:pPr>
         <w:pStyle w:val="BDSkyrius2lygio"/>
       </w:pPr>
-      <w:bookmarkStart w:id="12" w:name="_Toc243416162"/>
+      <w:bookmarkStart w:id="12" w:name="_Toc243418790"/>
       <w:r>
         <w:t>Conclusions of the literature review</w:t>
       </w:r>
@@ -6077,7 +6119,10 @@
         <w:ind w:firstLine="0"/>
       </w:pPr>
       <w:r>
-        <w:t>Transformer models are the state of the art for text classification; on SST-2 fine-tuned Transformers exceed 90% accuracy, compared with roughly 79–83% for classical models.</w:t>
+        <w:t xml:space="preserve">Transformer models are the state of </w:t>
+      </w:r>
+      <w:r>
+        <w:t>the art for text classification; on SST-2 fine-tuned Transformers exceed 90% accuracy, compared with roughly 79–83% for classical models.</w:t>
       </w:r>
     </w:p>
     <w:p>
@@ -6136,7 +6181,7 @@
         <w:pStyle w:val="BDSkyrius1lygio"/>
         <w:pageBreakBefore/>
       </w:pPr>
-      <w:bookmarkStart w:id="13" w:name="_Toc243416163"/>
+      <w:bookmarkStart w:id="13" w:name="_Toc243418791"/>
       <w:r>
         <w:lastRenderedPageBreak/>
         <w:t>Research Methodology</w:t>
@@ -6147,7 +6192,7 @@
       <w:pPr>
         <w:pStyle w:val="BDSkyrius2lygio"/>
       </w:pPr>
-      <w:bookmarkStart w:id="14" w:name="_Toc243416164"/>
+      <w:bookmarkStart w:id="14" w:name="_Toc243418792"/>
       <w:r>
         <w:t>Problem formulation</w:t>
       </w:r>
@@ -6158,7 +6203,19 @@
         <w:pStyle w:val="BDpagrindinistekstas"/>
       </w:pPr>
       <w:r>
-        <w:t>The practical task is binary sentiment classification of English sentences. Given a sentence x = (w₁, w₂, …, wₙ), the goal is to learn a function f(x) → y, where y ∈ {0, 1} denotes negative or positive sentiment. The classifier is learned from a labelled training set D = {(xᵢ, yᵢ)}, i = 1, …, N, and its quality is measured on a separate test set that is never used for training or model selection.</w:t>
+        <w:t>The practical task is binary sentiment classification of English sentences. Given a sentence x = (w₁, w₂, …, wₙ), the goal is to learn a function f(x) → y, where y ∈ {0, 1} denotes negative or positive sentiment. The classifier is learned from a labelled training set D = {(x</w:t>
+      </w:r>
+      <w:r>
+        <w:t>ᵢ</w:t>
+      </w:r>
+      <w:r>
+        <w:t>, y</w:t>
+      </w:r>
+      <w:r>
+        <w:t>ᵢ</w:t>
+      </w:r>
+      <w:r>
+        <w:t>)}, i = 1, …, N, and its quality is measured on a separate test set that is never used for training or model selection.</w:t>
       </w:r>
     </w:p>
     <w:p>
@@ -6166,7 +6223,10 @@
         <w:pStyle w:val="BDpagrindinistekstas"/>
       </w:pPr>
       <w:r>
-        <w:t>Sentiment classification was chosen for three reasons. First, it is one of the most common real-world applications of NLP (customer reviews, social media monitoring, product feedback). Second, it is a standard benchmark with published results for all model families, so our results can be compared with the literature (Table 2). Third, the task contains linguistic phenomena that are difficult for simple models, such as negation (“not good”), contrast (“the plot is weak, but the acting is great”) and sarcasm, which makes it a good test of the contextual understanding provided by self-attention.</w:t>
+        <w:t xml:space="preserve">Sentiment classification was chosen for three reasons. First, it is one of the most common real-world applications of NLP (customer reviews, social media monitoring, product feedback). Second, it is a standard benchmark with published results for all model families, so our results can be compared with the literature (Table 2). Third, the task contains linguistic phenomena that are difficult for simple models, such as negation (“not good”), contrast (“the plot is weak, but the acting is great”) and sarcasm, </w:t>
+      </w:r>
+      <w:r>
+        <w:t>which makes it a good test of the contextual understanding provided by self-attention.</w:t>
       </w:r>
     </w:p>
     <w:p>
@@ -6188,7 +6248,10 @@
         <w:ind w:firstLine="0"/>
       </w:pPr>
       <w:r>
-        <w:t>RQ1. How much more accurate are Transformer models than classical and recurrent models on the same data?</w:t>
+        <w:t xml:space="preserve">RQ1. How much more accurate are Transformer models than classical and recurrent models on the </w:t>
+      </w:r>
+      <w:r>
+        <w:t>same data?</w:t>
       </w:r>
     </w:p>
     <w:p>
@@ -6251,7 +6314,7 @@
       <w:pPr>
         <w:pStyle w:val="BDSkyrius2lygio"/>
       </w:pPr>
-      <w:bookmarkStart w:id="15" w:name="_Toc243416165"/>
+      <w:bookmarkStart w:id="15" w:name="_Toc243418793"/>
       <w:r>
         <w:t>Dataset</w:t>
       </w:r>
@@ -6262,7 +6325,10 @@
         <w:pStyle w:val="BDpagrindinistekstas"/>
       </w:pPr>
       <w:r>
-        <w:t>The Stanford Sentiment Treebank (SST) was built by Socher et al. (2013) from 11,855 sentences of movie reviews from the website Rotten Tomatoes. Each sentence was parsed into a tree and every phrase was annotated by three human judges. The binary version SST-2, included in the GLUE benchmark (Wang et al., 2019), removes neutral sentences and contains 67,349 training phrases and sentences and 872 validation sentences. Test labels of GLUE are hidden, therefore, following common practice, we used the official validation set as our held-out test set. For model selection (choosing the best epoch) we randomly separated 2,000 examples from the training data as a development set, stratified by class. The resulting splits are shown in Table 3.</w:t>
+        <w:t xml:space="preserve">The Stanford Sentiment Treebank (SST) was built by Socher et al. (2013) from 11,855 sentences of movie reviews from the website Rotten Tomatoes. Each sentence was parsed into a tree and every phrase was annotated by three human judges. The binary version SST-2, included in the GLUE benchmark (Wang et al., 2019), removes neutral sentences and contains 67,349 training phrases and sentences and 872 validation sentences. Test labels of GLUE are hidden, therefore, following common practice, we used the official </w:t>
+      </w:r>
+      <w:r>
+        <w:t>validation set as our held-out test set. For model selection (choosing the best epoch) we randomly separated 2,000 examples from the training data as a development set, stratified by class. The resulting splits are shown in Table 3.</w:t>
       </w:r>
     </w:p>
     <w:p>
@@ -6274,7 +6340,7 @@
         </w:numPr>
         <w:spacing w:before="120"/>
       </w:pPr>
-      <w:bookmarkStart w:id="16" w:name="_Toc243416147"/>
+      <w:bookmarkStart w:id="16" w:name="_Toc243418775"/>
       <w:r>
         <w:rPr>
           <w:b/>
@@ -6693,14 +6759,17 @@
         <w:pStyle w:val="BDpagrindinistekstas"/>
       </w:pPr>
       <w:r>
-        <w:t>The training data are slightly imbalanced towards the positive class (about 56%), while the test set is almost balanced. The training set contains many short phrases (the average length is below 10 words), whereas the test set contains complete sentences of about 19 words on average. This difference between training and test distributions is part of the challenge: models must generalise from phrases to whole sentences.</w:t>
+        <w:t xml:space="preserve">The training data are </w:t>
+      </w:r>
+      <w:r>
+        <w:t>slightly imbalanced towards the positive class (about 56%), while the test set is almost balanced. The training set contains many short phrases (the average length is below 10 words), whereas the test set contains complete sentences of about 19 words on average. This difference between training and test distributions is part of the challenge: models must generalise from phrases to whole sentences.</w:t>
       </w:r>
     </w:p>
     <w:p>
       <w:pPr>
         <w:pStyle w:val="BDSkyrius2lygio"/>
       </w:pPr>
-      <w:bookmarkStart w:id="17" w:name="_Toc243416166"/>
+      <w:bookmarkStart w:id="17" w:name="_Toc243418794"/>
       <w:r>
         <w:t>Compared models (competitors)</w:t>
       </w:r>
@@ -6711,7 +6780,10 @@
         <w:pStyle w:val="BDpagrindinistekstas"/>
       </w:pPr>
       <w:r>
-        <w:t>Ten models were selected to represent four approaches that a practitioner can realistically choose from. They are listed in Table 4.</w:t>
+        <w:t xml:space="preserve">Ten models were selected to represent four approaches that a </w:t>
+      </w:r>
+      <w:r>
+        <w:t>practitioner can realistically choose from. They are listed in Table 4.</w:t>
       </w:r>
     </w:p>
     <w:p>
@@ -6723,7 +6795,7 @@
         </w:numPr>
         <w:spacing w:before="120"/>
       </w:pPr>
-      <w:bookmarkStart w:id="18" w:name="_Toc243416148"/>
+      <w:bookmarkStart w:id="18" w:name="_Toc243418776"/>
       <w:r>
         <w:rPr>
           <w:b/>
@@ -7546,7 +7618,10 @@
               <w:keepNext/>
             </w:pPr>
             <w:r>
-              <w:t>Transformer, ready-made</w:t>
+              <w:t xml:space="preserve">Transformer, </w:t>
+            </w:r>
+            <w:r>
+              <w:t>ready-made</w:t>
             </w:r>
           </w:p>
         </w:tc>
@@ -7696,7 +7771,10 @@
         <w:pStyle w:val="BDpagrindinistekstas"/>
       </w:pPr>
       <w:r>
-        <w:t>Note: * for the TF-IDF models the number is the number of n-gram weights, not the number of parameters of a neural network.</w:t>
+        <w:t xml:space="preserve">Note: * for the TF-IDF models the number is the number of n-gram weights, not the number of parameters of a neural </w:t>
+      </w:r>
+      <w:r>
+        <w:t>network.</w:t>
       </w:r>
     </w:p>
     <w:p>
@@ -7704,14 +7782,17 @@
         <w:pStyle w:val="BDpagrindinistekstas"/>
       </w:pPr>
       <w:r>
-        <w:t>The classical models represent the pre-neural approach and serve as strong, cheap baselines. The bidirectional LSTM represents the pre-Transformer neural approach, trained from scratch without pre-training. The three fine-tuned Transformers differ only in size (4.4, 29 and 67 million parameters), which allows us to observe how quality and cost scale with model size. BERT-tiny (2 layers, hidden size 128) and BERT-small (4 layers, hidden size 512) are compact BERT models pre-trained and released by Google together with the study of Turc et al. (2019); DistilBERT is the distilled version of BERT-base (Sanh et al., 2019). The three ready-made models represent the “use a public model as a service” scenario: a DistilBERT model that has already been fine-tuned on SST-2 by its authors (the best case of reuse), a RoBERTa model trained for sentiment on tweets (a different domain, Loureiro et al., 2022) and a zero-shot NLI model (Yin et al., 2019) that has never seen sentiment labels.</w:t>
+        <w:t>The classical models represent the pre-neural approach and serve as strong, cheap baselines. The bidirectional LSTM represents the pre-Transformer neural approach, trained from scratch without pre-training. The three fine-tuned Transformers differ only in size (4.4, 29 and 67 million parameters), which allows us to observe how quality and cost scale with model size. BERT-tiny (2 layers, hidden size 128) and BERT-small (4 layers, hidden size 512) are compact BERT models pre-trained and released by Google tog</w:t>
+      </w:r>
+      <w:r>
+        <w:t>ether with the study of Turc et al. (2019); DistilBERT is the distilled version of BERT-base (Sanh et al., 2019). The three ready-made models represent the “use a public model as a service” scenario: a DistilBERT model that has already been fine-tuned on SST-2 by its authors (the best case of reuse), a RoBERTa model trained for sentiment on tweets (a different domain, Loureiro et al., 2022) and a zero-shot NLI model (Yin et al., 2019) that has never seen sentiment labels.</w:t>
       </w:r>
     </w:p>
     <w:p>
       <w:pPr>
         <w:pStyle w:val="BDSkyrius2lygio"/>
       </w:pPr>
-      <w:bookmarkStart w:id="19" w:name="_Toc243416167"/>
+      <w:bookmarkStart w:id="19" w:name="_Toc243418795"/>
       <w:r>
         <w:t>Evaluation criteria</w:t>
       </w:r>
@@ -7764,7 +7845,10 @@
         <w:ind w:firstLine="0"/>
       </w:pPr>
       <w:r>
-        <w:t>Inference latency in milliseconds per sentence, measured as total prediction time for the test set divided by the number of sentences, with batches of 32 (cost of using the model).</w:t>
+        <w:t xml:space="preserve">Inference latency in </w:t>
+      </w:r>
+      <w:r>
+        <w:t>milliseconds per sentence, measured as total prediction time for the test set divided by the number of sentences, with batches of 32 (cost of using the model).</w:t>
       </w:r>
     </w:p>
     <w:p>
@@ -7830,7 +7914,7 @@
       <w:pPr>
         <w:pStyle w:val="BDSkyrius2lygio"/>
       </w:pPr>
-      <w:bookmarkStart w:id="20" w:name="_Toc243416168"/>
+      <w:bookmarkStart w:id="20" w:name="_Toc243418796"/>
       <w:r>
         <w:t>Design and structure of the developed program</w:t>
       </w:r>
@@ -7851,7 +7935,7 @@
       </w:pPr>
       <w:r>
         <w:drawing>
-          <wp:inline distT="0" distB="0" distL="0" distR="0" wp14:anchorId="3FDA812F" wp14:editId="3C9AC104">
+          <wp:inline distT="0" distB="0" distL="0" distR="0" wp14:anchorId="181EC9A3" wp14:editId="702A369F">
             <wp:extent cx="5580000" cy="3377368"/>
             <wp:effectExtent l="0" t="0" r="0" b="0"/>
             <wp:docPr id="3" name="Picture 3"/>
@@ -7895,7 +7979,7 @@
           <w:numId w:val="0"/>
         </w:numPr>
       </w:pPr>
-      <w:bookmarkStart w:id="21" w:name="_Toc243416138"/>
+      <w:bookmarkStart w:id="21" w:name="_Toc243418766"/>
       <w:r>
         <w:rPr>
           <w:b/>
@@ -8085,7 +8169,10 @@
       </w:pPr>
       <w:r>
         <w:lastRenderedPageBreak/>
-        <w:t>08_report.py – collects all JSON results, produces the tables and figures, the subset (negation and contrast) analysis and the statistical tests.</w:t>
+        <w:t xml:space="preserve">08_report.py – collects all JSON </w:t>
+      </w:r>
+      <w:r>
+        <w:t>results, produces the tables and figures, the subset (negation and contrast) analysis and the statistical tests.</w:t>
       </w:r>
     </w:p>
     <w:p>
@@ -8100,7 +8187,7 @@
       <w:pPr>
         <w:pStyle w:val="BDSkyrius2lygio"/>
       </w:pPr>
-      <w:bookmarkStart w:id="22" w:name="_Toc243416169"/>
+      <w:bookmarkStart w:id="22" w:name="_Toc243418797"/>
       <w:r>
         <w:t>The Transformer architecture</w:t>
       </w:r>
@@ -8121,7 +8208,7 @@
       </w:pPr>
       <w:r>
         <w:drawing>
-          <wp:inline distT="0" distB="0" distL="0" distR="0" wp14:anchorId="17EB813C" wp14:editId="40C998EA">
+          <wp:inline distT="0" distB="0" distL="0" distR="0" wp14:anchorId="1E7E6BBF" wp14:editId="72F84D22">
             <wp:extent cx="3420000" cy="4081935"/>
             <wp:effectExtent l="0" t="0" r="0" b="0"/>
             <wp:docPr id="4" name="Picture 4"/>
@@ -8165,7 +8252,7 @@
           <w:numId w:val="0"/>
         </w:numPr>
       </w:pPr>
-      <w:bookmarkStart w:id="23" w:name="_Toc243416139"/>
+      <w:bookmarkStart w:id="23" w:name="_Toc243418767"/>
       <w:r>
         <w:rPr>
           <w:b/>
@@ -8236,7 +8323,10 @@
         <w:pStyle w:val="BDpagrindinistekstas"/>
       </w:pPr>
       <w:r>
-        <w:t>Text is first split into sub-word units. BERT models use the WordPiece algorithm and RoBERTa uses byte-pair encoding. Frequent words are kept whole, while rare words are split into pieces (for example, “unwatchable” → “un”, “##watch”, “##able”), so the vocabulary is limited (about 30,000 units for BERT) and no word is ever out of vocabulary. A special [CLS] token is added at the beginning of every input and [SEP] at the end. Each token is mapped to a vector of dimension d (d = 128 for BERT-tiny, 512 for BERT-small and 768 for DistilBERT) by an embedding matrix E.</w:t>
+        <w:t>Text is first split into sub-word units. BERT models use the WordPiece algorithm and RoBERTa uses byte-pair encoding. Frequent words are kept whole, while rare words are split into pieces (for example, “unwatchable” → “un”, “##watch”, “##able”), so the vocabulary is limited (about 30,000 units for BERT) and no word is ever out of vocabulary. A special [CLS] token is added at the beginning of every input and [SEP] at the end. Each token is mapped to a vector of dimension d (d = 128 for BERT-tiny, 512 for BER</w:t>
+      </w:r>
+      <w:r>
+        <w:t>T-small and 768 for DistilBERT) by an embedding matrix E.</w:t>
       </w:r>
     </w:p>
     <w:p>
@@ -8293,7 +8383,31 @@
               <w:rPr>
                 <w:rFonts w:ascii="Cambria Math" w:hAnsi="Cambria Math"/>
               </w:rPr>
-              <m:t>(pos,2i)</m:t>
+              <m:t>(</m:t>
+            </m:r>
+            <m:r>
+              <w:rPr>
+                <w:rFonts w:ascii="Cambria Math" w:hAnsi="Cambria Math"/>
+              </w:rPr>
+              <m:t>pos</m:t>
+            </m:r>
+            <m:r>
+              <w:rPr>
+                <w:rFonts w:ascii="Cambria Math" w:hAnsi="Cambria Math"/>
+              </w:rPr>
+              <m:t>,2</m:t>
+            </m:r>
+            <m:r>
+              <w:rPr>
+                <w:rFonts w:ascii="Cambria Math" w:hAnsi="Cambria Math"/>
+              </w:rPr>
+              <m:t>i</m:t>
+            </m:r>
+            <m:r>
+              <w:rPr>
+                <w:rFonts w:ascii="Cambria Math" w:hAnsi="Cambria Math"/>
+              </w:rPr>
+              <m:t>)</m:t>
             </m:r>
           </m:sub>
         </m:sSub>
@@ -8301,7 +8415,19 @@
           <w:rPr>
             <w:rFonts w:ascii="Cambria Math" w:hAnsi="Cambria Math"/>
           </w:rPr>
-          <m:t>=sin(</m:t>
+          <m:t>=</m:t>
+        </m:r>
+        <m:r>
+          <w:rPr>
+            <w:rFonts w:ascii="Cambria Math" w:hAnsi="Cambria Math"/>
+          </w:rPr>
+          <m:t>sin</m:t>
+        </m:r>
+        <m:r>
+          <w:rPr>
+            <w:rFonts w:ascii="Cambria Math" w:hAnsi="Cambria Math"/>
+          </w:rPr>
+          <m:t>(</m:t>
         </m:r>
         <m:f>
           <m:fPr>
@@ -8341,7 +8467,25 @@
                   <w:rPr>
                     <w:rFonts w:ascii="Cambria Math" w:hAnsi="Cambria Math"/>
                   </w:rPr>
-                  <m:t>2i/d</m:t>
+                  <m:t>2</m:t>
+                </m:r>
+                <m:r>
+                  <w:rPr>
+                    <w:rFonts w:ascii="Cambria Math" w:hAnsi="Cambria Math"/>
+                  </w:rPr>
+                  <m:t>i</m:t>
+                </m:r>
+                <m:r>
+                  <w:rPr>
+                    <w:rFonts w:ascii="Cambria Math" w:hAnsi="Cambria Math"/>
+                  </w:rPr>
+                  <m:t>/</m:t>
+                </m:r>
+                <m:r>
+                  <w:rPr>
+                    <w:rFonts w:ascii="Cambria Math" w:hAnsi="Cambria Math"/>
+                  </w:rPr>
+                  <m:t>d</m:t>
                 </m:r>
               </m:sup>
             </m:sSup>
@@ -8351,7 +8495,13 @@
           <w:rPr>
             <w:rFonts w:ascii="Cambria Math" w:hAnsi="Cambria Math"/>
           </w:rPr>
-          <m:t>),P</m:t>
+          <m:t>),</m:t>
+        </m:r>
+        <m:r>
+          <w:rPr>
+            <w:rFonts w:ascii="Cambria Math" w:hAnsi="Cambria Math"/>
+          </w:rPr>
+          <m:t>P</m:t>
         </m:r>
         <m:sSub>
           <m:sSubPr>
@@ -8374,7 +8524,31 @@
               <w:rPr>
                 <w:rFonts w:ascii="Cambria Math" w:hAnsi="Cambria Math"/>
               </w:rPr>
-              <m:t>(pos,2i+1)</m:t>
+              <m:t>(</m:t>
+            </m:r>
+            <m:r>
+              <w:rPr>
+                <w:rFonts w:ascii="Cambria Math" w:hAnsi="Cambria Math"/>
+              </w:rPr>
+              <m:t>pos</m:t>
+            </m:r>
+            <m:r>
+              <w:rPr>
+                <w:rFonts w:ascii="Cambria Math" w:hAnsi="Cambria Math"/>
+              </w:rPr>
+              <m:t>,2</m:t>
+            </m:r>
+            <m:r>
+              <w:rPr>
+                <w:rFonts w:ascii="Cambria Math" w:hAnsi="Cambria Math"/>
+              </w:rPr>
+              <m:t>i</m:t>
+            </m:r>
+            <m:r>
+              <w:rPr>
+                <w:rFonts w:ascii="Cambria Math" w:hAnsi="Cambria Math"/>
+              </w:rPr>
+              <m:t>+1)</m:t>
             </m:r>
           </m:sub>
         </m:sSub>
@@ -8382,7 +8556,19 @@
           <w:rPr>
             <w:rFonts w:ascii="Cambria Math" w:hAnsi="Cambria Math"/>
           </w:rPr>
-          <m:t>=cos(</m:t>
+          <m:t>=</m:t>
+        </m:r>
+        <m:r>
+          <w:rPr>
+            <w:rFonts w:ascii="Cambria Math" w:hAnsi="Cambria Math"/>
+          </w:rPr>
+          <m:t>cos</m:t>
+        </m:r>
+        <m:r>
+          <w:rPr>
+            <w:rFonts w:ascii="Cambria Math" w:hAnsi="Cambria Math"/>
+          </w:rPr>
+          <m:t>(</m:t>
         </m:r>
         <m:f>
           <m:fPr>
@@ -8422,7 +8608,25 @@
                   <w:rPr>
                     <w:rFonts w:ascii="Cambria Math" w:hAnsi="Cambria Math"/>
                   </w:rPr>
-                  <m:t>2i/d</m:t>
+                  <m:t>2</m:t>
+                </m:r>
+                <m:r>
+                  <w:rPr>
+                    <w:rFonts w:ascii="Cambria Math" w:hAnsi="Cambria Math"/>
+                  </w:rPr>
+                  <m:t>i</m:t>
+                </m:r>
+                <m:r>
+                  <w:rPr>
+                    <w:rFonts w:ascii="Cambria Math" w:hAnsi="Cambria Math"/>
+                  </w:rPr>
+                  <m:t>/</m:t>
+                </m:r>
+                <m:r>
+                  <w:rPr>
+                    <w:rFonts w:ascii="Cambria Math" w:hAnsi="Cambria Math"/>
+                  </w:rPr>
+                  <m:t>d</m:t>
                 </m:r>
               </m:sup>
             </m:sSup>
@@ -8466,7 +8670,13 @@
         <w:keepNext/>
       </w:pPr>
       <w:r>
-        <w:t>The central operation of the Transformer is attention. Every token representation is projected into three vectors: a query q, a key k and a value v. For a sequence of n tokens these are stacked into matrices Q, K, V ∈ ℝⁿˣᵈᵏ, obtained from the input H by learned projections:</w:t>
+        <w:t>The central operation of the Transformer is attention. Every token representation is projected into three vectors: a query q, a key k and a value v. For a sequence of n tokens these are stacked into matrices Q, K, V ∈ ℝⁿˣ</w:t>
+      </w:r>
+      <w:r>
+        <w:t>ᵈᵏ</w:t>
+      </w:r>
+      <w:r>
+        <w:t>, obtained from the input H by learned projections:</w:t>
       </w:r>
     </w:p>
     <w:p>
@@ -8482,7 +8692,19 @@
           <w:rPr>
             <w:rFonts w:ascii="Cambria Math" w:hAnsi="Cambria Math"/>
           </w:rPr>
-          <m:t>Q=H</m:t>
+          <m:t>Q</m:t>
+        </m:r>
+        <m:r>
+          <w:rPr>
+            <w:rFonts w:ascii="Cambria Math" w:hAnsi="Cambria Math"/>
+          </w:rPr>
+          <m:t>=</m:t>
+        </m:r>
+        <m:r>
+          <w:rPr>
+            <w:rFonts w:ascii="Cambria Math" w:hAnsi="Cambria Math"/>
+          </w:rPr>
+          <m:t>H</m:t>
         </m:r>
         <m:sSub>
           <m:sSubPr>
@@ -8513,7 +8735,25 @@
           <w:rPr>
             <w:rFonts w:ascii="Cambria Math" w:hAnsi="Cambria Math"/>
           </w:rPr>
-          <m:t>,K=H</m:t>
+          <m:t>,</m:t>
+        </m:r>
+        <m:r>
+          <w:rPr>
+            <w:rFonts w:ascii="Cambria Math" w:hAnsi="Cambria Math"/>
+          </w:rPr>
+          <m:t>K</m:t>
+        </m:r>
+        <m:r>
+          <w:rPr>
+            <w:rFonts w:ascii="Cambria Math" w:hAnsi="Cambria Math"/>
+          </w:rPr>
+          <m:t>=</m:t>
+        </m:r>
+        <m:r>
+          <w:rPr>
+            <w:rFonts w:ascii="Cambria Math" w:hAnsi="Cambria Math"/>
+          </w:rPr>
+          <m:t>H</m:t>
         </m:r>
         <m:sSub>
           <m:sSubPr>
@@ -8544,7 +8784,25 @@
           <w:rPr>
             <w:rFonts w:ascii="Cambria Math" w:hAnsi="Cambria Math"/>
           </w:rPr>
-          <m:t>,V=H</m:t>
+          <m:t>,</m:t>
+        </m:r>
+        <m:r>
+          <w:rPr>
+            <w:rFonts w:ascii="Cambria Math" w:hAnsi="Cambria Math"/>
+          </w:rPr>
+          <m:t>V</m:t>
+        </m:r>
+        <m:r>
+          <w:rPr>
+            <w:rFonts w:ascii="Cambria Math" w:hAnsi="Cambria Math"/>
+          </w:rPr>
+          <m:t>=</m:t>
+        </m:r>
+        <m:r>
+          <w:rPr>
+            <w:rFonts w:ascii="Cambria Math" w:hAnsi="Cambria Math"/>
+          </w:rPr>
+          <m:t>H</m:t>
         </m:r>
         <m:sSub>
           <m:sSubPr>
@@ -8603,7 +8861,61 @@
           <w:rPr>
             <w:rFonts w:ascii="Cambria Math" w:hAnsi="Cambria Math"/>
           </w:rPr>
-          <m:t>Attention(Q,K,V)=softmax(</m:t>
+          <m:t>Attention</m:t>
+        </m:r>
+        <m:r>
+          <w:rPr>
+            <w:rFonts w:ascii="Cambria Math" w:hAnsi="Cambria Math"/>
+          </w:rPr>
+          <m:t>(</m:t>
+        </m:r>
+        <m:r>
+          <w:rPr>
+            <w:rFonts w:ascii="Cambria Math" w:hAnsi="Cambria Math"/>
+          </w:rPr>
+          <m:t>Q</m:t>
+        </m:r>
+        <m:r>
+          <w:rPr>
+            <w:rFonts w:ascii="Cambria Math" w:hAnsi="Cambria Math"/>
+          </w:rPr>
+          <m:t>,</m:t>
+        </m:r>
+        <m:r>
+          <w:rPr>
+            <w:rFonts w:ascii="Cambria Math" w:hAnsi="Cambria Math"/>
+          </w:rPr>
+          <m:t>K</m:t>
+        </m:r>
+        <m:r>
+          <w:rPr>
+            <w:rFonts w:ascii="Cambria Math" w:hAnsi="Cambria Math"/>
+          </w:rPr>
+          <m:t>,</m:t>
+        </m:r>
+        <m:r>
+          <w:rPr>
+            <w:rFonts w:ascii="Cambria Math" w:hAnsi="Cambria Math"/>
+          </w:rPr>
+          <m:t>V</m:t>
+        </m:r>
+        <m:r>
+          <w:rPr>
+            <w:rFonts w:ascii="Cambria Math" w:hAnsi="Cambria Math"/>
+          </w:rPr>
+          <m:t>)=</m:t>
+        </m:r>
+        <m:r>
+          <w:rPr>
+            <w:rFonts w:ascii="Cambria Math" w:hAnsi="Cambria Math"/>
+          </w:rPr>
+          <m:t>softmax</m:t>
+        </m:r>
+        <m:r>
+          <w:rPr>
+            <w:rFonts w:ascii="Cambria Math" w:hAnsi="Cambria Math"/>
+          </w:rPr>
+          <m:t>(</m:t>
         </m:r>
         <m:f>
           <m:fPr>
@@ -8691,7 +9003,13 @@
           <w:rPr>
             <w:rFonts w:ascii="Cambria Math" w:hAnsi="Cambria Math"/>
           </w:rPr>
-          <m:t>)V</m:t>
+          <m:t>)</m:t>
+        </m:r>
+        <m:r>
+          <w:rPr>
+            <w:rFonts w:ascii="Cambria Math" w:hAnsi="Cambria Math"/>
+          </w:rPr>
+          <m:t>V</m:t>
         </m:r>
       </m:oMath>
       <w:r>
@@ -8709,7 +9027,16 @@
         <w:keepNext/>
       </w:pPr>
       <w:r>
-        <w:t>The matrix product Q·Kᵀ gives an n × n matrix of similarity scores between every pair of tokens. The softmax function, applied to each row, turns the scores into weights that are positive and sum to one:</w:t>
+        <w:t>The matrix product Q·K</w:t>
+      </w:r>
+      <w:r>
+        <w:t>ᵀ</w:t>
+      </w:r>
+      <w:r>
+        <w:t xml:space="preserve"> gives an n × n matrix of similarity scores between every pair of tokens. The softmax function, applied to each row, turns the </w:t>
+      </w:r>
+      <w:r>
+        <w:t>scores into weights that are positive and sum to one:</w:t>
       </w:r>
     </w:p>
     <w:p>
@@ -8725,7 +9052,19 @@
           <w:rPr>
             <w:rFonts w:ascii="Cambria Math" w:hAnsi="Cambria Math"/>
           </w:rPr>
-          <m:t>softmax(z</m:t>
+          <m:t>softmax</m:t>
+        </m:r>
+        <m:r>
+          <w:rPr>
+            <w:rFonts w:ascii="Cambria Math" w:hAnsi="Cambria Math"/>
+          </w:rPr>
+          <m:t>(</m:t>
+        </m:r>
+        <m:r>
+          <w:rPr>
+            <w:rFonts w:ascii="Cambria Math" w:hAnsi="Cambria Math"/>
+          </w:rPr>
+          <m:t>z</m:t>
         </m:r>
         <m:sSub>
           <m:sSubPr>
@@ -8898,7 +9237,10 @@
         <w:pStyle w:val="BDpagrindinistekstas"/>
       </w:pPr>
       <w:r>
-        <w:t>The output for each token is a weighted average of the value vectors of all tokens, so a word can directly gather information from any other word in the sentence regardless of distance. Division by √d_k prevents the dot products from becoming very large for high dimensions, which would push the softmax into regions with extremely small gradients. In our task, for example, the representation of the word “good” in “not good” can attend strongly to “not”, which allows the model to represent the negated meaning.</w:t>
+        <w:t>The output for each token is a weighted average of the value vectors of all tokens, so a word can directly gather information from any other word in the sentence regardless of distance. Division by √d_k prevents the dot products from becoming very large for high dimensions, which would push the softmax into regions with extremely small gradients. In our task, for example, the representation of the word “good” in “not good” can attend strongly to “not”, which allows the model to represent the negated meaning</w:t>
+      </w:r>
+      <w:r>
+        <w:t>.</w:t>
       </w:r>
     </w:p>
     <w:p>
@@ -8956,7 +9298,25 @@
           <w:rPr>
             <w:rFonts w:ascii="Cambria Math" w:hAnsi="Cambria Math"/>
           </w:rPr>
-          <m:t>=Attention(H</m:t>
+          <m:t>=</m:t>
+        </m:r>
+        <m:r>
+          <w:rPr>
+            <w:rFonts w:ascii="Cambria Math" w:hAnsi="Cambria Math"/>
+          </w:rPr>
+          <m:t>Attention</m:t>
+        </m:r>
+        <m:r>
+          <w:rPr>
+            <w:rFonts w:ascii="Cambria Math" w:hAnsi="Cambria Math"/>
+          </w:rPr>
+          <m:t>(</m:t>
+        </m:r>
+        <m:r>
+          <w:rPr>
+            <w:rFonts w:ascii="Cambria Math" w:hAnsi="Cambria Math"/>
+          </w:rPr>
+          <m:t>H</m:t>
         </m:r>
         <m:sSubSup>
           <m:sSubSupPr>
@@ -8995,7 +9355,13 @@
           <w:rPr>
             <w:rFonts w:ascii="Cambria Math" w:hAnsi="Cambria Math"/>
           </w:rPr>
-          <m:t>,H</m:t>
+          <m:t>,</m:t>
+        </m:r>
+        <m:r>
+          <w:rPr>
+            <w:rFonts w:ascii="Cambria Math" w:hAnsi="Cambria Math"/>
+          </w:rPr>
+          <m:t>H</m:t>
         </m:r>
         <m:sSubSup>
           <m:sSubSupPr>
@@ -9034,7 +9400,13 @@
           <w:rPr>
             <w:rFonts w:ascii="Cambria Math" w:hAnsi="Cambria Math"/>
           </w:rPr>
-          <m:t>,H</m:t>
+          <m:t>,</m:t>
+        </m:r>
+        <m:r>
+          <w:rPr>
+            <w:rFonts w:ascii="Cambria Math" w:hAnsi="Cambria Math"/>
+          </w:rPr>
+          <m:t>H</m:t>
         </m:r>
         <m:sSubSup>
           <m:sSubSupPr>
@@ -9073,7 +9445,43 @@
           <w:rPr>
             <w:rFonts w:ascii="Cambria Math" w:hAnsi="Cambria Math"/>
           </w:rPr>
-          <m:t>),MultiHead(H)=Concat(</m:t>
+          <m:t>),</m:t>
+        </m:r>
+        <m:r>
+          <w:rPr>
+            <w:rFonts w:ascii="Cambria Math" w:hAnsi="Cambria Math"/>
+          </w:rPr>
+          <m:t>MultiHead</m:t>
+        </m:r>
+        <m:r>
+          <w:rPr>
+            <w:rFonts w:ascii="Cambria Math" w:hAnsi="Cambria Math"/>
+          </w:rPr>
+          <m:t>(</m:t>
+        </m:r>
+        <m:r>
+          <w:rPr>
+            <w:rFonts w:ascii="Cambria Math" w:hAnsi="Cambria Math"/>
+          </w:rPr>
+          <m:t>H</m:t>
+        </m:r>
+        <m:r>
+          <w:rPr>
+            <w:rFonts w:ascii="Cambria Math" w:hAnsi="Cambria Math"/>
+          </w:rPr>
+          <m:t>)=</m:t>
+        </m:r>
+        <m:r>
+          <w:rPr>
+            <w:rFonts w:ascii="Cambria Math" w:hAnsi="Cambria Math"/>
+          </w:rPr>
+          <m:t>Concat</m:t>
+        </m:r>
+        <m:r>
+          <w:rPr>
+            <w:rFonts w:ascii="Cambria Math" w:hAnsi="Cambria Math"/>
+          </w:rPr>
+          <m:t>(</m:t>
         </m:r>
         <m:sSub>
           <m:sSubPr>
@@ -9194,7 +9602,10 @@
         <w:keepNext/>
       </w:pPr>
       <w:r>
-        <w:t>After attention, each position is processed independently by a two-layer feed-forward network:</w:t>
+        <w:t xml:space="preserve">After attention, each position is processed </w:t>
+      </w:r>
+      <w:r>
+        <w:t>independently by a two-layer feed-forward network:</w:t>
       </w:r>
     </w:p>
     <w:p>
@@ -9210,7 +9621,43 @@
           <w:rPr>
             <w:rFonts w:ascii="Cambria Math" w:hAnsi="Cambria Math"/>
           </w:rPr>
-          <m:t>FFN(x)=GELU(x</m:t>
+          <m:t>FFN</m:t>
+        </m:r>
+        <m:r>
+          <w:rPr>
+            <w:rFonts w:ascii="Cambria Math" w:hAnsi="Cambria Math"/>
+          </w:rPr>
+          <m:t>(</m:t>
+        </m:r>
+        <m:r>
+          <w:rPr>
+            <w:rFonts w:ascii="Cambria Math" w:hAnsi="Cambria Math"/>
+          </w:rPr>
+          <m:t>x</m:t>
+        </m:r>
+        <m:r>
+          <w:rPr>
+            <w:rFonts w:ascii="Cambria Math" w:hAnsi="Cambria Math"/>
+          </w:rPr>
+          <m:t>)=</m:t>
+        </m:r>
+        <m:r>
+          <w:rPr>
+            <w:rFonts w:ascii="Cambria Math" w:hAnsi="Cambria Math"/>
+          </w:rPr>
+          <m:t>GELU</m:t>
+        </m:r>
+        <m:r>
+          <w:rPr>
+            <w:rFonts w:ascii="Cambria Math" w:hAnsi="Cambria Math"/>
+          </w:rPr>
+          <m:t>(</m:t>
+        </m:r>
+        <m:r>
+          <w:rPr>
+            <w:rFonts w:ascii="Cambria Math" w:hAnsi="Cambria Math"/>
+          </w:rPr>
+          <m:t>x</m:t>
         </m:r>
         <m:sSub>
           <m:sSubPr>
@@ -9388,7 +9835,55 @@
           <w:rPr>
             <w:rFonts w:ascii="Cambria Math" w:hAnsi="Cambria Math"/>
           </w:rPr>
-          <m:t>=LayerNorm(H+MultiHead(H)),</m:t>
+          <m:t>=</m:t>
+        </m:r>
+        <m:r>
+          <w:rPr>
+            <w:rFonts w:ascii="Cambria Math" w:hAnsi="Cambria Math"/>
+          </w:rPr>
+          <m:t>LayerNorm</m:t>
+        </m:r>
+        <m:r>
+          <w:rPr>
+            <w:rFonts w:ascii="Cambria Math" w:hAnsi="Cambria Math"/>
+          </w:rPr>
+          <m:t>(</m:t>
+        </m:r>
+        <m:r>
+          <w:rPr>
+            <w:rFonts w:ascii="Cambria Math" w:hAnsi="Cambria Math"/>
+          </w:rPr>
+          <m:t>H</m:t>
+        </m:r>
+        <m:r>
+          <w:rPr>
+            <w:rFonts w:ascii="Cambria Math" w:hAnsi="Cambria Math"/>
+          </w:rPr>
+          <m:t>+</m:t>
+        </m:r>
+        <m:r>
+          <w:rPr>
+            <w:rFonts w:ascii="Cambria Math" w:hAnsi="Cambria Math"/>
+          </w:rPr>
+          <m:t>MultiHead</m:t>
+        </m:r>
+        <m:r>
+          <w:rPr>
+            <w:rFonts w:ascii="Cambria Math" w:hAnsi="Cambria Math"/>
+          </w:rPr>
+          <m:t>(</m:t>
+        </m:r>
+        <m:r>
+          <w:rPr>
+            <w:rFonts w:ascii="Cambria Math" w:hAnsi="Cambria Math"/>
+          </w:rPr>
+          <m:t>H</m:t>
+        </m:r>
+        <m:r>
+          <w:rPr>
+            <w:rFonts w:ascii="Cambria Math" w:hAnsi="Cambria Math"/>
+          </w:rPr>
+          <m:t>)),</m:t>
         </m:r>
         <m:sSup>
           <m:sSupPr>
@@ -9419,7 +9914,19 @@
           <w:rPr>
             <w:rFonts w:ascii="Cambria Math" w:hAnsi="Cambria Math"/>
           </w:rPr>
-          <m:t>=LayerNorm(</m:t>
+          <m:t>=</m:t>
+        </m:r>
+        <m:r>
+          <w:rPr>
+            <w:rFonts w:ascii="Cambria Math" w:hAnsi="Cambria Math"/>
+          </w:rPr>
+          <m:t>LayerNorm</m:t>
+        </m:r>
+        <m:r>
+          <w:rPr>
+            <w:rFonts w:ascii="Cambria Math" w:hAnsi="Cambria Math"/>
+          </w:rPr>
+          <m:t>(</m:t>
         </m:r>
         <m:sSup>
           <m:sSupPr>
@@ -9450,7 +9957,19 @@
           <w:rPr>
             <w:rFonts w:ascii="Cambria Math" w:hAnsi="Cambria Math"/>
           </w:rPr>
-          <m:t>+FFN(</m:t>
+          <m:t>+</m:t>
+        </m:r>
+        <m:r>
+          <w:rPr>
+            <w:rFonts w:ascii="Cambria Math" w:hAnsi="Cambria Math"/>
+          </w:rPr>
+          <m:t>FFN</m:t>
+        </m:r>
+        <m:r>
+          <w:rPr>
+            <w:rFonts w:ascii="Cambria Math" w:hAnsi="Cambria Math"/>
+          </w:rPr>
+          <m:t>(</m:t>
         </m:r>
         <m:sSup>
           <m:sSupPr>
@@ -9506,7 +10025,37 @@
           <w:rPr>
             <w:rFonts w:ascii="Cambria Math" w:hAnsi="Cambria Math"/>
           </w:rPr>
-          <m:t>LayerNorm(x)=γ⊙</m:t>
+          <m:t>LayerNorm</m:t>
+        </m:r>
+        <m:r>
+          <w:rPr>
+            <w:rFonts w:ascii="Cambria Math" w:hAnsi="Cambria Math"/>
+          </w:rPr>
+          <m:t>(</m:t>
+        </m:r>
+        <m:r>
+          <w:rPr>
+            <w:rFonts w:ascii="Cambria Math" w:hAnsi="Cambria Math"/>
+          </w:rPr>
+          <m:t>x</m:t>
+        </m:r>
+        <m:r>
+          <w:rPr>
+            <w:rFonts w:ascii="Cambria Math" w:hAnsi="Cambria Math"/>
+          </w:rPr>
+          <m:t>)=</m:t>
+        </m:r>
+        <m:r>
+          <w:rPr>
+            <w:rFonts w:ascii="Cambria Math" w:hAnsi="Cambria Math"/>
+          </w:rPr>
+          <m:t>γ</m:t>
+        </m:r>
+        <m:r>
+          <w:rPr>
+            <w:rFonts w:ascii="Cambria Math" w:hAnsi="Cambria Math"/>
+          </w:rPr>
+          <m:t>⊙</m:t>
         </m:r>
         <m:f>
           <m:fPr>
@@ -9521,7 +10070,19 @@
               <w:rPr>
                 <w:rFonts w:ascii="Cambria Math" w:hAnsi="Cambria Math"/>
               </w:rPr>
-              <m:t>x-μ</m:t>
+              <m:t>x</m:t>
+            </m:r>
+            <m:r>
+              <w:rPr>
+                <w:rFonts w:ascii="Cambria Math" w:hAnsi="Cambria Math"/>
+              </w:rPr>
+              <m:t>-</m:t>
+            </m:r>
+            <m:r>
+              <w:rPr>
+                <w:rFonts w:ascii="Cambria Math" w:hAnsi="Cambria Math"/>
+              </w:rPr>
+              <m:t>μ</m:t>
             </m:r>
           </m:num>
           <m:den>
@@ -9565,7 +10126,13 @@
                   <w:rPr>
                     <w:rFonts w:ascii="Cambria Math" w:hAnsi="Cambria Math"/>
                   </w:rPr>
-                  <m:t>+ϵ</m:t>
+                  <m:t>+</m:t>
+                </m:r>
+                <m:r>
+                  <w:rPr>
+                    <w:rFonts w:ascii="Cambria Math" w:hAnsi="Cambria Math"/>
+                  </w:rPr>
+                  <m:t>ϵ</m:t>
                 </m:r>
               </m:e>
             </m:rad>
@@ -9575,7 +10142,13 @@
           <w:rPr>
             <w:rFonts w:ascii="Cambria Math" w:hAnsi="Cambria Math"/>
           </w:rPr>
-          <m:t>+β</m:t>
+          <m:t>+</m:t>
+        </m:r>
+        <m:r>
+          <w:rPr>
+            <w:rFonts w:ascii="Cambria Math" w:hAnsi="Cambria Math"/>
+          </w:rPr>
+          <m:t>β</m:t>
         </m:r>
       </m:oMath>
       <w:r>
@@ -9609,14 +10182,17 @@
         <w:pStyle w:val="BDpagrindinistekstas"/>
       </w:pPr>
       <w:r>
-        <w:t>Self-attention compares every token with every other token, so one layer requires O(n²·d) operations for a sequence of length n, compared with O(n·d²) for a recurrent layer. However, all n positions are computed in parallel, whereas a recurrent network needs n sequential steps. For short and medium sequences (n &lt; d), which is the case for sentences, self-attention is both faster and better at modelling long-range dependencies. For very long documents the quadratic cost becomes a limitation, which motivated efficient Transformer variants (Tay et al., 2022). In our experiment the maximum length was set to 64 tokens, which covers 99.99% of the training sentences and all test sentences (the longest test sentence has 55 sub-word tokens).</w:t>
+        <w:t xml:space="preserve">Self-attention compares every token with every other token, so one layer requires O(n²·d) operations for a sequence of length n, compared with O(n·d²) for a recurrent layer. However, all n positions are computed in parallel, whereas a recurrent network needs n sequential steps. For short and medium sequences (n &lt; d), which is the case for sentences, self-attention is both faster and better at modelling long-range dependencies. For very long documents the quadratic cost becomes a limitation, which motivated </w:t>
+      </w:r>
+      <w:r>
+        <w:t>efficient Transformer variants (Tay et al., 2022). In our experiment the maximum length was set to 64 tokens, which covers 99.99% of the training sentences and all test sentences (the longest test sentence has 55 sub-word tokens).</w:t>
       </w:r>
     </w:p>
     <w:p>
       <w:pPr>
         <w:pStyle w:val="BDSkyrius2lygio"/>
       </w:pPr>
-      <w:bookmarkStart w:id="24" w:name="_Toc243416170"/>
+      <w:bookmarkStart w:id="24" w:name="_Toc243418798"/>
       <w:r>
         <w:t>Mathematical methods of training and evaluation</w:t>
       </w:r>
@@ -9696,7 +10272,19 @@
               <w:rPr>
                 <w:rFonts w:ascii="Cambria Math" w:hAnsi="Cambria Math"/>
               </w:rPr>
-              <m:t>t∈M</m:t>
+              <m:t>t</m:t>
+            </m:r>
+            <m:r>
+              <w:rPr>
+                <w:rFonts w:ascii="Cambria Math" w:hAnsi="Cambria Math"/>
+              </w:rPr>
+              <m:t>∈</m:t>
+            </m:r>
+            <m:r>
+              <w:rPr>
+                <w:rFonts w:ascii="Cambria Math" w:hAnsi="Cambria Math"/>
+              </w:rPr>
+              <m:t>M</m:t>
             </m:r>
           </m:sub>
           <m:sup/>
@@ -9705,7 +10293,19 @@
               <w:rPr>
                 <w:rFonts w:ascii="Cambria Math" w:hAnsi="Cambria Math"/>
               </w:rPr>
-              <m:t>logP(</m:t>
+              <m:t>log</m:t>
+            </m:r>
+            <m:r>
+              <w:rPr>
+                <w:rFonts w:ascii="Cambria Math" w:hAnsi="Cambria Math"/>
+              </w:rPr>
+              <m:t>P</m:t>
+            </m:r>
+            <m:r>
+              <w:rPr>
+                <w:rFonts w:ascii="Cambria Math" w:hAnsi="Cambria Math"/>
+              </w:rPr>
+              <m:t>(</m:t>
             </m:r>
             <m:sSub>
               <m:sSubPr>
@@ -9759,7 +10359,13 @@
                   <w:rPr>
                     <w:rFonts w:ascii="Cambria Math" w:hAnsi="Cambria Math"/>
                   </w:rPr>
-                  <m:t>⧵M</m:t>
+                  <m:t>⧵</m:t>
+                </m:r>
+                <m:r>
+                  <w:rPr>
+                    <w:rFonts w:ascii="Cambria Math" w:hAnsi="Cambria Math"/>
+                  </w:rPr>
+                  <m:t>M</m:t>
                 </m:r>
               </m:sub>
             </m:sSub>
@@ -9803,7 +10409,19 @@
         <w:keepNext/>
       </w:pPr>
       <w:r>
-        <w:t>For classification, the final hidden vector of the [CLS] token, h_CLS ∈ ℝᵈ, is used as the representation of the whole sentence. A new classification layer with weights W ∈ ℝ²ˣᵈ and bias b is added on top:</w:t>
+        <w:t>For classification, the final hidden vector of the [CLS] token, h_CLS ∈ ℝ</w:t>
+      </w:r>
+      <w:r>
+        <w:t>ᵈ</w:t>
+      </w:r>
+      <w:r>
+        <w:t>, is used as the representation of the whole sentence. A new classification layer with weights W ∈ ℝ²ˣ</w:t>
+      </w:r>
+      <w:r>
+        <w:t>ᵈ</w:t>
+      </w:r>
+      <w:r>
+        <w:t xml:space="preserve"> and bias b is added on top:</w:t>
       </w:r>
     </w:p>
     <w:p>
@@ -9819,7 +10437,55 @@
           <w:rPr>
             <w:rFonts w:ascii="Cambria Math" w:hAnsi="Cambria Math"/>
           </w:rPr>
-          <m:t>P(y∣x)=softmax(W</m:t>
+          <m:t>P</m:t>
+        </m:r>
+        <m:r>
+          <w:rPr>
+            <w:rFonts w:ascii="Cambria Math" w:hAnsi="Cambria Math"/>
+          </w:rPr>
+          <m:t>(</m:t>
+        </m:r>
+        <m:r>
+          <w:rPr>
+            <w:rFonts w:ascii="Cambria Math" w:hAnsi="Cambria Math"/>
+          </w:rPr>
+          <m:t>y</m:t>
+        </m:r>
+        <m:r>
+          <w:rPr>
+            <w:rFonts w:ascii="Cambria Math" w:hAnsi="Cambria Math"/>
+          </w:rPr>
+          <m:t>∣</m:t>
+        </m:r>
+        <m:r>
+          <w:rPr>
+            <w:rFonts w:ascii="Cambria Math" w:hAnsi="Cambria Math"/>
+          </w:rPr>
+          <m:t>x</m:t>
+        </m:r>
+        <m:r>
+          <w:rPr>
+            <w:rFonts w:ascii="Cambria Math" w:hAnsi="Cambria Math"/>
+          </w:rPr>
+          <m:t>)=</m:t>
+        </m:r>
+        <m:r>
+          <w:rPr>
+            <w:rFonts w:ascii="Cambria Math" w:hAnsi="Cambria Math"/>
+          </w:rPr>
+          <m:t>softmax</m:t>
+        </m:r>
+        <m:r>
+          <w:rPr>
+            <w:rFonts w:ascii="Cambria Math" w:hAnsi="Cambria Math"/>
+          </w:rPr>
+          <m:t>(</m:t>
+        </m:r>
+        <m:r>
+          <w:rPr>
+            <w:rFonts w:ascii="Cambria Math" w:hAnsi="Cambria Math"/>
+          </w:rPr>
+          <m:t>W</m:t>
         </m:r>
         <m:sSub>
           <m:sSubPr>
@@ -9850,7 +10516,19 @@
           <w:rPr>
             <w:rFonts w:ascii="Cambria Math" w:hAnsi="Cambria Math"/>
           </w:rPr>
-          <m:t>+b)</m:t>
+          <m:t>+</m:t>
+        </m:r>
+        <m:r>
+          <w:rPr>
+            <w:rFonts w:ascii="Cambria Math" w:hAnsi="Cambria Math"/>
+          </w:rPr>
+          <m:t>b</m:t>
+        </m:r>
+        <m:r>
+          <w:rPr>
+            <w:rFonts w:ascii="Cambria Math" w:hAnsi="Cambria Math"/>
+          </w:rPr>
+          <m:t>)</m:t>
         </m:r>
       </m:oMath>
       <w:r>
@@ -9868,7 +10546,10 @@
         <w:keepNext/>
       </w:pPr>
       <w:r>
-        <w:t>All parameters (the pre-trained encoder and the new layer) are trained together by minimising the cross-entropy loss over the training set:</w:t>
+        <w:t xml:space="preserve">All parameters (the pre-trained encoder and the new layer) are trained together by </w:t>
+      </w:r>
+      <w:r>
+        <w:t>minimising the cross-entropy loss over the training set:</w:t>
       </w:r>
     </w:p>
     <w:p>
@@ -9952,7 +10633,13 @@
               <w:rPr>
                 <w:rFonts w:ascii="Cambria Math" w:hAnsi="Cambria Math"/>
               </w:rPr>
-              <m:t>i=1</m:t>
+              <m:t>i</m:t>
+            </m:r>
+            <m:r>
+              <w:rPr>
+                <w:rFonts w:ascii="Cambria Math" w:hAnsi="Cambria Math"/>
+              </w:rPr>
+              <m:t>=1</m:t>
             </m:r>
           </m:sub>
           <m:sup>
@@ -9968,7 +10655,19 @@
               <w:rPr>
                 <w:rFonts w:ascii="Cambria Math" w:hAnsi="Cambria Math"/>
               </w:rPr>
-              <m:t>logP(</m:t>
+              <m:t>log</m:t>
+            </m:r>
+            <m:r>
+              <w:rPr>
+                <w:rFonts w:ascii="Cambria Math" w:hAnsi="Cambria Math"/>
+              </w:rPr>
+              <m:t>P</m:t>
+            </m:r>
+            <m:r>
+              <w:rPr>
+                <w:rFonts w:ascii="Cambria Math" w:hAnsi="Cambria Math"/>
+              </w:rPr>
+              <m:t>(</m:t>
             </m:r>
             <m:sSub>
               <m:sSubPr>
@@ -10148,7 +10847,19 @@
               <w:rPr>
                 <w:rFonts w:ascii="Cambria Math" w:hAnsi="Cambria Math"/>
               </w:rPr>
-              <m:t>t-1</m:t>
+              <m:t>t</m:t>
+            </m:r>
+            <m:r>
+              <w:rPr>
+                <w:rFonts w:ascii="Cambria Math" w:hAnsi="Cambria Math"/>
+              </w:rPr>
+              <m:t>-</m:t>
+            </m:r>
+            <m:r>
+              <w:rPr>
+                <w:rFonts w:ascii="Cambria Math" w:hAnsi="Cambria Math"/>
+              </w:rPr>
+              <m:t>1</m:t>
             </m:r>
           </m:sub>
         </m:sSub>
@@ -10297,7 +11008,19 @@
               <w:rPr>
                 <w:rFonts w:ascii="Cambria Math" w:hAnsi="Cambria Math"/>
               </w:rPr>
-              <m:t>t-1</m:t>
+              <m:t>t</m:t>
+            </m:r>
+            <m:r>
+              <w:rPr>
+                <w:rFonts w:ascii="Cambria Math" w:hAnsi="Cambria Math"/>
+              </w:rPr>
+              <m:t>-</m:t>
+            </m:r>
+            <m:r>
+              <w:rPr>
+                <w:rFonts w:ascii="Cambria Math" w:hAnsi="Cambria Math"/>
+              </w:rPr>
+              <m:t>1</m:t>
             </m:r>
           </m:sub>
         </m:sSub>
@@ -10442,7 +11165,19 @@
               <w:rPr>
                 <w:rFonts w:ascii="Cambria Math" w:hAnsi="Cambria Math"/>
               </w:rPr>
-              <m:t>t-1</m:t>
+              <m:t>t</m:t>
+            </m:r>
+            <m:r>
+              <w:rPr>
+                <w:rFonts w:ascii="Cambria Math" w:hAnsi="Cambria Math"/>
+              </w:rPr>
+              <m:t>-</m:t>
+            </m:r>
+            <m:r>
+              <w:rPr>
+                <w:rFonts w:ascii="Cambria Math" w:hAnsi="Cambria Math"/>
+              </w:rPr>
+              <m:t>1</m:t>
             </m:r>
           </m:sub>
         </m:sSub>
@@ -10583,7 +11318,13 @@
               <w:rPr>
                 <w:rFonts w:ascii="Cambria Math" w:hAnsi="Cambria Math"/>
               </w:rPr>
-              <m:t>+ϵ</m:t>
+              <m:t>+</m:t>
+            </m:r>
+            <m:r>
+              <w:rPr>
+                <w:rFonts w:ascii="Cambria Math" w:hAnsi="Cambria Math"/>
+              </w:rPr>
+              <m:t>ϵ</m:t>
             </m:r>
           </m:den>
         </m:f>
@@ -10591,7 +11332,13 @@
           <w:rPr>
             <w:rFonts w:ascii="Cambria Math" w:hAnsi="Cambria Math"/>
           </w:rPr>
-          <m:t>+λ</m:t>
+          <m:t>+</m:t>
+        </m:r>
+        <m:r>
+          <w:rPr>
+            <w:rFonts w:ascii="Cambria Math" w:hAnsi="Cambria Math"/>
+          </w:rPr>
+          <m:t>λ</m:t>
         </m:r>
         <m:sSub>
           <m:sSubPr>
@@ -10614,7 +11361,19 @@
               <w:rPr>
                 <w:rFonts w:ascii="Cambria Math" w:hAnsi="Cambria Math"/>
               </w:rPr>
-              <m:t>t-1</m:t>
+              <m:t>t</m:t>
+            </m:r>
+            <m:r>
+              <w:rPr>
+                <w:rFonts w:ascii="Cambria Math" w:hAnsi="Cambria Math"/>
+              </w:rPr>
+              <m:t>-</m:t>
+            </m:r>
+            <m:r>
+              <w:rPr>
+                <w:rFonts w:ascii="Cambria Math" w:hAnsi="Cambria Math"/>
+              </w:rPr>
+              <m:t>1</m:t>
             </m:r>
           </m:sub>
         </m:sSub>
@@ -10639,7 +11398,10 @@
         <w:pStyle w:val="BDpagrindinistekstas"/>
       </w:pPr>
       <w:r>
-        <w:t>where m̂ₜ and v̂ₜ are bias-corrected moment estimates, λ = 0.01 is the weight decay and ηₜ is the learning rate. The learning rate follows a linear schedule: it grows from 0 to its peak value during the first 10% of steps (warm-up) and then decreases linearly to 0. Warm-up prevents large, destructive updates of the pre-trained weights at the beginning of training. Gradients are clipped to a maximum norm of 1.0. The hyper-parameters used are shown in Table 5; they follow the recommendations of Devlin et al. (2019) and Sun et al. (2019), with a higher learning rate for the smallest models, which is usual for compact BERT variants.</w:t>
+        <w:t xml:space="preserve">where m̂ₜ and v̂ₜ are bias-corrected moment estimates, λ = 0.01 is the weight decay and ηₜ is the learning rate. The learning rate follows a linear schedule: it grows from 0 to its peak value during the first 10% of steps (warm-up) and then decreases linearly to 0. Warm-up prevents large, destructive updates of the pre-trained weights at the beginning of training. Gradients are clipped to a maximum norm of 1.0. The hyper-parameters used are shown in Table 5; they follow the recommendations of Devlin et al. </w:t>
+      </w:r>
+      <w:r>
+        <w:t>(2019) and Sun et al. (2019), with a higher learning rate for the smallest models, which is usual for compact BERT variants.</w:t>
       </w:r>
     </w:p>
     <w:p>
@@ -10651,7 +11413,7 @@
         </w:numPr>
         <w:spacing w:before="120"/>
       </w:pPr>
-      <w:bookmarkStart w:id="25" w:name="_Toc243416149"/>
+      <w:bookmarkStart w:id="25" w:name="_Toc243418777"/>
       <w:r>
         <w:rPr>
           <w:b/>
@@ -11017,7 +11779,10 @@
               <w:keepNext/>
             </w:pPr>
             <w:r>
-              <w:t>Peak learning rate</w:t>
+              <w:t xml:space="preserve">Peak </w:t>
+            </w:r>
+            <w:r>
+              <w:t>learning rate</w:t>
             </w:r>
           </w:p>
         </w:tc>
@@ -11276,7 +12041,10 @@
         <w:keepNext/>
       </w:pPr>
       <w:r>
-        <w:t>For the classical models every sentence is represented as a sparse vector of TF-IDF weights of unigrams and bigrams:</w:t>
+        <w:t xml:space="preserve">For the </w:t>
+      </w:r>
+      <w:r>
+        <w:t>classical models every sentence is represented as a sparse vector of TF-IDF weights of unigrams and bigrams:</w:t>
       </w:r>
     </w:p>
     <w:p>
@@ -11292,7 +12060,91 @@
           <w:rPr>
             <w:rFonts w:ascii="Cambria Math" w:hAnsi="Cambria Math"/>
           </w:rPr>
-          <m:t>tfidf(t,d)=(1+log(tf(t,d)))·(log</m:t>
+          <m:t>tfidf</m:t>
+        </m:r>
+        <m:r>
+          <w:rPr>
+            <w:rFonts w:ascii="Cambria Math" w:hAnsi="Cambria Math"/>
+          </w:rPr>
+          <m:t>(</m:t>
+        </m:r>
+        <m:r>
+          <w:rPr>
+            <w:rFonts w:ascii="Cambria Math" w:hAnsi="Cambria Math"/>
+          </w:rPr>
+          <m:t>t</m:t>
+        </m:r>
+        <m:r>
+          <w:rPr>
+            <w:rFonts w:ascii="Cambria Math" w:hAnsi="Cambria Math"/>
+          </w:rPr>
+          <m:t>,</m:t>
+        </m:r>
+        <m:r>
+          <w:rPr>
+            <w:rFonts w:ascii="Cambria Math" w:hAnsi="Cambria Math"/>
+          </w:rPr>
+          <m:t>d</m:t>
+        </m:r>
+        <m:r>
+          <w:rPr>
+            <w:rFonts w:ascii="Cambria Math" w:hAnsi="Cambria Math"/>
+          </w:rPr>
+          <m:t>)=(1+</m:t>
+        </m:r>
+        <m:r>
+          <w:rPr>
+            <w:rFonts w:ascii="Cambria Math" w:hAnsi="Cambria Math"/>
+          </w:rPr>
+          <m:t>log</m:t>
+        </m:r>
+        <m:r>
+          <w:rPr>
+            <w:rFonts w:ascii="Cambria Math" w:hAnsi="Cambria Math"/>
+          </w:rPr>
+          <m:t>(</m:t>
+        </m:r>
+        <m:r>
+          <w:rPr>
+            <w:rFonts w:ascii="Cambria Math" w:hAnsi="Cambria Math"/>
+          </w:rPr>
+          <m:t>tf</m:t>
+        </m:r>
+        <m:r>
+          <w:rPr>
+            <w:rFonts w:ascii="Cambria Math" w:hAnsi="Cambria Math"/>
+          </w:rPr>
+          <m:t>(</m:t>
+        </m:r>
+        <m:r>
+          <w:rPr>
+            <w:rFonts w:ascii="Cambria Math" w:hAnsi="Cambria Math"/>
+          </w:rPr>
+          <m:t>t</m:t>
+        </m:r>
+        <m:r>
+          <w:rPr>
+            <w:rFonts w:ascii="Cambria Math" w:hAnsi="Cambria Math"/>
+          </w:rPr>
+          <m:t>,</m:t>
+        </m:r>
+        <m:r>
+          <w:rPr>
+            <w:rFonts w:ascii="Cambria Math" w:hAnsi="Cambria Math"/>
+          </w:rPr>
+          <m:t>d</m:t>
+        </m:r>
+        <m:r>
+          <w:rPr>
+            <w:rFonts w:ascii="Cambria Math" w:hAnsi="Cambria Math"/>
+          </w:rPr>
+          <m:t>)))·(</m:t>
+        </m:r>
+        <m:r>
+          <w:rPr>
+            <w:rFonts w:ascii="Cambria Math" w:hAnsi="Cambria Math"/>
+          </w:rPr>
+          <m:t>log</m:t>
         </m:r>
         <m:f>
           <m:fPr>
@@ -11307,7 +12159,13 @@
               <w:rPr>
                 <w:rFonts w:ascii="Cambria Math" w:hAnsi="Cambria Math"/>
               </w:rPr>
-              <m:t>1+N</m:t>
+              <m:t>1+</m:t>
+            </m:r>
+            <m:r>
+              <w:rPr>
+                <w:rFonts w:ascii="Cambria Math" w:hAnsi="Cambria Math"/>
+              </w:rPr>
+              <m:t>N</m:t>
             </m:r>
           </m:num>
           <m:den>
@@ -11315,7 +12173,31 @@
               <w:rPr>
                 <w:rFonts w:ascii="Cambria Math" w:hAnsi="Cambria Math"/>
               </w:rPr>
-              <m:t>1+df(t)</m:t>
+              <m:t>1+</m:t>
+            </m:r>
+            <m:r>
+              <w:rPr>
+                <w:rFonts w:ascii="Cambria Math" w:hAnsi="Cambria Math"/>
+              </w:rPr>
+              <m:t>df</m:t>
+            </m:r>
+            <m:r>
+              <w:rPr>
+                <w:rFonts w:ascii="Cambria Math" w:hAnsi="Cambria Math"/>
+              </w:rPr>
+              <m:t>(</m:t>
+            </m:r>
+            <m:r>
+              <w:rPr>
+                <w:rFonts w:ascii="Cambria Math" w:hAnsi="Cambria Math"/>
+              </w:rPr>
+              <m:t>t</m:t>
+            </m:r>
+            <m:r>
+              <w:rPr>
+                <w:rFonts w:ascii="Cambria Math" w:hAnsi="Cambria Math"/>
+              </w:rPr>
+              <m:t>)</m:t>
             </m:r>
           </m:den>
         </m:f>
@@ -11364,7 +12246,19 @@
         <w:pStyle w:val="BDpagrindinistekstas"/>
       </w:pPr>
       <w:r>
-        <w:t>Logistic regression models the probability of the positive class as P(y = 1 | x) = σ(wᵀx + b), where σ(z) = 1 / (1 + e⁻ᶻ), and minimises the L2-regularised log-loss (inverse regularisation strength C = 4).</w:t>
+        <w:t>Logistic regression models the probability of the positive class as P(y = 1 | x) = σ(w</w:t>
+      </w:r>
+      <w:r>
+        <w:t>ᵀ</w:t>
+      </w:r>
+      <w:r>
+        <w:t>x + b), where σ(z) = 1 / (1 + e⁻</w:t>
+      </w:r>
+      <w:r>
+        <w:t>ᶻ</w:t>
+      </w:r>
+      <w:r>
+        <w:t>), and minimises the L2-regularised log-loss (inverse regularisation strength C = 4).</w:t>
       </w:r>
     </w:p>
     <w:p>
@@ -11406,7 +12300,19 @@
               <w:rPr>
                 <w:rFonts w:ascii="Cambria Math" w:hAnsi="Cambria Math"/>
               </w:rPr>
-              <m:t>w,b</m:t>
+              <m:t>w</m:t>
+            </m:r>
+            <m:r>
+              <w:rPr>
+                <w:rFonts w:ascii="Cambria Math" w:hAnsi="Cambria Math"/>
+              </w:rPr>
+              <m:t>,</m:t>
+            </m:r>
+            <m:r>
+              <w:rPr>
+                <w:rFonts w:ascii="Cambria Math" w:hAnsi="Cambria Math"/>
+              </w:rPr>
+              <m:t>b</m:t>
             </m:r>
           </m:sub>
         </m:sSub>
@@ -11445,7 +12351,13 @@
           <w:rPr>
             <w:rFonts w:ascii="Cambria Math" w:hAnsi="Cambria Math"/>
           </w:rPr>
-          <m:t>‖w</m:t>
+          <m:t>‖</m:t>
+        </m:r>
+        <m:r>
+          <w:rPr>
+            <w:rFonts w:ascii="Cambria Math" w:hAnsi="Cambria Math"/>
+          </w:rPr>
+          <m:t>w</m:t>
         </m:r>
         <m:sSup>
           <m:sSupPr>
@@ -11476,7 +12388,13 @@
           <w:rPr>
             <w:rFonts w:ascii="Cambria Math" w:hAnsi="Cambria Math"/>
           </w:rPr>
-          <m:t>+C</m:t>
+          <m:t>+</m:t>
+        </m:r>
+        <m:r>
+          <w:rPr>
+            <w:rFonts w:ascii="Cambria Math" w:hAnsi="Cambria Math"/>
+          </w:rPr>
+          <m:t>C</m:t>
         </m:r>
         <m:nary>
           <m:naryPr>
@@ -11504,7 +12422,13 @@
               <w:rPr>
                 <w:rFonts w:ascii="Cambria Math" w:hAnsi="Cambria Math"/>
               </w:rPr>
-              <m:t>max(0,1-</m:t>
+              <m:t>max</m:t>
+            </m:r>
+            <m:r>
+              <w:rPr>
+                <w:rFonts w:ascii="Cambria Math" w:hAnsi="Cambria Math"/>
+              </w:rPr>
+              <m:t>(0,1-</m:t>
             </m:r>
             <m:sSub>
               <m:sSubPr>
@@ -11591,7 +12515,19 @@
               <w:rPr>
                 <w:rFonts w:ascii="Cambria Math" w:hAnsi="Cambria Math"/>
               </w:rPr>
-              <m:t>+b))</m:t>
+              <m:t>+</m:t>
+            </m:r>
+            <m:r>
+              <w:rPr>
+                <w:rFonts w:ascii="Cambria Math" w:hAnsi="Cambria Math"/>
+              </w:rPr>
+              <m:t>b</m:t>
+            </m:r>
+            <m:r>
+              <w:rPr>
+                <w:rFonts w:ascii="Cambria Math" w:hAnsi="Cambria Math"/>
+              </w:rPr>
+              <m:t>))</m:t>
             </m:r>
           </m:e>
         </m:nary>
@@ -11610,7 +12546,13 @@
         <w:pStyle w:val="BDpagrindinistekstas"/>
       </w:pPr>
       <w:r>
-        <w:t>with labels coded as yᵢ ∈ {−1, +1} and C = 0.5.</w:t>
+        <w:t>with labels coded as y</w:t>
+      </w:r>
+      <w:r>
+        <w:t>ᵢ</w:t>
+      </w:r>
+      <w:r>
+        <w:t xml:space="preserve"> ∈ {−1, +1} and C = 0.5.</w:t>
       </w:r>
     </w:p>
     <w:p>
@@ -11669,7 +12611,19 @@
           <w:rPr>
             <w:rFonts w:ascii="Cambria Math" w:hAnsi="Cambria Math"/>
           </w:rPr>
-          <m:t>=σ(</m:t>
+          <m:t>=</m:t>
+        </m:r>
+        <m:r>
+          <w:rPr>
+            <w:rFonts w:ascii="Cambria Math" w:hAnsi="Cambria Math"/>
+          </w:rPr>
+          <m:t>σ</m:t>
+        </m:r>
+        <m:r>
+          <w:rPr>
+            <w:rFonts w:ascii="Cambria Math" w:hAnsi="Cambria Math"/>
+          </w:rPr>
+          <m:t>(</m:t>
         </m:r>
         <m:sSub>
           <m:sSubPr>
@@ -11723,7 +12677,19 @@
               <w:rPr>
                 <w:rFonts w:ascii="Cambria Math" w:hAnsi="Cambria Math"/>
               </w:rPr>
-              <m:t>t-1</m:t>
+              <m:t>t</m:t>
+            </m:r>
+            <m:r>
+              <w:rPr>
+                <w:rFonts w:ascii="Cambria Math" w:hAnsi="Cambria Math"/>
+              </w:rPr>
+              <m:t>-</m:t>
+            </m:r>
+            <m:r>
+              <w:rPr>
+                <w:rFonts w:ascii="Cambria Math" w:hAnsi="Cambria Math"/>
+              </w:rPr>
+              <m:t>1</m:t>
             </m:r>
           </m:sub>
         </m:sSub>
@@ -11824,7 +12790,19 @@
           <w:rPr>
             <w:rFonts w:ascii="Cambria Math" w:hAnsi="Cambria Math"/>
           </w:rPr>
-          <m:t>=σ(</m:t>
+          <m:t>=</m:t>
+        </m:r>
+        <m:r>
+          <w:rPr>
+            <w:rFonts w:ascii="Cambria Math" w:hAnsi="Cambria Math"/>
+          </w:rPr>
+          <m:t>σ</m:t>
+        </m:r>
+        <m:r>
+          <w:rPr>
+            <w:rFonts w:ascii="Cambria Math" w:hAnsi="Cambria Math"/>
+          </w:rPr>
+          <m:t>(</m:t>
         </m:r>
         <m:sSub>
           <m:sSubPr>
@@ -11878,7 +12856,19 @@
               <w:rPr>
                 <w:rFonts w:ascii="Cambria Math" w:hAnsi="Cambria Math"/>
               </w:rPr>
-              <m:t>t-1</m:t>
+              <m:t>t</m:t>
+            </m:r>
+            <m:r>
+              <w:rPr>
+                <w:rFonts w:ascii="Cambria Math" w:hAnsi="Cambria Math"/>
+              </w:rPr>
+              <m:t>-</m:t>
+            </m:r>
+            <m:r>
+              <w:rPr>
+                <w:rFonts w:ascii="Cambria Math" w:hAnsi="Cambria Math"/>
+              </w:rPr>
+              <m:t>1</m:t>
             </m:r>
           </m:sub>
         </m:sSub>
@@ -11979,7 +12969,19 @@
           <w:rPr>
             <w:rFonts w:ascii="Cambria Math" w:hAnsi="Cambria Math"/>
           </w:rPr>
-          <m:t>=σ(</m:t>
+          <m:t>=</m:t>
+        </m:r>
+        <m:r>
+          <w:rPr>
+            <w:rFonts w:ascii="Cambria Math" w:hAnsi="Cambria Math"/>
+          </w:rPr>
+          <m:t>σ</m:t>
+        </m:r>
+        <m:r>
+          <w:rPr>
+            <w:rFonts w:ascii="Cambria Math" w:hAnsi="Cambria Math"/>
+          </w:rPr>
+          <m:t>(</m:t>
         </m:r>
         <m:sSub>
           <m:sSubPr>
@@ -12033,7 +13035,19 @@
               <w:rPr>
                 <w:rFonts w:ascii="Cambria Math" w:hAnsi="Cambria Math"/>
               </w:rPr>
-              <m:t>t-1</m:t>
+              <m:t>t</m:t>
+            </m:r>
+            <m:r>
+              <w:rPr>
+                <w:rFonts w:ascii="Cambria Math" w:hAnsi="Cambria Math"/>
+              </w:rPr>
+              <m:t>-</m:t>
+            </m:r>
+            <m:r>
+              <w:rPr>
+                <w:rFonts w:ascii="Cambria Math" w:hAnsi="Cambria Math"/>
+              </w:rPr>
+              <m:t>1</m:t>
             </m:r>
           </m:sub>
         </m:sSub>
@@ -12172,7 +13186,19 @@
           <w:rPr>
             <w:rFonts w:ascii="Cambria Math" w:hAnsi="Cambria Math"/>
           </w:rPr>
-          <m:t>=tanh(</m:t>
+          <m:t>=</m:t>
+        </m:r>
+        <m:r>
+          <w:rPr>
+            <w:rFonts w:ascii="Cambria Math" w:hAnsi="Cambria Math"/>
+          </w:rPr>
+          <m:t>tanh</m:t>
+        </m:r>
+        <m:r>
+          <w:rPr>
+            <w:rFonts w:ascii="Cambria Math" w:hAnsi="Cambria Math"/>
+          </w:rPr>
+          <m:t>(</m:t>
         </m:r>
         <m:sSub>
           <m:sSubPr>
@@ -12226,7 +13252,19 @@
               <w:rPr>
                 <w:rFonts w:ascii="Cambria Math" w:hAnsi="Cambria Math"/>
               </w:rPr>
-              <m:t>t-1</m:t>
+              <m:t>t</m:t>
+            </m:r>
+            <m:r>
+              <w:rPr>
+                <w:rFonts w:ascii="Cambria Math" w:hAnsi="Cambria Math"/>
+              </w:rPr>
+              <m:t>-</m:t>
+            </m:r>
+            <m:r>
+              <w:rPr>
+                <w:rFonts w:ascii="Cambria Math" w:hAnsi="Cambria Math"/>
+              </w:rPr>
+              <m:t>1</m:t>
             </m:r>
           </m:sub>
         </m:sSub>
@@ -12381,7 +13419,19 @@
               <w:rPr>
                 <w:rFonts w:ascii="Cambria Math" w:hAnsi="Cambria Math"/>
               </w:rPr>
-              <m:t>t-1</m:t>
+              <m:t>t</m:t>
+            </m:r>
+            <m:r>
+              <w:rPr>
+                <w:rFonts w:ascii="Cambria Math" w:hAnsi="Cambria Math"/>
+              </w:rPr>
+              <m:t>-</m:t>
+            </m:r>
+            <m:r>
+              <w:rPr>
+                <w:rFonts w:ascii="Cambria Math" w:hAnsi="Cambria Math"/>
+              </w:rPr>
+              <m:t>1</m:t>
             </m:r>
           </m:sub>
         </m:sSub>
@@ -12532,7 +13582,19 @@
           <w:rPr>
             <w:rFonts w:ascii="Cambria Math" w:hAnsi="Cambria Math"/>
           </w:rPr>
-          <m:t>⊙tanh(</m:t>
+          <m:t>⊙</m:t>
+        </m:r>
+        <m:r>
+          <w:rPr>
+            <w:rFonts w:ascii="Cambria Math" w:hAnsi="Cambria Math"/>
+          </w:rPr>
+          <m:t>tanh</m:t>
+        </m:r>
+        <m:r>
+          <w:rPr>
+            <w:rFonts w:ascii="Cambria Math" w:hAnsi="Cambria Math"/>
+          </w:rPr>
+          <m:t>(</m:t>
         </m:r>
         <m:sSub>
           <m:sSubPr>
@@ -12580,7 +13642,10 @@
         <w:pStyle w:val="BDpagrindinistekstas"/>
       </w:pPr>
       <w:r>
-        <w:t>The forget, input and output gates (fₜ, iₜ, oₜ) control what information is kept in the memory cell cₜ. A bidirectional LSTM runs one LSTM from left to right and another from right to left and concatenates their hidden states. The sentence representation is obtained by max-pooling over time, followed by dropout (p = 0.3) and a linear output layer. Embeddings (dimension 128) and all weights are initialised randomly, i.e. the model has no pre-trained knowledge. It is trained for 4 epochs with Adam (learning rate 0.001, batch size 64), and the epoch with the best dev accuracy is kept.</w:t>
+        <w:t xml:space="preserve">The forget, input and output gates (fₜ, iₜ, oₜ) control what information is kept in the memory cell cₜ. A bidirectional LSTM runs one LSTM from left to right and </w:t>
+      </w:r>
+      <w:r>
+        <w:t>another from right to left and concatenates their hidden states. The sentence representation is obtained by max-pooling over time, followed by dropout (p = 0.3) and a linear output layer. Embeddings (dimension 128) and all weights are initialised randomly, i.e. the model has no pre-trained knowledge. It is trained for 4 epochs with Adam (learning rate 0.001, batch size 64), and the epoch with the best dev accuracy is kept.</w:t>
       </w:r>
     </w:p>
     <w:p>
@@ -12657,7 +13722,37 @@
               <w:rPr>
                 <w:rFonts w:ascii="Cambria Math" w:hAnsi="Cambria Math"/>
               </w:rPr>
-              <m:t>c∈{pos,neg}</m:t>
+              <m:t>c</m:t>
+            </m:r>
+            <m:r>
+              <w:rPr>
+                <w:rFonts w:ascii="Cambria Math" w:hAnsi="Cambria Math"/>
+              </w:rPr>
+              <m:t>∈{</m:t>
+            </m:r>
+            <m:r>
+              <w:rPr>
+                <w:rFonts w:ascii="Cambria Math" w:hAnsi="Cambria Math"/>
+              </w:rPr>
+              <m:t>pos</m:t>
+            </m:r>
+            <m:r>
+              <w:rPr>
+                <w:rFonts w:ascii="Cambria Math" w:hAnsi="Cambria Math"/>
+              </w:rPr>
+              <m:t>,</m:t>
+            </m:r>
+            <m:r>
+              <w:rPr>
+                <w:rFonts w:ascii="Cambria Math" w:hAnsi="Cambria Math"/>
+              </w:rPr>
+              <m:t>neg</m:t>
+            </m:r>
+            <m:r>
+              <w:rPr>
+                <w:rFonts w:ascii="Cambria Math" w:hAnsi="Cambria Math"/>
+              </w:rPr>
+              <m:t>}</m:t>
             </m:r>
           </m:lim>
         </m:limLow>
@@ -12665,7 +13760,49 @@
           <w:rPr>
             <w:rFonts w:ascii="Cambria Math" w:hAnsi="Cambria Math"/>
           </w:rPr>
-          <m:t>P(entailment∣x,h(c))</m:t>
+          <m:t>P</m:t>
+        </m:r>
+        <m:r>
+          <w:rPr>
+            <w:rFonts w:ascii="Cambria Math" w:hAnsi="Cambria Math"/>
+          </w:rPr>
+          <m:t>(</m:t>
+        </m:r>
+        <m:r>
+          <w:rPr>
+            <w:rFonts w:ascii="Cambria Math" w:hAnsi="Cambria Math"/>
+          </w:rPr>
+          <m:t>entailment</m:t>
+        </m:r>
+        <m:r>
+          <w:rPr>
+            <w:rFonts w:ascii="Cambria Math" w:hAnsi="Cambria Math"/>
+          </w:rPr>
+          <m:t>∣</m:t>
+        </m:r>
+        <m:r>
+          <w:rPr>
+            <w:rFonts w:ascii="Cambria Math" w:hAnsi="Cambria Math"/>
+          </w:rPr>
+          <m:t>x</m:t>
+        </m:r>
+        <m:r>
+          <w:rPr>
+            <w:rFonts w:ascii="Cambria Math" w:hAnsi="Cambria Math"/>
+          </w:rPr>
+          <m:t>,h(</m:t>
+        </m:r>
+        <m:r>
+          <w:rPr>
+            <w:rFonts w:ascii="Cambria Math" w:hAnsi="Cambria Math"/>
+          </w:rPr>
+          <m:t>c</m:t>
+        </m:r>
+        <m:r>
+          <w:rPr>
+            <w:rFonts w:ascii="Cambria Math" w:hAnsi="Cambria Math"/>
+          </w:rPr>
+          <m:t>))</m:t>
         </m:r>
       </m:oMath>
       <w:r>
@@ -12716,139 +13853,8 @@
           <w:rPr>
             <w:rFonts w:ascii="Cambria Math" w:hAnsi="Cambria Math"/>
           </w:rPr>
-          <m:t>Accuracy=</m:t>
+          <m:t>Accuracy</m:t>
         </m:r>
-        <m:f>
-          <m:fPr>
-            <m:ctrlPr>
-              <w:rPr>
-                <w:rFonts w:ascii="Cambria Math" w:hAnsi="Cambria Math"/>
-              </w:rPr>
-            </m:ctrlPr>
-          </m:fPr>
-          <m:num>
-            <m:r>
-              <w:rPr>
-                <w:rFonts w:ascii="Cambria Math" w:hAnsi="Cambria Math"/>
-              </w:rPr>
-              <m:t>TP+TN</m:t>
-            </m:r>
-          </m:num>
-          <m:den>
-            <m:r>
-              <w:rPr>
-                <w:rFonts w:ascii="Cambria Math" w:hAnsi="Cambria Math"/>
-              </w:rPr>
-              <m:t>TP+TN+FP+FN</m:t>
-            </m:r>
-          </m:den>
-        </m:f>
-        <m:r>
-          <w:rPr>
-            <w:rFonts w:ascii="Cambria Math" w:hAnsi="Cambria Math"/>
-          </w:rPr>
-          <m:t>,Precision=</m:t>
-        </m:r>
-        <m:f>
-          <m:fPr>
-            <m:ctrlPr>
-              <w:rPr>
-                <w:rFonts w:ascii="Cambria Math" w:hAnsi="Cambria Math"/>
-              </w:rPr>
-            </m:ctrlPr>
-          </m:fPr>
-          <m:num>
-            <m:r>
-              <w:rPr>
-                <w:rFonts w:ascii="Cambria Math" w:hAnsi="Cambria Math"/>
-              </w:rPr>
-              <m:t>TP</m:t>
-            </m:r>
-          </m:num>
-          <m:den>
-            <m:r>
-              <w:rPr>
-                <w:rFonts w:ascii="Cambria Math" w:hAnsi="Cambria Math"/>
-              </w:rPr>
-              <m:t>TP+FP</m:t>
-            </m:r>
-          </m:den>
-        </m:f>
-        <m:r>
-          <w:rPr>
-            <w:rFonts w:ascii="Cambria Math" w:hAnsi="Cambria Math"/>
-          </w:rPr>
-          <m:t>,Recall=</m:t>
-        </m:r>
-        <m:f>
-          <m:fPr>
-            <m:ctrlPr>
-              <w:rPr>
-                <w:rFonts w:ascii="Cambria Math" w:hAnsi="Cambria Math"/>
-              </w:rPr>
-            </m:ctrlPr>
-          </m:fPr>
-          <m:num>
-            <m:r>
-              <w:rPr>
-                <w:rFonts w:ascii="Cambria Math" w:hAnsi="Cambria Math"/>
-              </w:rPr>
-              <m:t>TP</m:t>
-            </m:r>
-          </m:num>
-          <m:den>
-            <m:r>
-              <w:rPr>
-                <w:rFonts w:ascii="Cambria Math" w:hAnsi="Cambria Math"/>
-              </w:rPr>
-              <m:t>TP+FN</m:t>
-            </m:r>
-          </m:den>
-        </m:f>
-      </m:oMath>
-      <w:r>
-        <w:rPr>
-          <w:i w:val="0"/>
-          <w:sz w:val="24"/>
-        </w:rPr>
-        <w:tab/>
-        <w:t>(19)</w:t>
-      </w:r>
-    </w:p>
-    <w:p>
-      <w:pPr>
-        <w:pStyle w:val="BDformule"/>
-        <w:spacing w:before="60"/>
-      </w:pPr>
-      <w:r>
-        <w:tab/>
-      </w:r>
-      <m:oMath>
-        <m:sSub>
-          <m:sSubPr>
-            <m:ctrlPr>
-              <w:rPr>
-                <w:rFonts w:ascii="Cambria Math" w:hAnsi="Cambria Math"/>
-              </w:rPr>
-            </m:ctrlPr>
-          </m:sSubPr>
-          <m:e>
-            <m:r>
-              <w:rPr>
-                <w:rFonts w:ascii="Cambria Math" w:hAnsi="Cambria Math"/>
-              </w:rPr>
-              <m:t>F</m:t>
-            </m:r>
-          </m:e>
-          <m:sub>
-            <m:r>
-              <w:rPr>
-                <w:rFonts w:ascii="Cambria Math" w:hAnsi="Cambria Math"/>
-              </w:rPr>
-              <m:t>1</m:t>
-            </m:r>
-          </m:sub>
-        </m:sSub>
         <m:r>
           <w:rPr>
             <w:rFonts w:ascii="Cambria Math" w:hAnsi="Cambria Math"/>
@@ -12868,7 +13874,19 @@
               <w:rPr>
                 <w:rFonts w:ascii="Cambria Math" w:hAnsi="Cambria Math"/>
               </w:rPr>
-              <m:t>2·Precision·Recall</m:t>
+              <m:t>TP</m:t>
+            </m:r>
+            <m:r>
+              <w:rPr>
+                <w:rFonts w:ascii="Cambria Math" w:hAnsi="Cambria Math"/>
+              </w:rPr>
+              <m:t>+</m:t>
+            </m:r>
+            <m:r>
+              <w:rPr>
+                <w:rFonts w:ascii="Cambria Math" w:hAnsi="Cambria Math"/>
+              </w:rPr>
+              <m:t>TN</m:t>
             </m:r>
           </m:num>
           <m:den>
@@ -12876,7 +13894,153 @@
               <w:rPr>
                 <w:rFonts w:ascii="Cambria Math" w:hAnsi="Cambria Math"/>
               </w:rPr>
-              <m:t>Precision+Recall</m:t>
+              <m:t>TP</m:t>
+            </m:r>
+            <m:r>
+              <w:rPr>
+                <w:rFonts w:ascii="Cambria Math" w:hAnsi="Cambria Math"/>
+              </w:rPr>
+              <m:t>+</m:t>
+            </m:r>
+            <m:r>
+              <w:rPr>
+                <w:rFonts w:ascii="Cambria Math" w:hAnsi="Cambria Math"/>
+              </w:rPr>
+              <m:t>TN</m:t>
+            </m:r>
+            <m:r>
+              <w:rPr>
+                <w:rFonts w:ascii="Cambria Math" w:hAnsi="Cambria Math"/>
+              </w:rPr>
+              <m:t>+</m:t>
+            </m:r>
+            <m:r>
+              <w:rPr>
+                <w:rFonts w:ascii="Cambria Math" w:hAnsi="Cambria Math"/>
+              </w:rPr>
+              <m:t>FP</m:t>
+            </m:r>
+            <m:r>
+              <w:rPr>
+                <w:rFonts w:ascii="Cambria Math" w:hAnsi="Cambria Math"/>
+              </w:rPr>
+              <m:t>+</m:t>
+            </m:r>
+            <m:r>
+              <w:rPr>
+                <w:rFonts w:ascii="Cambria Math" w:hAnsi="Cambria Math"/>
+              </w:rPr>
+              <m:t>FN</m:t>
+            </m:r>
+          </m:den>
+        </m:f>
+        <m:r>
+          <w:rPr>
+            <w:rFonts w:ascii="Cambria Math" w:hAnsi="Cambria Math"/>
+          </w:rPr>
+          <m:t>,</m:t>
+        </m:r>
+        <m:r>
+          <w:rPr>
+            <w:rFonts w:ascii="Cambria Math" w:hAnsi="Cambria Math"/>
+          </w:rPr>
+          <m:t>Precision</m:t>
+        </m:r>
+        <m:r>
+          <w:rPr>
+            <w:rFonts w:ascii="Cambria Math" w:hAnsi="Cambria Math"/>
+          </w:rPr>
+          <m:t>=</m:t>
+        </m:r>
+        <m:f>
+          <m:fPr>
+            <m:ctrlPr>
+              <w:rPr>
+                <w:rFonts w:ascii="Cambria Math" w:hAnsi="Cambria Math"/>
+              </w:rPr>
+            </m:ctrlPr>
+          </m:fPr>
+          <m:num>
+            <m:r>
+              <w:rPr>
+                <w:rFonts w:ascii="Cambria Math" w:hAnsi="Cambria Math"/>
+              </w:rPr>
+              <m:t>TP</m:t>
+            </m:r>
+          </m:num>
+          <m:den>
+            <m:r>
+              <w:rPr>
+                <w:rFonts w:ascii="Cambria Math" w:hAnsi="Cambria Math"/>
+              </w:rPr>
+              <m:t>TP</m:t>
+            </m:r>
+            <m:r>
+              <w:rPr>
+                <w:rFonts w:ascii="Cambria Math" w:hAnsi="Cambria Math"/>
+              </w:rPr>
+              <m:t>+</m:t>
+            </m:r>
+            <m:r>
+              <w:rPr>
+                <w:rFonts w:ascii="Cambria Math" w:hAnsi="Cambria Math"/>
+              </w:rPr>
+              <m:t>FP</m:t>
+            </m:r>
+          </m:den>
+        </m:f>
+        <m:r>
+          <w:rPr>
+            <w:rFonts w:ascii="Cambria Math" w:hAnsi="Cambria Math"/>
+          </w:rPr>
+          <m:t>,</m:t>
+        </m:r>
+        <m:r>
+          <w:rPr>
+            <w:rFonts w:ascii="Cambria Math" w:hAnsi="Cambria Math"/>
+          </w:rPr>
+          <m:t>Recall</m:t>
+        </m:r>
+        <m:r>
+          <w:rPr>
+            <w:rFonts w:ascii="Cambria Math" w:hAnsi="Cambria Math"/>
+          </w:rPr>
+          <m:t>=</m:t>
+        </m:r>
+        <m:f>
+          <m:fPr>
+            <m:ctrlPr>
+              <w:rPr>
+                <w:rFonts w:ascii="Cambria Math" w:hAnsi="Cambria Math"/>
+              </w:rPr>
+            </m:ctrlPr>
+          </m:fPr>
+          <m:num>
+            <m:r>
+              <w:rPr>
+                <w:rFonts w:ascii="Cambria Math" w:hAnsi="Cambria Math"/>
+              </w:rPr>
+              <m:t>TP</m:t>
+            </m:r>
+          </m:num>
+          <m:den>
+            <m:r>
+              <w:rPr>
+                <w:rFonts w:ascii="Cambria Math" w:hAnsi="Cambria Math"/>
+              </w:rPr>
+              <m:t>TP</m:t>
+            </m:r>
+            <m:r>
+              <w:rPr>
+                <w:rFonts w:ascii="Cambria Math" w:hAnsi="Cambria Math"/>
+              </w:rPr>
+              <m:t>+</m:t>
+            </m:r>
+            <m:r>
+              <w:rPr>
+                <w:rFonts w:ascii="Cambria Math" w:hAnsi="Cambria Math"/>
+              </w:rPr>
+              <m:t>FN</m:t>
             </m:r>
           </m:den>
         </m:f>
@@ -12887,6 +14051,111 @@
           <w:sz w:val="24"/>
         </w:rPr>
         <w:tab/>
+        <w:t>(19)</w:t>
+      </w:r>
+    </w:p>
+    <w:p>
+      <w:pPr>
+        <w:pStyle w:val="BDformule"/>
+        <w:spacing w:before="60"/>
+      </w:pPr>
+      <w:r>
+        <w:tab/>
+      </w:r>
+      <m:oMath>
+        <m:sSub>
+          <m:sSubPr>
+            <m:ctrlPr>
+              <w:rPr>
+                <w:rFonts w:ascii="Cambria Math" w:hAnsi="Cambria Math"/>
+              </w:rPr>
+            </m:ctrlPr>
+          </m:sSubPr>
+          <m:e>
+            <m:r>
+              <w:rPr>
+                <w:rFonts w:ascii="Cambria Math" w:hAnsi="Cambria Math"/>
+              </w:rPr>
+              <m:t>F</m:t>
+            </m:r>
+          </m:e>
+          <m:sub>
+            <m:r>
+              <w:rPr>
+                <w:rFonts w:ascii="Cambria Math" w:hAnsi="Cambria Math"/>
+              </w:rPr>
+              <m:t>1</m:t>
+            </m:r>
+          </m:sub>
+        </m:sSub>
+        <m:r>
+          <w:rPr>
+            <w:rFonts w:ascii="Cambria Math" w:hAnsi="Cambria Math"/>
+          </w:rPr>
+          <m:t>=</m:t>
+        </m:r>
+        <m:f>
+          <m:fPr>
+            <m:ctrlPr>
+              <w:rPr>
+                <w:rFonts w:ascii="Cambria Math" w:hAnsi="Cambria Math"/>
+              </w:rPr>
+            </m:ctrlPr>
+          </m:fPr>
+          <m:num>
+            <m:r>
+              <w:rPr>
+                <w:rFonts w:ascii="Cambria Math" w:hAnsi="Cambria Math"/>
+              </w:rPr>
+              <m:t>2·</m:t>
+            </m:r>
+            <m:r>
+              <w:rPr>
+                <w:rFonts w:ascii="Cambria Math" w:hAnsi="Cambria Math"/>
+              </w:rPr>
+              <m:t>Precision</m:t>
+            </m:r>
+            <m:r>
+              <w:rPr>
+                <w:rFonts w:ascii="Cambria Math" w:hAnsi="Cambria Math"/>
+              </w:rPr>
+              <m:t>·</m:t>
+            </m:r>
+            <m:r>
+              <w:rPr>
+                <w:rFonts w:ascii="Cambria Math" w:hAnsi="Cambria Math"/>
+              </w:rPr>
+              <m:t>Recall</m:t>
+            </m:r>
+          </m:num>
+          <m:den>
+            <m:r>
+              <w:rPr>
+                <w:rFonts w:ascii="Cambria Math" w:hAnsi="Cambria Math"/>
+              </w:rPr>
+              <m:t>Precision</m:t>
+            </m:r>
+            <m:r>
+              <w:rPr>
+                <w:rFonts w:ascii="Cambria Math" w:hAnsi="Cambria Math"/>
+              </w:rPr>
+              <m:t>+</m:t>
+            </m:r>
+            <m:r>
+              <w:rPr>
+                <w:rFonts w:ascii="Cambria Math" w:hAnsi="Cambria Math"/>
+              </w:rPr>
+              <m:t>Recall</m:t>
+            </m:r>
+          </m:den>
+        </m:f>
+      </m:oMath>
+      <w:r>
+        <w:rPr>
+          <w:i w:val="0"/>
+          <w:sz w:val="24"/>
+        </w:rPr>
+        <w:tab/>
         <w:t>(20)</w:t>
       </w:r>
     </w:p>
@@ -12895,7 +14164,10 @@
         <w:pStyle w:val="BDpagrindinistekstas"/>
       </w:pPr>
       <w:r>
-        <w:t>Precision, recall and F1 are computed for each class and averaged (macro average), so both classes have equal weight.</w:t>
+        <w:t xml:space="preserve">Precision, recall and F1 are computed for each class and averaged (macro average), so both classes have equal </w:t>
+      </w:r>
+      <w:r>
+        <w:t>weight.</w:t>
       </w:r>
     </w:p>
     <w:p>
@@ -12903,14 +14175,17 @@
         <w:pStyle w:val="BDpagrindinistekstas"/>
       </w:pPr>
       <w:r>
-        <w:t>The test set contains only 872 sentences, so a difference of one percentage point corresponds to about nine sentences. To quantify uncertainty, 95% confidence intervals of accuracy are estimated with the bootstrap: the test set is resampled with replacement 2,000 times, accuracy is computed for each resample, and the 2.5th and 97.5th percentiles are taken. To test whether two models differ significantly, McNemar’s test is applied to their paired predictions. If b is the number of sentences classified correctly only by model A and c the number classified correctly only by model B, then under the null hypothesis of equal accuracy b ~ Binomial(b + c, 0.5). We use the exact binomial version of the test, with significance level 0.05.</w:t>
+        <w:t>The test set contains only 872 sentences, so a difference of one percentage point corresponds to about nine sentences. To quantify uncertainty, 95% confidence intervals of accuracy are estimated with the bootstrap: the test set is resampled with replacement 2,000 times, accuracy is computed for each resample, and the 2.5th and 97.5th percentiles are taken. To test whether two models differ significantly, McNemar’s test is applied to their paired predictions. If b is the number of sentences classified correc</w:t>
+      </w:r>
+      <w:r>
+        <w:t>tly only by model A and c the number classified correctly only by model B, then under the null hypothesis of equal accuracy b ~ Binomial(b + c, 0.5). We use the exact binomial version of the test, with significance level 0.05.</w:t>
       </w:r>
     </w:p>
     <w:p>
       <w:pPr>
         <w:pStyle w:val="BDSkyrius2lygio"/>
       </w:pPr>
-      <w:bookmarkStart w:id="26" w:name="_Toc243416171"/>
+      <w:bookmarkStart w:id="26" w:name="_Toc243418799"/>
       <w:r>
         <w:t>Experimental protocol and threats to validity</w:t>
       </w:r>
@@ -12921,7 +14196,10 @@
         <w:pStyle w:val="BDpagrindinistekstas"/>
       </w:pPr>
       <w:r>
-        <w:t>The experiment follows a fixed protocol so that all competitors are treated equally. (1) The data splits are created once and stored; every model reads the same CSV files. (2) Model selection uses only the dev set: the epoch with the highest dev accuracy is kept, and the test set is used exactly once per model for the final evaluation. (3) For the learning-curve experiment, the subsets of 500–8,000 training sentences are drawn with the same random seed for the classical and the Transformer model, so both learn from exactly the same examples. (4) Models are executed one after another on an otherwise idle computer, so that the measured training and inference times are not distorted by parallel jobs. (5) All hyper-parameters are fixed in advance from the literature and are not tuned on the test set.</w:t>
+        <w:t>The experiment follows a fixed protocol so that all competitors are treated equally. (1) The data splits are created once and stored; every model reads the same CSV files. (2) Model selection uses only the dev set: the epoch with the highest dev accuracy is kept, and the test set is used exactly once per model for the final evaluation. (3) For the learning-curve experiment, the subsets of 500–8,000 training sentences are drawn with the same random seed for the classical and the Transformer model, so both le</w:t>
+      </w:r>
+      <w:r>
+        <w:t>arn from exactly the same examples. (4) Models are executed one after another on an otherwise idle computer, so that the measured training and inference times are not distorted by parallel jobs. (5) All hyper-parameters are fixed in advance from the literature and are not tuned on the test set.</w:t>
       </w:r>
     </w:p>
     <w:p>
@@ -12929,7 +14207,10 @@
         <w:pStyle w:val="BDpagrindinistekstas"/>
       </w:pPr>
       <w:r>
-        <w:t>Several threats to validity should be kept in mind when interpreting the results. Internal validity: each configuration was trained once with one random seed, therefore small differences (below about one percentage point) may be caused by random variation; the bootstrap intervals and McNemar tests are used to judge which differences are reliable. Construct validity: the negation and contrast subsets are defined by simple keyword rules, which capture most but not all such constructions. External validity: the results are obtained on English movie-review sentences; for other domains or for morphologically rich languages such as Lithuanian the absolute numbers will differ, although the relative behaviour of the model families is expected to be similar, as suggested by the Lithuanian studies reviewed in Chapter 1. Finally, the timing results depend on the hardware: on a GPU the training times of the Transformer models would be one to two orders of magnitude shorter, while the classical models would gain little.</w:t>
+        <w:t>Several threats to validity should be kept in mind when interpreting the results. Internal validity: each configuration was trained once with one random seed, therefore small differences (below about one percentage point) may be caused by random variation; the bootstrap intervals and McNemar tests are used to judge which differences are reliable. Construct validity: the negation and contrast subsets are defined by simple keyword rules, which capture most but not all such constructions. External validity: th</w:t>
+      </w:r>
+      <w:r>
+        <w:t>e results are obtained on English movie-review sentences; for other domains or for morphologically rich languages such as Lithuanian the absolute numbers will differ, although the relative behaviour of the model families is expected to be similar, as suggested by the Lithuanian studies reviewed in Chapter 1. Finally, the timing results depend on the hardware: on a GPU the training times of the Transformer models would be one to two orders of magnitude shorter, while the classical models would gain little.</w:t>
       </w:r>
     </w:p>
     <w:p>
@@ -12937,7 +14218,7 @@
         <w:pStyle w:val="BDSkyrius1lygio"/>
         <w:pageBreakBefore/>
       </w:pPr>
-      <w:bookmarkStart w:id="27" w:name="_Toc243416172"/>
+      <w:bookmarkStart w:id="27" w:name="_Toc243418800"/>
       <w:r>
         <w:lastRenderedPageBreak/>
         <w:t>Practical Part: Implementation and Results</w:t>
@@ -12948,7 +14229,7 @@
       <w:pPr>
         <w:pStyle w:val="BDSkyrius2lygio"/>
       </w:pPr>
-      <w:bookmarkStart w:id="28" w:name="_Toc243416173"/>
+      <w:bookmarkStart w:id="28" w:name="_Toc243418801"/>
       <w:r>
         <w:t>Implementation of the program</w:t>
       </w:r>
@@ -12959,7 +14240,13 @@
         <w:pStyle w:val="BDpagrindinistekstas"/>
       </w:pPr>
       <w:r>
-        <w:t>The program described in Section 2.5 was implemented in Python 3.11 with PyTorch 2 (CPU build), Hugging Face Transformers and Datasets, scikit-learn and Matplotlib; it consists of about 770 lines of code in nine scripts and is published in the project repository (Appendix A). The data preparation script downloads SST-2 from the Hugging Face Hub and creates the three splits of Table 3. The classical baselines are scikit-learn pipelines (TF-IDF vectoriser followed by the classifier). The BiLSTM is a custom PyTorch module with its own tokeniser and vocabulary of the words occurring at least twice in the training data. The core of the work is the generic fine-tuning script: it loads any pre-trained encoder and its tokeniser by name, adds a two-class classification head, pads every batch dynamically to its longest sentence, and runs the training loop with AdamW, linear warm-up and decay, gradient clipping and selection of the best epoch on the dev set. The ready-made models are evaluated through the Transformers pipeline interface, and the zero-shot model through the zero-shot-classification pipeline with the hypothesis template of Section 2.7.7.</w:t>
+        <w:t>The program described in Section 2.5 was implemented in Python 3.11 with PyTorch 2 (CPU build), Hugging Face Transformers and Datasets, scikit-learn and Matplotlib; it consists of about 770 lines of code in nine scripts and is published in the project repository (Appendix A). The data preparation script downloads SST-2 from the Hugging Face Hub and creates the three splits of Table 3. The classical baselines are scikit-learn pipelines (TF-IDF vectoriser followed by the classifier). The BiLSTM is a custom Py</w:t>
+      </w:r>
+      <w:r>
+        <w:t>Torch module with its own tokeniser and vocabulary of the words occurring at least twice in the training data. The core of the work is the generic fine-tuning script: it loads any pre-trained encoder and its tokeniser by name, adds a two-class classification head, pads every batch dynamically to its longest sentence, and runs the training loop with AdamW, linear warm-up and decay, gradient clipping and selection of the best epoch on the dev set. The ready-made models are evaluated through the Transformers p</w:t>
+      </w:r>
+      <w:r>
+        <w:t>ipeline interface, and the zero-shot model through the zero-shot-classification pipeline with the hypothesis template of Section 2.7.7.</w:t>
       </w:r>
     </w:p>
     <w:p>
@@ -12967,14 +14254,17 @@
         <w:pStyle w:val="BDpagrindinistekstas"/>
       </w:pPr>
       <w:r>
-        <w:t>During development two practical problems had to be solved. The newest version of the Datasets library requires full repository names, so SST-2 is loaded as nyu-mll/glue. The compact BERT models of Turc et al. (2019) published by third parties on the Hub lacked tokenizer files compatible with the current library version, therefore the official Google checkpoints (google/bert_uncased_L-2_H-128_A-2 and L-4_H-512_A-8) were used. The whole pipeline is started by one command (run_all.sh) and executes all models one after another; every result is saved as a JSON file, from which the report script generates all tables and figures of this chapter.</w:t>
+        <w:t xml:space="preserve">During development two practical problems had to be solved. The newest version of the Datasets library requires full repository names, so SST-2 is loaded as nyu-mll/glue. The compact BERT models of Turc et al. (2019) published by third parties on the Hub lacked tokenizer files compatible with the current library version, therefore the official Google checkpoints (google/bert_uncased_L-2_H-128_A-2 and L-4_H-512_A-8) were used. The whole pipeline is started by one command (run_all.sh) and executes all models </w:t>
+      </w:r>
+      <w:r>
+        <w:t>one after another; every result is saved as a JSON file, from which the report script generates all tables and figures of this chapter.</w:t>
       </w:r>
     </w:p>
     <w:p>
       <w:pPr>
         <w:pStyle w:val="BDSkyrius2lygio"/>
       </w:pPr>
-      <w:bookmarkStart w:id="29" w:name="_Toc243416174"/>
+      <w:bookmarkStart w:id="29" w:name="_Toc243418802"/>
       <w:r>
         <w:t>Overall comparison of the models</w:t>
       </w:r>
@@ -12997,7 +14287,7 @@
         </w:numPr>
         <w:spacing w:before="120"/>
       </w:pPr>
-      <w:bookmarkStart w:id="30" w:name="_Toc243416150"/>
+      <w:bookmarkStart w:id="30" w:name="_Toc243418778"/>
       <w:r>
         <w:rPr>
           <w:b/>
@@ -13497,7 +14787,10 @@
               <w:keepNext/>
             </w:pPr>
             <w:r>
-              <w:t>Twitter-RoBERTa (off-the-shelf)</w:t>
+              <w:t xml:space="preserve">Twitter-RoBERTa </w:t>
+            </w:r>
+            <w:r>
+              <w:t>(off-the-shelf)</w:t>
             </w:r>
           </w:p>
         </w:tc>
@@ -14489,7 +15782,7 @@
       <w:r>
         <w:lastRenderedPageBreak/>
         <w:drawing>
-          <wp:inline distT="0" distB="0" distL="0" distR="0" wp14:anchorId="10FC12BE" wp14:editId="3167AC4F">
+          <wp:inline distT="0" distB="0" distL="0" distR="0" wp14:anchorId="3AB40DE2" wp14:editId="28856CBF">
             <wp:extent cx="5580000" cy="2945000"/>
             <wp:effectExtent l="0" t="0" r="0" b="0"/>
             <wp:docPr id="5" name="Picture 5"/>
@@ -14533,7 +15826,7 @@
           <w:numId w:val="0"/>
         </w:numPr>
       </w:pPr>
-      <w:bookmarkStart w:id="31" w:name="_Toc243416140"/>
+      <w:bookmarkStart w:id="31" w:name="_Toc243418768"/>
       <w:r>
         <w:rPr>
           <w:b/>
@@ -14596,7 +15889,10 @@
         <w:pStyle w:val="BDpagrindinistekstas"/>
       </w:pPr>
       <w:r>
-        <w:t>Three groups can be distinguished. The best results were obtained by the DistilBERT models: the publicly available model that its authors fine-tuned on the full SST-2 training set reached 91.1%, and the DistilBERT that we fine-tuned ourselves on only 8,000 sentences reached 88.8%. The out-of-domain Twitter-RoBERTa (85.8%) and our fine-tuned BERT-small (83.7%) form the middle group. The classical models, the BiLSTM and the zero-shot model are clustered in a narrow band between 81.8% and 82.9%. The smallest Transformer, BERT-tiny with only 4.4 million parameters, was the weakest model (76.6%), which shows that a Transformer is not automatically better: its capacity must be sufficient for the task.</w:t>
+        <w:t>Three groups can be distinguished. The best results were obtained by the DistilBERT models: the publicly available model that its authors fine-tuned on the full SST-2 training set reached 91.1%, and the DistilBERT that we fine-tuned ourselves on only 8,000 sentences reached 88.8%. The out-of-domain Twitter-RoBERTa (85.8%) and our fine-tuned BERT-small (83.7%) form the middle group. The classical models, the BiLSTM and the zero-shot model are clustered in a narrow band between 81.8% and 82.9%. The smallest T</w:t>
+      </w:r>
+      <w:r>
+        <w:t>ransformer, BERT-tiny with only 4.4 million parameters, was the weakest model (76.6%), which shows that a Transformer is not automatically better: its capacity must be sufficient for the task.</w:t>
       </w:r>
     </w:p>
     <w:p>
@@ -14604,7 +15900,13 @@
         <w:pStyle w:val="BDpagrindinistekstas"/>
       </w:pPr>
       <w:r>
-        <w:t>Table 7 shows how reliable these differences are. With 872 test sentences the 95% bootstrap confidence intervals are about ±2.5 p.p. wide. All models are significantly worse than the best one (McNemar p &lt; 0.05), including our fine-tuned DistilBERT (p = 0.029), which was trained on eight times less data. Pairwise tests against the best classical model (TF-IDF + linear SVM) show that our fine-tuned DistilBERT is significantly better: it correctly classifies 104 sentences that the SVM misses, while the opposite happens for only 53 sentences (p &lt; 0.001). In contrast, the differences between BERT-small and the SVM (71 vs 64 sentences, p = 0.61), between the BiLSTM and the SVM (p = 1.0) and between the zero-shot model and logistic regression (p = 1.0) are not statistically significant. The answer to RQ1 is therefore: a sufficiently large pre-trained Transformer improves accuracy by about 6 p.p. over the best classical and recurrent models, even when trained on far fewer labelled examples, whereas compact Transformers only match the classical baselines.</w:t>
+        <w:t>Table 7 shows how reliable these differences are. With 872 test sentences the 95% bootstrap confidence intervals are about ±2.5 p.p. wide. All models are significantly worse than the best one (McNemar p &lt; 0.05), including our fine-tuned DistilBERT (p = 0.029), which was trained on eight times less data. Pairwise tests against the best classical model (TF-IDF + linear SVM) show that our fine-tuned DistilBERT is significantly better: it correctly classifies 104 sentences that the SVM misses, while the opposit</w:t>
+      </w:r>
+      <w:r>
+        <w:t>e happens for only 53 sentences (p &lt; 0.001). In contrast, the differences between BERT-small and the SVM (71 vs 64 sentences, p = 0.61), between the BiLSTM and the SVM (p = 1.0) and between the zero-shot model and logistic regression (p = 1.0) are not statistically significant. The answer to RQ1 is therefore: a sufficiently large pre-trained Transformer improves accuracy by about 6 p.p. over the best classical and recurrent models, even when trained on far fewer labelled examples, whereas compact Transforme</w:t>
+      </w:r>
+      <w:r>
+        <w:t>rs only match the classical baselines.</w:t>
       </w:r>
     </w:p>
     <w:p>
@@ -14616,7 +15918,7 @@
         </w:numPr>
         <w:spacing w:before="120"/>
       </w:pPr>
-      <w:bookmarkStart w:id="32" w:name="_Toc243416151"/>
+      <w:bookmarkStart w:id="32" w:name="_Toc243418779"/>
       <w:r>
         <w:rPr>
           <w:b/>
@@ -15206,7 +16508,10 @@
               <w:keepNext/>
             </w:pPr>
             <w:r>
-              <w:t>TF-IDF + Linear SVM</w:t>
+              <w:t xml:space="preserve">TF-IDF + </w:t>
+            </w:r>
+            <w:r>
+              <w:t>Linear SVM</w:t>
             </w:r>
           </w:p>
         </w:tc>
@@ -15768,14 +17073,17 @@
       </w:pPr>
       <w:r>
         <w:lastRenderedPageBreak/>
-        <w:t>The BiLSTM trained from scratch reached 82.8%, practically identical to the TF-IDF models, although its training took 100–200 times longer. This agrees with the finding of Kapočiūtė-Dzikienė et al. (2019) for Lithuanian that neural networks without pre-training do not outperform well-tuned classical methods. The BiLSTM also showed clear overfitting to the training distribution: its dev accuracy (91.3%, measured on short phrases from the training distribution) was much higher than its test accuracy on complete sentences.</w:t>
+        <w:t xml:space="preserve">The BiLSTM trained from scratch reached 82.8%, practically identical to the TF-IDF models, although its training took 100–200 times longer. This agrees with the </w:t>
+      </w:r>
+      <w:r>
+        <w:t>finding of Kapočiūtė-Dzikienė et al. (2019) for Lithuanian that neural networks without pre-training do not outperform well-tuned classical methods. The BiLSTM also showed clear overfitting to the training distribution: its dev accuracy (91.3%, measured on short phrases from the training distribution) was much higher than its test accuracy on complete sentences.</w:t>
       </w:r>
     </w:p>
     <w:p>
       <w:pPr>
         <w:pStyle w:val="BDSkyrius2lygio"/>
       </w:pPr>
-      <w:bookmarkStart w:id="33" w:name="_Toc243416175"/>
+      <w:bookmarkStart w:id="33" w:name="_Toc243418803"/>
       <w:r>
         <w:t>Cost: training time, inference latency and model size</w:t>
       </w:r>
@@ -15786,7 +17094,10 @@
         <w:pStyle w:val="BDpagrindinistekstas"/>
       </w:pPr>
       <w:r>
-        <w:t>Fig. 4 relates accuracy to inference latency (RQ2). The classical models classify a sentence in about 0.05 ms and train in 2–4 seconds on all 65 thousand sentences. The BiLSTM needs 0.45 ms per sentence and 6 minutes of training. The fine-tuned Transformers are slower by two to three orders of magnitude: BERT-tiny needs 1.2 ms, BERT-small 14 ms and DistilBERT 39 ms per sentence, and the larger ready-made models 45–107 ms. The zero-shot model is the slowest because it must process every sentence once for each candidate label.</w:t>
+        <w:t>Fig. 4 relates accuracy to inference latency (RQ2). The classical models classify a sentence in about 0.05 ms and train in 2–4 seconds on all 65 thousand sentences. The BiLSTM needs 0.45 ms per sentence and 6 minutes of training. The fine-tuned Transformers are slower by two to three orders of magnitude: BERT-tiny needs 1.2 ms, BERT-small 14 ms and DistilBERT 39 ms per sentence, and the larger ready-made models 45–107 ms. The zero-shot model is the slowest because it must process every sentence once for eac</w:t>
+      </w:r>
+      <w:r>
+        <w:t>h candidate label.</w:t>
       </w:r>
     </w:p>
     <w:p>
@@ -15796,7 +17107,7 @@
       </w:pPr>
       <w:r>
         <w:drawing>
-          <wp:inline distT="0" distB="0" distL="0" distR="0" wp14:anchorId="714A2FC2" wp14:editId="4617163E">
+          <wp:inline distT="0" distB="0" distL="0" distR="0" wp14:anchorId="21A9A678" wp14:editId="0463FD39">
             <wp:extent cx="5580000" cy="3100000"/>
             <wp:effectExtent l="0" t="0" r="0" b="0"/>
             <wp:docPr id="6" name="Picture 6"/>
@@ -15840,7 +17151,7 @@
           <w:numId w:val="0"/>
         </w:numPr>
       </w:pPr>
-      <w:bookmarkStart w:id="34" w:name="_Toc243416141"/>
+      <w:bookmarkStart w:id="34" w:name="_Toc243418769"/>
       <w:r>
         <w:rPr>
           <w:b/>
@@ -15894,7 +17205,13 @@
         <w:rPr>
           <w:i w:val="0"/>
         </w:rPr>
-        <w:t>Accuracy versus inference latency on CPU (bubble area proportional to the number of parameters)</w:t>
+        <w:t xml:space="preserve">Accuracy versus inference </w:t>
+      </w:r>
+      <w:r>
+        <w:rPr>
+          <w:i w:val="0"/>
+        </w:rPr>
+        <w:t>latency on CPU (bubble area proportional to the number of parameters)</w:t>
       </w:r>
       <w:bookmarkEnd w:id="34"/>
     </w:p>
@@ -15903,14 +17220,17 @@
         <w:pStyle w:val="BDpagrindinistekstas"/>
       </w:pPr>
       <w:r>
-        <w:t>Fine-tuning on the laptop CPU took 2 minutes for BERT-tiny, 26 minutes for BERT-small and about 2.6 hours for DistilBERT (8,000 sentences, 2–3 epochs). These times should be read as upper bounds: the laptop was also used for other tasks while the longest runs were executing, which slowed them down. Even so, the conclusion is clear: on a CPU, a compact or distilled Transformer can be fine-tuned within hours, and its inference speed (about 25 sentences per second for DistilBERT) is sufficient for most interactive applications, but not for very high-volume streams, where TF-IDF models remain hundreds of times cheaper. In terms of size, the TF-IDF models have about 74 thousand weights (one per n-gram), the BiLSTM 2 million parameters, and the Transformers 4.4–125 million parameters (17–500 MB of memory in 32-bit precision).</w:t>
+        <w:t>Fine-tuning on the laptop CPU took 2 minutes for BERT-tiny, 26 minutes for BERT-small and about 2.6 hours for DistilBERT (8,000 sentences, 2–3 epochs). These times should be read as upper bounds: the laptop was also used for other tasks while the longest runs were executing, which slowed them down. Even so, the conclusion is clear: on a CPU, a compact or distilled Transformer can be fine-tuned within hours, and its inference speed (about 25 sentences per second for DistilBERT) is sufficient for most interac</w:t>
+      </w:r>
+      <w:r>
+        <w:t>tive applications, but not for very high-volume streams, where TF-IDF models remain hundreds of times cheaper. In terms of size, the TF-IDF models have about 74 thousand weights (one per n-gram), the BiLSTM 2 million parameters, and the Transformers 4.4–125 million parameters (17–500 MB of memory in 32-bit precision).</w:t>
       </w:r>
     </w:p>
     <w:p>
       <w:pPr>
         <w:pStyle w:val="BDSkyrius2lygio"/>
       </w:pPr>
-      <w:bookmarkStart w:id="35" w:name="_Toc243416176"/>
+      <w:bookmarkStart w:id="35" w:name="_Toc243418804"/>
       <w:r>
         <w:t>Data efficiency of pre-training</w:t>
       </w:r>
@@ -15933,7 +17253,7 @@
         </w:numPr>
         <w:spacing w:before="120"/>
       </w:pPr>
-      <w:bookmarkStart w:id="36" w:name="_Toc243416152"/>
+      <w:bookmarkStart w:id="36" w:name="_Toc243418780"/>
       <w:r>
         <w:rPr>
           <w:b/>
@@ -16424,7 +17744,7 @@
       </w:pPr>
       <w:r>
         <w:drawing>
-          <wp:inline distT="0" distB="0" distL="0" distR="0" wp14:anchorId="7EBD3098" wp14:editId="3AFE42E3">
+          <wp:inline distT="0" distB="0" distL="0" distR="0" wp14:anchorId="0AF62CF5" wp14:editId="21275DCA">
             <wp:extent cx="4860000" cy="2733750"/>
             <wp:effectExtent l="0" t="0" r="0" b="0"/>
             <wp:docPr id="7" name="Picture 7"/>
@@ -16468,7 +17788,7 @@
           <w:numId w:val="0"/>
         </w:numPr>
       </w:pPr>
-      <w:bookmarkStart w:id="37" w:name="_Toc243416142"/>
+      <w:bookmarkStart w:id="37" w:name="_Toc243418770"/>
       <w:r>
         <w:rPr>
           <w:b/>
@@ -16531,14 +17851,20 @@
         <w:pStyle w:val="BDpagrindinistekstas"/>
       </w:pPr>
       <w:r>
-        <w:t>The advantage of pre-training is largest when labelled data are scarce. With only 500 labelled sentences BERT-small reaches 75.9%, while the TF-IDF model reaches only 61.8%, a difference of 14.1 p.p.; the TF-IDF model simply has not seen most of the words of the test sentences, whereas the pre-trained model already knows them. The difference decreases as the data grow (6.9 p.p. at 4,000 and 6.2 p.p. at 8,000 sentences). BERT-small trained on 4,000 sentences (82.7%) already matches the best classical model trained on all 65,349 sentences (82.9%), i.e. it achieves the same quality with about 16 times less labelled data, and DistilBERT trained on 8,000 sentences exceeds it by 5.9 p.p. This result is directly relevant for less-resourced languages such as Lithuanian, where large labelled datasets rarely exist.</w:t>
+        <w:t xml:space="preserve">The advantage of pre-training is largest when </w:t>
+      </w:r>
+      <w:r>
+        <w:t>labelled data are scarce. With only 500 labelled sentences BERT-small reaches 75.9%, while the TF-IDF model reaches only 61.8%, a difference of 14.1 p.p.; the TF-IDF model simply has not seen most of the words of the test sentences, whereas the pre-trained model already knows them. The difference decreases as the data grow (6.9 p.p. at 4,000 and 6.2 p.p. at 8,000 sentences). BERT-small trained on 4,000 sentences (82.7%) already matches the best classical model trained on all 65,349 sentences (82.9%), i.e. i</w:t>
+      </w:r>
+      <w:r>
+        <w:t>t achieves the same quality with about 16 times less labelled data, and DistilBERT trained on 8,000 sentences exceeds it by 5.9 p.p. This result is directly relevant for less-resourced languages such as Lithuanian, where large labelled datasets rarely exist.</w:t>
       </w:r>
     </w:p>
     <w:p>
       <w:pPr>
         <w:pStyle w:val="BDSkyrius2lygio"/>
       </w:pPr>
-      <w:bookmarkStart w:id="38" w:name="_Toc243416177"/>
+      <w:bookmarkStart w:id="38" w:name="_Toc243418805"/>
       <w:r>
         <w:t>Ready-made and zero-shot models</w:t>
       </w:r>
@@ -16549,14 +17875,17 @@
         <w:pStyle w:val="BDpagrindinistekstas"/>
       </w:pPr>
       <w:r>
-        <w:t>The ready-made models answer RQ4. When a public model has been fine-tuned on the same domain and task, it is the best option: DistilBERT-SST2 achieved the highest accuracy without any training on our side. A model trained for the same task in a different domain (Twitter-RoBERTa) lost 5.3 p.p. compared with it, although it still beat all classical models; the informal style of tweets differs from the language of film critics. The zero-shot NLI model, which has never seen a sentiment label, reached 81.8% – the same level as TF-IDF logistic regression trained on 65 thousand labelled sentences. This illustrates the general language understanding acquired during pre-training: the task can be specified by a natural-language hypothesis instead of training data, at the price of the highest inference cost.</w:t>
+        <w:t>The ready-made models answer RQ4. When a public model has been fine-tuned on the same domain and task, it is the best option: DistilBERT-SST2 achieved the highest accuracy without any training on our side. A model trained for the same task in a different domain (Twitter-RoBERTa) lost 5.3 p.p. compared with it, although it still beat all classical models; the informal style of tweets differs from the language of film critics. The zero-shot NLI model, which has never seen a sentiment label, reached 81.8% – th</w:t>
+      </w:r>
+      <w:r>
+        <w:t>e same level as TF-IDF logistic regression trained on 65 thousand labelled sentences. This illustrates the general language understanding acquired during pre-training: the task can be specified by a natural-language hypothesis instead of training data, at the price of the highest inference cost.</w:t>
       </w:r>
     </w:p>
     <w:p>
       <w:pPr>
         <w:pStyle w:val="BDSkyrius2lygio"/>
       </w:pPr>
-      <w:bookmarkStart w:id="39" w:name="_Toc243416178"/>
+      <w:bookmarkStart w:id="39" w:name="_Toc243418806"/>
       <w:r>
         <w:t>Error analysis: negation and contrast</w:t>
       </w:r>
@@ -16579,7 +17908,7 @@
         </w:numPr>
         <w:spacing w:before="120"/>
       </w:pPr>
-      <w:bookmarkStart w:id="40" w:name="_Toc243416153"/>
+      <w:bookmarkStart w:id="40" w:name="_Toc243418781"/>
       <w:r>
         <w:rPr>
           <w:b/>
@@ -17564,7 +18893,7 @@
       </w:pPr>
       <w:r>
         <w:drawing>
-          <wp:inline distT="0" distB="0" distL="0" distR="0" wp14:anchorId="4758C81F" wp14:editId="340215F1">
+          <wp:inline distT="0" distB="0" distL="0" distR="0" wp14:anchorId="7E45DD5B" wp14:editId="5949D721">
             <wp:extent cx="4680000" cy="3380000"/>
             <wp:effectExtent l="0" t="0" r="0" b="0"/>
             <wp:docPr id="8" name="Picture 8"/>
@@ -17608,7 +18937,7 @@
           <w:numId w:val="0"/>
         </w:numPr>
       </w:pPr>
-      <w:bookmarkStart w:id="41" w:name="_Toc243416143"/>
+      <w:bookmarkStart w:id="41" w:name="_Toc243418771"/>
       <w:r>
         <w:rPr>
           <w:b/>
@@ -17671,7 +19000,13 @@
         <w:pStyle w:val="BDpagrindinistekstas"/>
       </w:pPr>
       <w:r>
-        <w:t>The bag-of-words models lose 8–9 p.p. on sentences with negation, because a sentence such as “not good” contains the positive word “good”. The large Transformers are much more robust: DistilBERT-SST2 loses 4.1 p.p., our fine-tuned DistilBERT 3.4 p.p. and Twitter-RoBERTa 2.1 p.p. The zero-shot NLI model is the most robust of all (−0.2 p.p.), which is plausible because NLI training specifically teaches a model to handle negation and contradiction. The compact Transformers, however, behave like the classical models: BERT-small loses 9.3 p.p. on negation, and BERT-tiny 7.0 p.p. Interestingly, the BiLSTM, which reads the sentence in order, handles negation better (−4.0 p.p.) than TF-IDF. The advantage of Transformers on difficult sentences is therefore not a property of the architecture alone but of the combination of architecture, model capacity and pre-training.</w:t>
+        <w:t xml:space="preserve">The bag-of-words models lose </w:t>
+      </w:r>
+      <w:r>
+        <w:t>8–9 p.p. on sentences with negation, because a sentence such as “not good” contains the positive word “good”. The large Transformers are much more robust: DistilBERT-SST2 loses 4.1 p.p., our fine-tuned DistilBERT 3.4 p.p. and Twitter-RoBERTa 2.1 p.p. The zero-shot NLI model is the most robust of all (−0.2 p.p.), which is plausible because NLI training specifically teaches a model to handle negation and contradiction. The compact Transformers, however, behave like the classical models: BERT-small loses 9.3 p</w:t>
+      </w:r>
+      <w:r>
+        <w:t>.p. on negation, and BERT-tiny 7.0 p.p. Interestingly, the BiLSTM, which reads the sentence in order, handles negation better (−4.0 p.p.) than TF-IDF. The advantage of Transformers on difficult sentences is therefore not a property of the architecture alone but of the combination of architecture, model capacity and pre-training.</w:t>
       </w:r>
     </w:p>
     <w:p>
@@ -17679,7 +19014,10 @@
         <w:pStyle w:val="BDpagrindinistekstas"/>
       </w:pPr>
       <w:r>
-        <w:t xml:space="preserve">Fig. 7 shows the self-attention weights of DistilBERT-SST2 for the sentence “the plot was not good, but the acting was brilliant”. The model classifies the sentence as positive with a probability of 1.000, i.e. it gives the clause after “but” the decisive weight, which agrees with how people read such sentences. In the last layer much of the attention of all words goes to the comma that separates the two clauses and to the [SEP] token; such “attention sinks” on punctuation and separator tokens were also observed in BERT by Clark et al. (2019). The words of the second clause (“acting”, “was”, “brilliant”) spread their remaining attention mainly over the other words of the same clause. As noted </w:t>
+        <w:t>Fig. 7 shows the self-attention weights of DistilBERT-SST2 for the sentence “the plot was not good, but the acting was brilliant”. The model classifies the sentence as positive with a probability of 1.000, i.e. it gives the clause after “but” the decisive weight, which agrees with how people read such sentences. In the last layer much of the attention of all words goes to the comma that separates the two clauses and to the [SEP] token; such “attention sinks” on punctuation and separator tokens were also obs</w:t>
+      </w:r>
+      <w:r>
+        <w:t xml:space="preserve">erved in BERT by Clark et al. (2019). The words of the second clause (“acting”, “was”, “brilliant”) spread their remaining attention mainly over the other words of the same clause. As noted </w:t>
       </w:r>
       <w:r>
         <w:lastRenderedPageBreak/>
@@ -17693,7 +19031,7 @@
       </w:pPr>
       <w:r>
         <w:drawing>
-          <wp:inline distT="0" distB="0" distL="0" distR="0" wp14:anchorId="4F109FBB" wp14:editId="4BCCB953">
+          <wp:inline distT="0" distB="0" distL="0" distR="0" wp14:anchorId="00CEFC90" wp14:editId="1FBBBF2F">
             <wp:extent cx="3600000" cy="3085714"/>
             <wp:effectExtent l="0" t="0" r="0" b="0"/>
             <wp:docPr id="9" name="Picture 9"/>
@@ -17737,7 +19075,7 @@
           <w:numId w:val="0"/>
         </w:numPr>
       </w:pPr>
-      <w:bookmarkStart w:id="42" w:name="_Toc243416144"/>
+      <w:bookmarkStart w:id="42" w:name="_Toc243418772"/>
       <w:r>
         <w:rPr>
           <w:b/>
@@ -17800,14 +19138,17 @@
         <w:pStyle w:val="BDpagrindinistekstas"/>
       </w:pPr>
       <w:r>
-        <w:t>Examples from the test set show the typical behaviour. The fine-tuned DistilBERT correctly classified 104 sentences that the SVM misclassified, for example “in its best moments, resembles a bad high school production of grease, without benefit of song” (negative; the SVM is misled by “best”) and “the subtle strength of elling is that it never loses touch with the reality of the grim situation” (positive; “grim” and “never loses” mislead the bag-of-words model). The SVM was right in 53 cases where DistilBERT failed, for example in sentences with mixed sentiment such as “we root for (clara and paul), even like them, though perhaps it’s an emotion closer to pity”.</w:t>
+        <w:t>Examples from the test set show the typical behaviour. The fine-tuned DistilBERT correctly classified 104 sentences that the SVM misclassified, for example “in its best moments, resembles a bad high school production of grease, without benefit of song” (negative; the SVM is misled by “best”) and “the subtle strength of elling is that it never loses touch with the reality of the grim situation” (positive; “grim” and “never loses” mislead the bag-of-words model). The SVM was right in 53 cases where DistilBERT</w:t>
+      </w:r>
+      <w:r>
+        <w:t xml:space="preserve"> failed, for example in sentences with mixed sentiment such as “we root for (clara and paul), even like them, though perhaps it’s an emotion closer to pity”.</w:t>
       </w:r>
     </w:p>
     <w:p>
       <w:pPr>
         <w:pStyle w:val="BDSkyrius2lygio"/>
       </w:pPr>
-      <w:bookmarkStart w:id="43" w:name="_Toc243416179"/>
+      <w:bookmarkStart w:id="43" w:name="_Toc243418807"/>
       <w:r>
         <w:t>Comparison with previous research</w:t>
       </w:r>
@@ -17818,7 +19159,10 @@
         <w:pStyle w:val="BDpagrindinistekstas"/>
       </w:pPr>
       <w:r>
-        <w:t>Our results are consistent with the literature summarised in Table 2. The classical models (81.9–82.9%) match the 79–83% reported for bag-of-words models on SST-2 (Socher et al., 2013), and the off-the-shelf DistilBERT (91.1%) is close to the 91.3% reported by Sanh et al. (2019) on the same validation set, which confirms that our evaluation procedure is correct. Our fine-tuned DistilBERT stays 2.3 p.p. below it because it was trained on 12% of the training data. Compared with the BERT-base result of 93.5% (Devlin et al., 2019), our models are smaller and trained with fewer data, which explains the gap. The new element of this study is the joint view of quality, cost and data efficiency on a CPU-only computer, which shows when the advantage of Transformers is worth its price.</w:t>
+        <w:t>Our results are consistent with the literature summarised in Table 2. The classical models (81.9–82.9%) match the 79–83% reported for bag-of-words models on SST-2 (Socher et al., 2013), and the off-the-shelf DistilBERT (91.1%) is close to the 91.3% reported by Sanh et al. (2019) on the same validation set, which confirms that our evaluation procedure is correct. Our fine-tuned DistilBERT stays 2.3 p.p. below it because it was trained on 12% of the training data. Compared with the BERT-base result of 93.5% (</w:t>
+      </w:r>
+      <w:r>
+        <w:t>Devlin et al., 2019), our models are smaller and trained with fewer data, which explains the gap. The new element of this study is the joint view of quality, cost and data efficiency on a CPU-only computer, which shows when the advantage of Transformers is worth its price.</w:t>
       </w:r>
     </w:p>
     <w:p>
@@ -17826,7 +19170,7 @@
         <w:pStyle w:val="BDSkyriusnenumeruojamas"/>
         <w:pageBreakBefore/>
       </w:pPr>
-      <w:bookmarkStart w:id="44" w:name="_Toc243416180"/>
+      <w:bookmarkStart w:id="44" w:name="_Toc243418808"/>
       <w:r>
         <w:lastRenderedPageBreak/>
         <w:t>Conclusions</w:t>
@@ -17844,7 +19188,10 @@
         <w:ind w:firstLine="0"/>
       </w:pPr>
       <w:r>
-        <w:t>The literature review showed that Transformer models are the state of the art for text classification: fine-tuned encoders exceed 90% accuracy on SST-2, compared with 79–83% for classical models. Lithuanian research confirms that neural networks without pre-training do not necessarily outperform classical methods, while pre-trained models (LitLat BERT, multilingual BERT and T5, Lithuanian Llama2) are now becoming available. The gap identified in the literature was the lack of studies that jointly evaluate quality, cost and data efficiency of Transformers under realistic resource limits.</w:t>
+        <w:t>The literature review showed that Transformer models are the state of the art for text classification: fine-tuned encoders exceed 90% accuracy on SST-2, compared with 79–83% for classical models. Lithuanian research confirms that neural networks without pre-training do not necessarily outperform classical methods, while pre-trained models (LitLat BERT, multilingual BERT and T5, Lithuanian Llama2) are now becoming available. The gap identified in the literature was the lack of studies that jointly evaluate q</w:t>
+      </w:r>
+      <w:r>
+        <w:t>uality, cost and data efficiency of Transformers under realistic resource limits.</w:t>
       </w:r>
     </w:p>
     <w:p>
@@ -17886,7 +19233,10 @@
         <w:ind w:firstLine="0"/>
       </w:pPr>
       <w:r>
-        <w:t>The experiment showed that a sufficiently large pre-trained Transformer is clearly the most accurate approach. DistilBERT fine-tuned on only 8,000 sentences reached 88.8% accuracy, significantly more than the best classical model trained on all 65,349 sentences (TF-IDF + linear SVM, 82.9%, p &lt; 0.001), and the ready-made in-domain DistilBERT reached 91.1%. Compact Transformers only matched the classical models (BERT-small 83.7%), and BERT-tiny was the weakest model (76.6%). The BiLSTM trained from scratch (82.8%) gave no advantage over the classical models.</w:t>
+        <w:t>The experiment showed that a sufficiently large pre-trained Transformer is clearly the most accurate approach. DistilBERT fine-tuned on only 8,000 sentences reached 88.8% accuracy, significantly more than the best classical model trained on all 65,349 sentences (TF-IDF + linear SVM, 82.9%, p &lt; 0.001), and the ready-made in-domain DistilBERT reached 91.1%. Compact Transformers only matched the classical models (BERT-small 83.7%), and BERT-tiny was the weakest model (76.6%). The BiLSTM trained from scratch (8</w:t>
+      </w:r>
+      <w:r>
+        <w:t>2.8%) gave no advantage over the classical models.</w:t>
       </w:r>
     </w:p>
     <w:p>
@@ -17900,7 +19250,13 @@
         <w:ind w:firstLine="0"/>
       </w:pPr>
       <w:r>
-        <w:t>The improvement has a clear cost: Transformers are 20–2,000 times slower at inference (1.2–107 ms vs 0.05 ms per sentence on a CPU) and 60–1,700 times larger than TF-IDF models, and fine-tuning on a CPU takes from minutes to hours. In return, pre-training makes them far more data-efficient – with 500 labelled sentences BERT-small was 14.1 percentage points more accurate than TF-IDF, and with 4,000 sentences it matched the classical model trained on 16 times more data – and the larger Transformers were much more robust on sentences with negation and contrast (accuracy drop of 2–4 p.p. versus 8–9 p.p. for bag-of-words models).</w:t>
+        <w:t xml:space="preserve">The improvement has a clear cost: Transformers are 20–2,000 times slower at inference </w:t>
+      </w:r>
+      <w:r>
+        <w:t xml:space="preserve">(1.2–107 ms vs 0.05 ms per sentence on a CPU) and 60–1,700 times larger than TF-IDF models, and fine-tuning on a CPU takes from minutes to hours. In return, pre-training makes them far more data-efficient – with 500 labelled sentences BERT-small was 14.1 percentage points more accurate than TF-IDF, and with 4,000 sentences it matched the classical model trained on 16 times more data – and the larger Transformers were much more robust on sentences with negation and contrast (accuracy drop of 2–4 p.p. versus </w:t>
+      </w:r>
+      <w:r>
+        <w:t>8–9 p.p. for bag-of-words models).</w:t>
       </w:r>
     </w:p>
     <w:p>
@@ -17914,7 +19270,10 @@
         <w:t>Practical recommendations.</w:t>
       </w:r>
       <w:r>
-        <w:t xml:space="preserve"> (1) First check whether a public model already fine-tuned for the same task and domain exists – it gives the best quality without any training. (2) If not, fine-tune a distilled Transformer such as DistilBERT on a few thousand labelled examples; this is feasible even without a GPU. (3) When no labelled data exist at all, a zero-shot NLI model gives a usable baseline comparable to classical models. (4) TF-IDF models remain the right choice only when inference must be extremely cheap or the hardware is very limited. For Lithuanian texts, the same procedure can be applied with LitLat BERT or XLM-RoBERTa, which is the most natural continuation of this work, together with repeated runs with several random seeds and GPU-based timing.</w:t>
+        <w:t xml:space="preserve"> (1) First check whether a public model already fine-tuned for the same task and domain exists – it gives the best quality without any training. (2) If not, fine-tune a distilled Transformer such as DistilBERT on a few thousand labelled examples; this is feasible even without a GPU. (3) When no labelled data exist at all, a zero-shot NLI model gives a usable baseline comparable to classical models. (4) TF-IDF models remain the right choice only when inference must be extremely cheap or the hardware is very </w:t>
+      </w:r>
+      <w:r>
+        <w:t>limited. For Lithuanian texts, the same procedure can be applied with LitLat BERT or XLM-RoBERTa, which is the most natural continuation of this work, together with repeated runs with several random seeds and GPU-based timing.</w:t>
       </w:r>
     </w:p>
     <w:p>
@@ -17922,7 +19281,7 @@
         <w:pStyle w:val="BDSkyriusnenumeruojamas"/>
         <w:pageBreakBefore/>
       </w:pPr>
-      <w:bookmarkStart w:id="45" w:name="_Toc243416181"/>
+      <w:bookmarkStart w:id="45" w:name="_Toc243418809"/>
       <w:r>
         <w:lastRenderedPageBreak/>
         <w:t>References</w:t>
@@ -18318,7 +19677,13 @@
           <w:sz w:val="22"/>
         </w:rPr>
         <w:lastRenderedPageBreak/>
-        <w:t>Raffel, C., Shazeer, N., Roberts, A., Lee, K., Narang, S., Matena, M., Zhou, Y., Li, W., &amp; Liu, P. J. (2020). Exploring the limits of transfer learning with a unified text-to-text transformer. Journal of Machine Learning Research, 21(140), 1–67.</w:t>
+        <w:t xml:space="preserve">Raffel, C., Shazeer, N., Roberts, A., Lee, K., Narang, S., Matena, M., Zhou, Y., Li, W., &amp; Liu, P. J. (2020). Exploring the limits of transfer learning with a unified </w:t>
+      </w:r>
+      <w:r>
+        <w:rPr>
+          <w:sz w:val="22"/>
+        </w:rPr>
+        <w:t>text-to-text transformer. Journal of Machine Learning Research, 21(140), 1–67.</w:t>
       </w:r>
     </w:p>
     <w:p>
@@ -18335,7 +19700,13 @@
         <w:rPr>
           <w:sz w:val="22"/>
         </w:rPr>
-        <w:t>Rogers, A., Kovaleva, O., &amp; Rumshisky, A. (2020). A primer in BERTology: What we know about how BERT works. Transactions of the Association for Computational Linguistics, 8, 842–866.</w:t>
+        <w:t xml:space="preserve">Rogers, A., Kovaleva, O., &amp; Rumshisky, A. (2020). A primer in BERTology: What we know about how BERT works. Transactions of the Association for Computational </w:t>
+      </w:r>
+      <w:r>
+        <w:rPr>
+          <w:sz w:val="22"/>
+        </w:rPr>
+        <w:t>Linguistics, 8, 842–866.</w:t>
       </w:r>
     </w:p>
     <w:p>
@@ -18581,7 +19952,7 @@
         <w:pStyle w:val="BDSkyriusnenumeruojamas"/>
         <w:pageBreakBefore/>
       </w:pPr>
-      <w:bookmarkStart w:id="46" w:name="_Toc243416182"/>
+      <w:bookmarkStart w:id="46" w:name="_Toc243418810"/>
       <w:r>
         <w:lastRenderedPageBreak/>
         <w:t>Appendices</w:t>
@@ -18596,7 +19967,7 @@
           <w:numId w:val="0"/>
         </w:numPr>
       </w:pPr>
-      <w:bookmarkStart w:id="47" w:name="_Toc243416183"/>
+      <w:bookmarkStart w:id="47" w:name="_Toc243418811"/>
       <w:r>
         <w:t>Appendix A. Source code and reproduction of the results</w:t>
       </w:r>
@@ -18787,6 +20158,7 @@
         <w:docPartUnique/>
       </w:docPartObj>
     </w:sdtPr>
+    <w:sdtEndPr/>
     <w:sdtContent>
       <w:p>
         <w:pPr>
@@ -19167,20 +20539,6 @@
     </w:lvl>
   </w:abstractNum>
   <w:abstractNum w:abstractNumId="3" w15:restartNumberingAfterBreak="0">
-    <w:nsid w:val="2394241B"/>
-    <w:multiLevelType w:val="singleLevel"/>
-    <w:tmpl w:val="A4C48DA4"/>
-    <w:lvl w:ilvl="0">
-      <w:start w:val="1"/>
-      <w:numFmt w:val="bullet"/>
-      <w:lvlText w:val="–"/>
-      <w:lvlJc w:val="left"/>
-      <w:pPr>
-        <w:ind w:left="1077" w:hanging="357"/>
-      </w:pPr>
-    </w:lvl>
-  </w:abstractNum>
-  <w:abstractNum w:abstractNumId="4" w15:restartNumberingAfterBreak="0">
     <w:nsid w:val="539072EE"/>
     <w:multiLevelType w:val="hybridMultilevel"/>
     <w:tmpl w:val="BACEF14C"/>
@@ -19266,14 +20624,28 @@
       </w:pPr>
     </w:lvl>
   </w:abstractNum>
-  <w:abstractNum w:abstractNumId="5" w15:restartNumberingAfterBreak="0">
-    <w:nsid w:val="6A0F0E3E"/>
+  <w:abstractNum w:abstractNumId="4" w15:restartNumberingAfterBreak="0">
+    <w:nsid w:val="626205B8"/>
     <w:multiLevelType w:val="singleLevel"/>
-    <w:tmpl w:val="1A94FB90"/>
+    <w:tmpl w:val="028ACAC6"/>
     <w:lvl w:ilvl="0">
       <w:start w:val="1"/>
       <w:numFmt w:val="decimal"/>
       <w:lvlText w:val="%1."/>
+      <w:lvlJc w:val="left"/>
+      <w:pPr>
+        <w:ind w:left="1077" w:hanging="357"/>
+      </w:pPr>
+    </w:lvl>
+  </w:abstractNum>
+  <w:abstractNum w:abstractNumId="5" w15:restartNumberingAfterBreak="0">
+    <w:nsid w:val="6C0A0BC2"/>
+    <w:multiLevelType w:val="singleLevel"/>
+    <w:tmpl w:val="9B663954"/>
+    <w:lvl w:ilvl="0">
+      <w:start w:val="1"/>
+      <w:numFmt w:val="bullet"/>
+      <w:lvlText w:val="–"/>
       <w:lvlJc w:val="left"/>
       <w:pPr>
         <w:ind w:left="1077" w:hanging="357"/>
@@ -19468,7 +20840,7 @@
     <w:abstractNumId w:val="6"/>
   </w:num>
   <w:num w:numId="5" w16cid:durableId="593168037">
-    <w:abstractNumId w:val="4"/>
+    <w:abstractNumId w:val="3"/>
   </w:num>
   <w:num w:numId="6" w16cid:durableId="436873634">
     <w:abstractNumId w:val="0"/>
@@ -19479,32 +20851,32 @@
   <w:num w:numId="8" w16cid:durableId="198444348">
     <w:abstractNumId w:val="1"/>
   </w:num>
-  <w:num w:numId="9" w16cid:durableId="1559319229">
-    <w:abstractNumId w:val="5"/>
+  <w:num w:numId="9" w16cid:durableId="161552570">
+    <w:abstractNumId w:val="4"/>
     <w:lvlOverride w:ilvl="0">
       <w:startOverride w:val="1"/>
     </w:lvlOverride>
   </w:num>
-  <w:num w:numId="10" w16cid:durableId="682320246">
-    <w:abstractNumId w:val="3"/>
+  <w:num w:numId="10" w16cid:durableId="165482184">
+    <w:abstractNumId w:val="5"/>
   </w:num>
-  <w:num w:numId="11" w16cid:durableId="1184170657">
-    <w:abstractNumId w:val="3"/>
+  <w:num w:numId="11" w16cid:durableId="2020111293">
+    <w:abstractNumId w:val="5"/>
   </w:num>
-  <w:num w:numId="12" w16cid:durableId="1616255610">
-    <w:abstractNumId w:val="3"/>
+  <w:num w:numId="12" w16cid:durableId="1309476175">
+    <w:abstractNumId w:val="5"/>
   </w:num>
-  <w:num w:numId="13" w16cid:durableId="1257666026">
-    <w:abstractNumId w:val="3"/>
+  <w:num w:numId="13" w16cid:durableId="1324090451">
+    <w:abstractNumId w:val="5"/>
   </w:num>
-  <w:num w:numId="14" w16cid:durableId="1625040449">
-    <w:abstractNumId w:val="5"/>
+  <w:num w:numId="14" w16cid:durableId="2096172995">
+    <w:abstractNumId w:val="4"/>
     <w:lvlOverride w:ilvl="0">
       <w:startOverride w:val="1"/>
     </w:lvlOverride>
   </w:num>
-  <w:num w:numId="15" w16cid:durableId="1669360617">
-    <w:abstractNumId w:val="3"/>
+  <w:num w:numId="15" w16cid:durableId="1034620613">
+    <w:abstractNumId w:val="5"/>
   </w:num>
 </w:numbering>
 </file>

</xml_diff>